<commit_message>
Rubric off the continuum's own substrands, single-year levels
Seven rows, each a substrand of the Learning Continuum master sheet,
English tab, with its wording unaltered at Levels 5 to 9. Marking a row
gives a whole level and the grade is their average, which is where the
halves come from. Text structure and organisation is the row the wall
cannot supply — it is a ladder of sentences, and this task is a
paragraph.

The wall's bottom two rungs become Level 3 and Level 4 rather than the
Victorian Curriculum's two-year bands, so a rung on the wall is the same
number as a rung on the continuum.

Co-Authored-By: Claude Opus 5 <noreply@anthropic.com>
Claude-Session: https://claude.ai/code/session_01TX2KYiJGekMNoBBPASQh6e
</commit_message>
<xml_diff>
--- a/BoneSparrow-assessment-folio.docx
+++ b/BoneSparrow-assessment-folio.docx
@@ -1169,12 +1169,12 @@
         </w:tblBorders>
       </w:tblPr>
       <w:tblGrid>
-        <w:gridCol w:w="3400"/>
-        <w:gridCol w:w="2399"/>
-        <w:gridCol w:w="2399"/>
-        <w:gridCol w:w="2399"/>
-        <w:gridCol w:w="2399"/>
-        <w:gridCol w:w="2399"/>
+        <w:gridCol w:w="3000"/>
+        <w:gridCol w:w="2479"/>
+        <w:gridCol w:w="2479"/>
+        <w:gridCol w:w="2479"/>
+        <w:gridCol w:w="2479"/>
+        <w:gridCol w:w="2479"/>
       </w:tblGrid>
       <w:tr>
         <w:trPr>
@@ -1182,7 +1182,7 @@
         </w:trPr>
         <w:tc>
           <w:tcPr>
-            <w:tcW w:type="dxa" w:w="3400"/>
+            <w:tcW w:type="dxa" w:w="3000"/>
             <w:shd w:fill="D9D9D9" w:color="auto" w:val="clear"/>
             <w:tcMar>
               <w:top w:type="dxa" w:w="60"/>
@@ -1209,7 +1209,7 @@
         </w:tc>
         <w:tc>
           <w:tcPr>
-            <w:tcW w:type="dxa" w:w="2399"/>
+            <w:tcW w:type="dxa" w:w="2479"/>
             <w:shd w:fill="D9D9D9" w:color="auto" w:val="clear"/>
             <w:tcMar>
               <w:top w:type="dxa" w:w="60"/>
@@ -1230,9 +1230,35 @@
                 <w:sz w:val="18"/>
                 <w:szCs w:val="18"/>
               </w:rPr>
+              <w:t xml:space="preserve">Level 5</w:t>
+            </w:r>
+          </w:p>
+          <w:p>
+            <w:pPr>
+              <w:spacing w:after="0"/>
+            </w:pPr>
+            <w:r>
+              <w:rPr>
+                <w:rFonts w:ascii="Arial" w:cs="Arial" w:eastAsia="Arial" w:hAnsi="Arial"/>
+                <w:color w:val="595959"/>
+                <w:sz w:val="15"/>
+                <w:szCs w:val="15"/>
+              </w:rPr>
               <w:t xml:space="preserve">Emerging</w:t>
             </w:r>
           </w:p>
+        </w:tc>
+        <w:tc>
+          <w:tcPr>
+            <w:tcW w:type="dxa" w:w="2479"/>
+            <w:shd w:fill="D9D9D9" w:color="auto" w:val="clear"/>
+            <w:tcMar>
+              <w:top w:type="dxa" w:w="60"/>
+              <w:left w:type="dxa" w:w="90"/>
+              <w:bottom w:type="dxa" w:w="60"/>
+              <w:right w:type="dxa" w:w="90"/>
+            </w:tcMar>
+          </w:tcPr>
           <w:p>
             <w:pPr>
               <w:spacing w:after="0"/>
@@ -1245,14 +1271,28 @@
                 <w:sz w:val="18"/>
                 <w:szCs w:val="18"/>
               </w:rPr>
-              <w:t xml:space="preserve">(6.0)</w:t>
-            </w:r>
-          </w:p>
-        </w:tc>
-        <w:tc>
-          <w:tcPr>
-            <w:tcW w:type="dxa" w:w="2399"/>
-            <w:shd w:fill="D9D9D9" w:color="auto" w:val="clear"/>
+              <w:t xml:space="preserve">Level 6</w:t>
+            </w:r>
+          </w:p>
+          <w:p>
+            <w:pPr>
+              <w:spacing w:after="0"/>
+            </w:pPr>
+            <w:r>
+              <w:rPr>
+                <w:rFonts w:ascii="Arial" w:cs="Arial" w:eastAsia="Arial" w:hAnsi="Arial"/>
+                <w:color w:val="595959"/>
+                <w:sz w:val="15"/>
+                <w:szCs w:val="15"/>
+              </w:rPr>
+              <w:t xml:space="preserve">Working towards</w:t>
+            </w:r>
+          </w:p>
+        </w:tc>
+        <w:tc>
+          <w:tcPr>
+            <w:tcW w:type="dxa" w:w="2479"/>
+            <w:shd w:fill="E7E6E6" w:color="auto" w:val="clear"/>
             <w:tcMar>
               <w:top w:type="dxa" w:w="60"/>
               <w:left w:type="dxa" w:w="90"/>
@@ -1272,9 +1312,35 @@
                 <w:sz w:val="18"/>
                 <w:szCs w:val="18"/>
               </w:rPr>
-              <w:t xml:space="preserve">Working Towards the Standard</w:t>
-            </w:r>
-          </w:p>
+              <w:t xml:space="preserve">Level 7 · expected at Year 7</w:t>
+            </w:r>
+          </w:p>
+          <w:p>
+            <w:pPr>
+              <w:spacing w:after="0"/>
+            </w:pPr>
+            <w:r>
+              <w:rPr>
+                <w:rFonts w:ascii="Arial" w:cs="Arial" w:eastAsia="Arial" w:hAnsi="Arial"/>
+                <w:color w:val="595959"/>
+                <w:sz w:val="15"/>
+                <w:szCs w:val="15"/>
+              </w:rPr>
+              <w:t xml:space="preserve">At the standard</w:t>
+            </w:r>
+          </w:p>
+        </w:tc>
+        <w:tc>
+          <w:tcPr>
+            <w:tcW w:type="dxa" w:w="2479"/>
+            <w:shd w:fill="D9D9D9" w:color="auto" w:val="clear"/>
+            <w:tcMar>
+              <w:top w:type="dxa" w:w="60"/>
+              <w:left w:type="dxa" w:w="90"/>
+              <w:bottom w:type="dxa" w:w="60"/>
+              <w:right w:type="dxa" w:w="90"/>
+            </w:tcMar>
+          </w:tcPr>
           <w:p>
             <w:pPr>
               <w:spacing w:after="0"/>
@@ -1287,14 +1353,28 @@
                 <w:sz w:val="18"/>
                 <w:szCs w:val="18"/>
               </w:rPr>
-              <w:t xml:space="preserve">(6.5)</w:t>
-            </w:r>
-          </w:p>
-        </w:tc>
-        <w:tc>
-          <w:tcPr>
-            <w:tcW w:type="dxa" w:w="2399"/>
-            <w:shd w:fill="E7E6E6" w:color="auto" w:val="clear"/>
+              <w:t xml:space="preserve">Level 8</w:t>
+            </w:r>
+          </w:p>
+          <w:p>
+            <w:pPr>
+              <w:spacing w:after="0"/>
+            </w:pPr>
+            <w:r>
+              <w:rPr>
+                <w:rFonts w:ascii="Arial" w:cs="Arial" w:eastAsia="Arial" w:hAnsi="Arial"/>
+                <w:color w:val="595959"/>
+                <w:sz w:val="15"/>
+                <w:szCs w:val="15"/>
+              </w:rPr>
+              <w:t xml:space="preserve">Above</w:t>
+            </w:r>
+          </w:p>
+        </w:tc>
+        <w:tc>
+          <w:tcPr>
+            <w:tcW w:type="dxa" w:w="2479"/>
+            <w:shd w:fill="D9D9D9" w:color="auto" w:val="clear"/>
             <w:tcMar>
               <w:top w:type="dxa" w:w="60"/>
               <w:left w:type="dxa" w:w="90"/>
@@ -1314,106 +1394,21 @@
                 <w:sz w:val="18"/>
                 <w:szCs w:val="18"/>
               </w:rPr>
-              <w:t xml:space="preserve">At the Standard</w:t>
-            </w:r>
-          </w:p>
-          <w:p>
-            <w:pPr>
-              <w:spacing w:after="0"/>
-            </w:pPr>
-            <w:r>
-              <w:rPr>
-                <w:rFonts w:ascii="Arial" w:cs="Arial" w:eastAsia="Arial" w:hAnsi="Arial"/>
-                <w:b/>
-                <w:bCs/>
-                <w:sz w:val="18"/>
-                <w:szCs w:val="18"/>
-              </w:rPr>
-              <w:t xml:space="preserve">(7.0)</w:t>
-            </w:r>
-          </w:p>
-        </w:tc>
-        <w:tc>
-          <w:tcPr>
-            <w:tcW w:type="dxa" w:w="2399"/>
-            <w:shd w:fill="D9D9D9" w:color="auto" w:val="clear"/>
-            <w:tcMar>
-              <w:top w:type="dxa" w:w="60"/>
-              <w:left w:type="dxa" w:w="90"/>
-              <w:bottom w:type="dxa" w:w="60"/>
-              <w:right w:type="dxa" w:w="90"/>
-            </w:tcMar>
-          </w:tcPr>
-          <w:p>
-            <w:pPr>
-              <w:spacing w:after="0"/>
-            </w:pPr>
-            <w:r>
-              <w:rPr>
-                <w:rFonts w:ascii="Arial" w:cs="Arial" w:eastAsia="Arial" w:hAnsi="Arial"/>
-                <w:b/>
-                <w:bCs/>
-                <w:sz w:val="18"/>
-                <w:szCs w:val="18"/>
-              </w:rPr>
-              <w:t xml:space="preserve">Above the Standard</w:t>
-            </w:r>
-          </w:p>
-          <w:p>
-            <w:pPr>
-              <w:spacing w:after="0"/>
-            </w:pPr>
-            <w:r>
-              <w:rPr>
-                <w:rFonts w:ascii="Arial" w:cs="Arial" w:eastAsia="Arial" w:hAnsi="Arial"/>
-                <w:b/>
-                <w:bCs/>
-                <w:sz w:val="18"/>
-                <w:szCs w:val="18"/>
-              </w:rPr>
-              <w:t xml:space="preserve">(7.5)</w:t>
-            </w:r>
-          </w:p>
-        </w:tc>
-        <w:tc>
-          <w:tcPr>
-            <w:tcW w:type="dxa" w:w="2399"/>
-            <w:shd w:fill="D9D9D9" w:color="auto" w:val="clear"/>
-            <w:tcMar>
-              <w:top w:type="dxa" w:w="60"/>
-              <w:left w:type="dxa" w:w="90"/>
-              <w:bottom w:type="dxa" w:w="60"/>
-              <w:right w:type="dxa" w:w="90"/>
-            </w:tcMar>
-          </w:tcPr>
-          <w:p>
-            <w:pPr>
-              <w:spacing w:after="0"/>
-            </w:pPr>
-            <w:r>
-              <w:rPr>
-                <w:rFonts w:ascii="Arial" w:cs="Arial" w:eastAsia="Arial" w:hAnsi="Arial"/>
-                <w:b/>
-                <w:bCs/>
-                <w:sz w:val="18"/>
-                <w:szCs w:val="18"/>
-              </w:rPr>
-              <w:t xml:space="preserve">Well Above the Standard</w:t>
-            </w:r>
-          </w:p>
-          <w:p>
-            <w:pPr>
-              <w:spacing w:after="0"/>
-            </w:pPr>
-            <w:r>
-              <w:rPr>
-                <w:rFonts w:ascii="Arial" w:cs="Arial" w:eastAsia="Arial" w:hAnsi="Arial"/>
-                <w:b/>
-                <w:bCs/>
-                <w:sz w:val="18"/>
-                <w:szCs w:val="18"/>
-              </w:rPr>
-              <w:t xml:space="preserve">(8.0)</w:t>
+              <w:t xml:space="preserve">Level 9</w:t>
+            </w:r>
+          </w:p>
+          <w:p>
+            <w:pPr>
+              <w:spacing w:after="0"/>
+            </w:pPr>
+            <w:r>
+              <w:rPr>
+                <w:rFonts w:ascii="Arial" w:cs="Arial" w:eastAsia="Arial" w:hAnsi="Arial"/>
+                <w:color w:val="595959"/>
+                <w:sz w:val="15"/>
+                <w:szCs w:val="15"/>
+              </w:rPr>
+              <w:t xml:space="preserve">Well above</w:t>
             </w:r>
           </w:p>
         </w:tc>
@@ -1421,7 +1416,7 @@
       <w:tr>
         <w:tc>
           <w:tcPr>
-            <w:tcW w:type="dxa" w:w="3400"/>
+            <w:tcW w:type="dxa" w:w="3000"/>
             <w:tcMar>
               <w:top w:type="dxa" w:w="60"/>
               <w:left w:type="dxa" w:w="90"/>
@@ -1441,61 +1436,89 @@
                 <w:sz w:val="17"/>
                 <w:szCs w:val="17"/>
               </w:rPr>
-              <w:t xml:space="preserve">Content – the idea about the novel, explored beyond the events of the story.</w:t>
-            </w:r>
-          </w:p>
-        </w:tc>
-        <w:tc>
-          <w:tcPr>
-            <w:tcW w:type="dxa" w:w="2399"/>
-            <w:tcMar>
-              <w:top w:type="dxa" w:w="60"/>
-              <w:left w:type="dxa" w:w="90"/>
-              <w:bottom w:type="dxa" w:w="60"/>
-              <w:right w:type="dxa" w:w="90"/>
-            </w:tcMar>
-          </w:tcPr>
-          <w:p>
-            <w:pPr>
-              <w:spacing w:after="0"/>
-            </w:pPr>
-            <w:r>
-              <w:rPr>
-                <w:rFonts w:ascii="Arial" w:cs="Arial" w:eastAsia="Arial" w:hAnsi="Arial"/>
-                <w:sz w:val="17"/>
-                <w:szCs w:val="17"/>
-              </w:rPr>
-              <w:t xml:space="preserve">Retold what happens in the novel, with little sense of an idea behind it.</w:t>
-            </w:r>
-          </w:p>
-        </w:tc>
-        <w:tc>
-          <w:tcPr>
-            <w:tcW w:type="dxa" w:w="2399"/>
-            <w:tcMar>
-              <w:top w:type="dxa" w:w="60"/>
-              <w:left w:type="dxa" w:w="90"/>
-              <w:bottom w:type="dxa" w:w="60"/>
-              <w:right w:type="dxa" w:w="90"/>
-            </w:tcMar>
-          </w:tcPr>
-          <w:p>
-            <w:pPr>
-              <w:spacing w:after="0"/>
-            </w:pPr>
-            <w:r>
-              <w:rPr>
-                <w:rFonts w:ascii="Arial" w:cs="Arial" w:eastAsia="Arial" w:hAnsi="Arial"/>
-                <w:sz w:val="17"/>
-                <w:szCs w:val="17"/>
-              </w:rPr>
-              <w:t xml:space="preserve">Named an idea from the novel, but drifted into retelling the story.</w:t>
-            </w:r>
-          </w:p>
-        </w:tc>
-        <w:tc>
-          <w:tcPr>
-            <w:tcW w:type="dxa" w:w="2399"/>
+              <w:t xml:space="preserve">Interpreting texts</w:t>
+            </w:r>
+          </w:p>
+          <w:p>
+            <w:pPr>
+              <w:spacing w:after="0"/>
+            </w:pPr>
+            <w:r>
+              <w:rPr>
+                <w:rFonts w:ascii="Arial" w:cs="Arial" w:eastAsia="Arial" w:hAnsi="Arial"/>
+                <w:color w:val="595959"/>
+                <w:sz w:val="15"/>
+                <w:szCs w:val="15"/>
+              </w:rPr>
+              <w:t xml:space="preserve">the idea about the novel</w:t>
+            </w:r>
+          </w:p>
+          <w:p>
+            <w:pPr>
+              <w:spacing w:after="0"/>
+            </w:pPr>
+            <w:r>
+              <w:rPr>
+                <w:rFonts w:ascii="Arial" w:cs="Arial" w:eastAsia="Arial" w:hAnsi="Arial"/>
+                <w:color w:val="808080"/>
+                <w:sz w:val="14"/>
+                <w:szCs w:val="14"/>
+              </w:rPr>
+              <w:t xml:space="preserve">Reading and Viewing</w:t>
+            </w:r>
+          </w:p>
+        </w:tc>
+        <w:tc>
+          <w:tcPr>
+            <w:tcW w:type="dxa" w:w="2479"/>
+            <w:tcMar>
+              <w:top w:type="dxa" w:w="60"/>
+              <w:left w:type="dxa" w:w="90"/>
+              <w:bottom w:type="dxa" w:w="60"/>
+              <w:right w:type="dxa" w:w="90"/>
+            </w:tcMar>
+          </w:tcPr>
+          <w:p>
+            <w:pPr>
+              <w:spacing w:after="0"/>
+            </w:pPr>
+            <w:r>
+              <w:rPr>
+                <w:rFonts w:ascii="Arial" w:cs="Arial" w:eastAsia="Arial" w:hAnsi="Arial"/>
+                <w:sz w:val="16"/>
+                <w:szCs w:val="16"/>
+              </w:rPr>
+              <w:t xml:space="preserve">I can describe the purpose of different text types</w:t>
+            </w:r>
+          </w:p>
+        </w:tc>
+        <w:tc>
+          <w:tcPr>
+            <w:tcW w:type="dxa" w:w="2479"/>
+            <w:tcMar>
+              <w:top w:type="dxa" w:w="60"/>
+              <w:left w:type="dxa" w:w="90"/>
+              <w:bottom w:type="dxa" w:w="60"/>
+              <w:right w:type="dxa" w:w="90"/>
+            </w:tcMar>
+          </w:tcPr>
+          <w:p>
+            <w:pPr>
+              <w:spacing w:after="0"/>
+            </w:pPr>
+            <w:r>
+              <w:rPr>
+                <w:rFonts w:ascii="Arial" w:cs="Arial" w:eastAsia="Arial" w:hAnsi="Arial"/>
+                <w:sz w:val="16"/>
+                <w:szCs w:val="16"/>
+              </w:rPr>
+              <w:t xml:space="preserve">I can describe the way authors try to influence their audience</w:t>
+            </w:r>
+          </w:p>
+        </w:tc>
+        <w:tc>
+          <w:tcPr>
+            <w:tcW w:type="dxa" w:w="2479"/>
             <w:shd w:fill="F2F2F2" w:color="auto" w:val="clear"/>
             <w:tcMar>
               <w:top w:type="dxa" w:w="60"/>
@@ -1511,58 +1534,58 @@
             <w:r>
               <w:rPr>
                 <w:rFonts w:ascii="Arial" w:cs="Arial" w:eastAsia="Arial" w:hAnsi="Arial"/>
-                <w:sz w:val="17"/>
-                <w:szCs w:val="17"/>
-              </w:rPr>
-              <w:t xml:space="preserve">Stated a clear idea about the novel in a topic sentence and stayed with that idea for the whole paragraph.</w:t>
-            </w:r>
-          </w:p>
-        </w:tc>
-        <w:tc>
-          <w:tcPr>
-            <w:tcW w:type="dxa" w:w="2399"/>
-            <w:tcMar>
-              <w:top w:type="dxa" w:w="60"/>
-              <w:left w:type="dxa" w:w="90"/>
-              <w:bottom w:type="dxa" w:w="60"/>
-              <w:right w:type="dxa" w:w="90"/>
-            </w:tcMar>
-          </w:tcPr>
-          <w:p>
-            <w:pPr>
-              <w:spacing w:after="0"/>
-            </w:pPr>
-            <w:r>
-              <w:rPr>
-                <w:rFonts w:ascii="Arial" w:cs="Arial" w:eastAsia="Arial" w:hAnsi="Arial"/>
-                <w:sz w:val="17"/>
-                <w:szCs w:val="17"/>
-              </w:rPr>
-              <w:t xml:space="preserve">Stated a precise idea and developed it, showing how the novel builds that idea across more than one moment.</w:t>
-            </w:r>
-          </w:p>
-        </w:tc>
-        <w:tc>
-          <w:tcPr>
-            <w:tcW w:type="dxa" w:w="2399"/>
-            <w:tcMar>
-              <w:top w:type="dxa" w:w="60"/>
-              <w:left w:type="dxa" w:w="90"/>
-              <w:bottom w:type="dxa" w:w="60"/>
-              <w:right w:type="dxa" w:w="90"/>
-            </w:tcMar>
-          </w:tcPr>
-          <w:p>
-            <w:pPr>
-              <w:spacing w:after="0"/>
-            </w:pPr>
-            <w:r>
-              <w:rPr>
-                <w:rFonts w:ascii="Arial" w:cs="Arial" w:eastAsia="Arial" w:hAnsi="Arial"/>
-                <w:sz w:val="17"/>
-                <w:szCs w:val="17"/>
-              </w:rPr>
-              <w:t xml:space="preserve">Stated a precise and original idea and sustained it, treating the idea as an issue the novel raises rather than a theme it contains.</w:t>
+                <w:sz w:val="16"/>
+                <w:szCs w:val="16"/>
+              </w:rPr>
+              <w:t xml:space="preserve">I can explain how the structure and language used in a text helps influence the audience</w:t>
+            </w:r>
+          </w:p>
+        </w:tc>
+        <w:tc>
+          <w:tcPr>
+            <w:tcW w:type="dxa" w:w="2479"/>
+            <w:tcMar>
+              <w:top w:type="dxa" w:w="60"/>
+              <w:left w:type="dxa" w:w="90"/>
+              <w:bottom w:type="dxa" w:w="60"/>
+              <w:right w:type="dxa" w:w="90"/>
+            </w:tcMar>
+          </w:tcPr>
+          <w:p>
+            <w:pPr>
+              <w:spacing w:after="0"/>
+            </w:pPr>
+            <w:r>
+              <w:rPr>
+                <w:rFonts w:ascii="Arial" w:cs="Arial" w:eastAsia="Arial" w:hAnsi="Arial"/>
+                <w:sz w:val="16"/>
+                <w:szCs w:val="16"/>
+              </w:rPr>
+              <w:t xml:space="preserve">I can find the author’s point of view in a text and evaluate how credible the text is</w:t>
+            </w:r>
+          </w:p>
+        </w:tc>
+        <w:tc>
+          <w:tcPr>
+            <w:tcW w:type="dxa" w:w="2479"/>
+            <w:tcMar>
+              <w:top w:type="dxa" w:w="60"/>
+              <w:left w:type="dxa" w:w="90"/>
+              <w:bottom w:type="dxa" w:w="60"/>
+              <w:right w:type="dxa" w:w="90"/>
+            </w:tcMar>
+          </w:tcPr>
+          <w:p>
+            <w:pPr>
+              <w:spacing w:after="0"/>
+            </w:pPr>
+            <w:r>
+              <w:rPr>
+                <w:rFonts w:ascii="Arial" w:cs="Arial" w:eastAsia="Arial" w:hAnsi="Arial"/>
+                <w:sz w:val="16"/>
+                <w:szCs w:val="16"/>
+              </w:rPr>
+              <w:t xml:space="preserve">I can compare the way people and issues are represented in different texts</w:t>
             </w:r>
           </w:p>
         </w:tc>
@@ -1570,7 +1593,7 @@
       <w:tr>
         <w:tc>
           <w:tcPr>
-            <w:tcW w:type="dxa" w:w="3400"/>
+            <w:tcW w:type="dxa" w:w="3000"/>
             <w:tcMar>
               <w:top w:type="dxa" w:w="60"/>
               <w:left w:type="dxa" w:w="90"/>
@@ -1590,61 +1613,89 @@
                 <w:sz w:val="17"/>
                 <w:szCs w:val="17"/>
               </w:rPr>
-              <w:t xml:space="preserve">Evidence – quotations chosen from the text and embedded in the writing.</w:t>
-            </w:r>
-          </w:p>
-        </w:tc>
-        <w:tc>
-          <w:tcPr>
-            <w:tcW w:type="dxa" w:w="2399"/>
-            <w:tcMar>
-              <w:top w:type="dxa" w:w="60"/>
-              <w:left w:type="dxa" w:w="90"/>
-              <w:bottom w:type="dxa" w:w="60"/>
-              <w:right w:type="dxa" w:w="90"/>
-            </w:tcMar>
-          </w:tcPr>
-          <w:p>
-            <w:pPr>
-              <w:spacing w:after="0"/>
-            </w:pPr>
-            <w:r>
-              <w:rPr>
-                <w:rFonts w:ascii="Arial" w:cs="Arial" w:eastAsia="Arial" w:hAnsi="Arial"/>
-                <w:sz w:val="17"/>
-                <w:szCs w:val="17"/>
-              </w:rPr>
-              <w:t xml:space="preserve">Included little evidence from the novel, or quoted without connecting the quote to an idea.</w:t>
-            </w:r>
-          </w:p>
-        </w:tc>
-        <w:tc>
-          <w:tcPr>
-            <w:tcW w:type="dxa" w:w="2399"/>
-            <w:tcMar>
-              <w:top w:type="dxa" w:w="60"/>
-              <w:left w:type="dxa" w:w="90"/>
-              <w:bottom w:type="dxa" w:w="60"/>
-              <w:right w:type="dxa" w:w="90"/>
-            </w:tcMar>
-          </w:tcPr>
-          <w:p>
-            <w:pPr>
-              <w:spacing w:after="0"/>
-            </w:pPr>
-            <w:r>
-              <w:rPr>
-                <w:rFonts w:ascii="Arial" w:cs="Arial" w:eastAsia="Arial" w:hAnsi="Arial"/>
-                <w:sz w:val="17"/>
-                <w:szCs w:val="17"/>
-              </w:rPr>
-              <w:t xml:space="preserve">Included a quotation, sometimes placed in the paragraph on its own without explanation.</w:t>
-            </w:r>
-          </w:p>
-        </w:tc>
-        <w:tc>
-          <w:tcPr>
-            <w:tcW w:type="dxa" w:w="2399"/>
+              <w:t xml:space="preserve">Using evidence</w:t>
+            </w:r>
+          </w:p>
+          <w:p>
+            <w:pPr>
+              <w:spacing w:after="0"/>
+            </w:pPr>
+            <w:r>
+              <w:rPr>
+                <w:rFonts w:ascii="Arial" w:cs="Arial" w:eastAsia="Arial" w:hAnsi="Arial"/>
+                <w:color w:val="595959"/>
+                <w:sz w:val="15"/>
+                <w:szCs w:val="15"/>
+              </w:rPr>
+              <w:t xml:space="preserve">choosing the quote</w:t>
+            </w:r>
+          </w:p>
+          <w:p>
+            <w:pPr>
+              <w:spacing w:after="0"/>
+            </w:pPr>
+            <w:r>
+              <w:rPr>
+                <w:rFonts w:ascii="Arial" w:cs="Arial" w:eastAsia="Arial" w:hAnsi="Arial"/>
+                <w:color w:val="808080"/>
+                <w:sz w:val="14"/>
+                <w:szCs w:val="14"/>
+              </w:rPr>
+              <w:t xml:space="preserve">Reading and Viewing</w:t>
+            </w:r>
+          </w:p>
+        </w:tc>
+        <w:tc>
+          <w:tcPr>
+            <w:tcW w:type="dxa" w:w="2479"/>
+            <w:tcMar>
+              <w:top w:type="dxa" w:w="60"/>
+              <w:left w:type="dxa" w:w="90"/>
+              <w:bottom w:type="dxa" w:w="60"/>
+              <w:right w:type="dxa" w:w="90"/>
+            </w:tcMar>
+          </w:tcPr>
+          <w:p>
+            <w:pPr>
+              <w:spacing w:after="0"/>
+            </w:pPr>
+            <w:r>
+              <w:rPr>
+                <w:rFonts w:ascii="Arial" w:cs="Arial" w:eastAsia="Arial" w:hAnsi="Arial"/>
+                <w:sz w:val="16"/>
+                <w:szCs w:val="16"/>
+              </w:rPr>
+              <w:t xml:space="preserve">I can describe the depiction of events, characters and settings in texts and explain my responses to them</w:t>
+            </w:r>
+          </w:p>
+        </w:tc>
+        <w:tc>
+          <w:tcPr>
+            <w:tcW w:type="dxa" w:w="2479"/>
+            <w:tcMar>
+              <w:top w:type="dxa" w:w="60"/>
+              <w:left w:type="dxa" w:w="90"/>
+              <w:bottom w:type="dxa" w:w="60"/>
+              <w:right w:type="dxa" w:w="90"/>
+            </w:tcMar>
+          </w:tcPr>
+          <w:p>
+            <w:pPr>
+              <w:spacing w:after="0"/>
+            </w:pPr>
+            <w:r>
+              <w:rPr>
+                <w:rFonts w:ascii="Arial" w:cs="Arial" w:eastAsia="Arial" w:hAnsi="Arial"/>
+                <w:sz w:val="16"/>
+                <w:szCs w:val="16"/>
+              </w:rPr>
+              <w:t xml:space="preserve">I can select specific details from texts to develop and explain my own responses</w:t>
+            </w:r>
+          </w:p>
+        </w:tc>
+        <w:tc>
+          <w:tcPr>
+            <w:tcW w:type="dxa" w:w="2479"/>
             <w:shd w:fill="F2F2F2" w:color="auto" w:val="clear"/>
             <w:tcMar>
               <w:top w:type="dxa" w:w="60"/>
@@ -1660,58 +1711,58 @@
             <w:r>
               <w:rPr>
                 <w:rFonts w:ascii="Arial" w:cs="Arial" w:eastAsia="Arial" w:hAnsi="Arial"/>
-                <w:sz w:val="17"/>
-                <w:szCs w:val="17"/>
-              </w:rPr>
-              <w:t xml:space="preserve">Chose a relevant quotation and explained its relevance to the idea.</w:t>
-            </w:r>
-          </w:p>
-        </w:tc>
-        <w:tc>
-          <w:tcPr>
-            <w:tcW w:type="dxa" w:w="2399"/>
-            <w:tcMar>
-              <w:top w:type="dxa" w:w="60"/>
-              <w:left w:type="dxa" w:w="90"/>
-              <w:bottom w:type="dxa" w:w="60"/>
-              <w:right w:type="dxa" w:w="90"/>
-            </w:tcMar>
-          </w:tcPr>
-          <w:p>
-            <w:pPr>
-              <w:spacing w:after="0"/>
-            </w:pPr>
-            <w:r>
-              <w:rPr>
-                <w:rFonts w:ascii="Arial" w:cs="Arial" w:eastAsia="Arial" w:hAnsi="Arial"/>
-                <w:sz w:val="17"/>
-                <w:szCs w:val="17"/>
-              </w:rPr>
-              <w:t xml:space="preserve">Chose well-suited quotations and embedded them inside sentences of their own writing.</w:t>
-            </w:r>
-          </w:p>
-        </w:tc>
-        <w:tc>
-          <w:tcPr>
-            <w:tcW w:type="dxa" w:w="2399"/>
-            <w:tcMar>
-              <w:top w:type="dxa" w:w="60"/>
-              <w:left w:type="dxa" w:w="90"/>
-              <w:bottom w:type="dxa" w:w="60"/>
-              <w:right w:type="dxa" w:w="90"/>
-            </w:tcMar>
-          </w:tcPr>
-          <w:p>
-            <w:pPr>
-              <w:spacing w:after="0"/>
-            </w:pPr>
-            <w:r>
-              <w:rPr>
-                <w:rFonts w:ascii="Arial" w:cs="Arial" w:eastAsia="Arial" w:hAnsi="Arial"/>
-                <w:sz w:val="17"/>
-                <w:szCs w:val="17"/>
-              </w:rPr>
-              <w:t xml:space="preserve">Embedded several well-chosen quotations fluently, selecting the words that carry the writing rather than the plot.</w:t>
+                <w:sz w:val="16"/>
+                <w:szCs w:val="16"/>
+              </w:rPr>
+              <w:t xml:space="preserve">I can select and use evidence from texts to explain my response to it, recognising that texts reflect different viewpoints</w:t>
+            </w:r>
+          </w:p>
+        </w:tc>
+        <w:tc>
+          <w:tcPr>
+            <w:tcW w:type="dxa" w:w="2479"/>
+            <w:tcMar>
+              <w:top w:type="dxa" w:w="60"/>
+              <w:left w:type="dxa" w:w="90"/>
+              <w:bottom w:type="dxa" w:w="60"/>
+              <w:right w:type="dxa" w:w="90"/>
+            </w:tcMar>
+          </w:tcPr>
+          <w:p>
+            <w:pPr>
+              <w:spacing w:after="0"/>
+            </w:pPr>
+            <w:r>
+              <w:rPr>
+                <w:rFonts w:ascii="Arial" w:cs="Arial" w:eastAsia="Arial" w:hAnsi="Arial"/>
+                <w:sz w:val="16"/>
+                <w:szCs w:val="16"/>
+              </w:rPr>
+              <w:t xml:space="preserve">I can select evidence from texts to describe how authors depict events, situations, and people from different viewpoints</w:t>
+            </w:r>
+          </w:p>
+        </w:tc>
+        <w:tc>
+          <w:tcPr>
+            <w:tcW w:type="dxa" w:w="2479"/>
+            <w:tcMar>
+              <w:top w:type="dxa" w:w="60"/>
+              <w:left w:type="dxa" w:w="90"/>
+              <w:bottom w:type="dxa" w:w="60"/>
+              <w:right w:type="dxa" w:w="90"/>
+            </w:tcMar>
+          </w:tcPr>
+          <w:p>
+            <w:pPr>
+              <w:spacing w:after="0"/>
+            </w:pPr>
+            <w:r>
+              <w:rPr>
+                <w:rFonts w:ascii="Arial" w:cs="Arial" w:eastAsia="Arial" w:hAnsi="Arial"/>
+                <w:sz w:val="16"/>
+                <w:szCs w:val="16"/>
+              </w:rPr>
+              <w:t xml:space="preserve">I can select evidence from texts to explain how language choices influence an audience</w:t>
             </w:r>
           </w:p>
         </w:tc>
@@ -1719,7 +1770,7 @@
       <w:tr>
         <w:tc>
           <w:tcPr>
-            <w:tcW w:type="dxa" w:w="3400"/>
+            <w:tcW w:type="dxa" w:w="3000"/>
             <w:tcMar>
               <w:top w:type="dxa" w:w="60"/>
               <w:left w:type="dxa" w:w="90"/>
@@ -1739,61 +1790,89 @@
                 <w:sz w:val="17"/>
                 <w:szCs w:val="17"/>
               </w:rPr>
-              <w:t xml:space="preserve">Explanation – what the writing does to the reader, expressed with analytical verbs.</w:t>
-            </w:r>
-          </w:p>
-        </w:tc>
-        <w:tc>
-          <w:tcPr>
-            <w:tcW w:type="dxa" w:w="2399"/>
-            <w:tcMar>
-              <w:top w:type="dxa" w:w="60"/>
-              <w:left w:type="dxa" w:w="90"/>
-              <w:bottom w:type="dxa" w:w="60"/>
-              <w:right w:type="dxa" w:w="90"/>
-            </w:tcMar>
-          </w:tcPr>
-          <w:p>
-            <w:pPr>
-              <w:spacing w:after="0"/>
-            </w:pPr>
-            <w:r>
-              <w:rPr>
-                <w:rFonts w:ascii="Arial" w:cs="Arial" w:eastAsia="Arial" w:hAnsi="Arial"/>
-                <w:sz w:val="17"/>
-                <w:szCs w:val="17"/>
-              </w:rPr>
-              <w:t xml:space="preserve">Explained what happened in the story rather than what the writing does.</w:t>
-            </w:r>
-          </w:p>
-        </w:tc>
-        <w:tc>
-          <w:tcPr>
-            <w:tcW w:type="dxa" w:w="2399"/>
-            <w:tcMar>
-              <w:top w:type="dxa" w:w="60"/>
-              <w:left w:type="dxa" w:w="90"/>
-              <w:bottom w:type="dxa" w:w="60"/>
-              <w:right w:type="dxa" w:w="90"/>
-            </w:tcMar>
-          </w:tcPr>
-          <w:p>
-            <w:pPr>
-              <w:spacing w:after="0"/>
-            </w:pPr>
-            <w:r>
-              <w:rPr>
-                <w:rFonts w:ascii="Arial" w:cs="Arial" w:eastAsia="Arial" w:hAnsi="Arial"/>
-                <w:sz w:val="17"/>
-                <w:szCs w:val="17"/>
-              </w:rPr>
-              <w:t xml:space="preserve">Described how the writing made the reader feel, in general terms.</w:t>
-            </w:r>
-          </w:p>
-        </w:tc>
-        <w:tc>
-          <w:tcPr>
-            <w:tcW w:type="dxa" w:w="2399"/>
+              <w:t xml:space="preserve">Use of evidence</w:t>
+            </w:r>
+          </w:p>
+          <w:p>
+            <w:pPr>
+              <w:spacing w:after="0"/>
+            </w:pPr>
+            <w:r>
+              <w:rPr>
+                <w:rFonts w:ascii="Arial" w:cs="Arial" w:eastAsia="Arial" w:hAnsi="Arial"/>
+                <w:color w:val="595959"/>
+                <w:sz w:val="15"/>
+                <w:szCs w:val="15"/>
+              </w:rPr>
+              <w:t xml:space="preserve">putting the quote in the sentence</w:t>
+            </w:r>
+          </w:p>
+          <w:p>
+            <w:pPr>
+              <w:spacing w:after="0"/>
+            </w:pPr>
+            <w:r>
+              <w:rPr>
+                <w:rFonts w:ascii="Arial" w:cs="Arial" w:eastAsia="Arial" w:hAnsi="Arial"/>
+                <w:color w:val="808080"/>
+                <w:sz w:val="14"/>
+                <w:szCs w:val="14"/>
+              </w:rPr>
+              <w:t xml:space="preserve">Writing</w:t>
+            </w:r>
+          </w:p>
+        </w:tc>
+        <w:tc>
+          <w:tcPr>
+            <w:tcW w:type="dxa" w:w="2479"/>
+            <w:tcMar>
+              <w:top w:type="dxa" w:w="60"/>
+              <w:left w:type="dxa" w:w="90"/>
+              <w:bottom w:type="dxa" w:w="60"/>
+              <w:right w:type="dxa" w:w="90"/>
+            </w:tcMar>
+          </w:tcPr>
+          <w:p>
+            <w:pPr>
+              <w:spacing w:after="0"/>
+            </w:pPr>
+            <w:r>
+              <w:rPr>
+                <w:rFonts w:ascii="Arial" w:cs="Arial" w:eastAsia="Arial" w:hAnsi="Arial"/>
+                <w:sz w:val="16"/>
+                <w:szCs w:val="16"/>
+              </w:rPr>
+              <w:t xml:space="preserve">Not on the continuum at this level</w:t>
+            </w:r>
+          </w:p>
+        </w:tc>
+        <w:tc>
+          <w:tcPr>
+            <w:tcW w:type="dxa" w:w="2479"/>
+            <w:tcMar>
+              <w:top w:type="dxa" w:w="60"/>
+              <w:left w:type="dxa" w:w="90"/>
+              <w:bottom w:type="dxa" w:w="60"/>
+              <w:right w:type="dxa" w:w="90"/>
+            </w:tcMar>
+          </w:tcPr>
+          <w:p>
+            <w:pPr>
+              <w:spacing w:after="0"/>
+            </w:pPr>
+            <w:r>
+              <w:rPr>
+                <w:rFonts w:ascii="Arial" w:cs="Arial" w:eastAsia="Arial" w:hAnsi="Arial"/>
+                <w:sz w:val="16"/>
+                <w:szCs w:val="16"/>
+              </w:rPr>
+              <w:t xml:space="preserve">I can include quotes in an explanation with teacher guidance</w:t>
+            </w:r>
+          </w:p>
+        </w:tc>
+        <w:tc>
+          <w:tcPr>
+            <w:tcW w:type="dxa" w:w="2479"/>
             <w:shd w:fill="F2F2F2" w:color="auto" w:val="clear"/>
             <w:tcMar>
               <w:top w:type="dxa" w:w="60"/>
@@ -1809,58 +1888,58 @@
             <w:r>
               <w:rPr>
                 <w:rFonts w:ascii="Arial" w:cs="Arial" w:eastAsia="Arial" w:hAnsi="Arial"/>
-                <w:sz w:val="17"/>
-                <w:szCs w:val="17"/>
-              </w:rPr>
-              <w:t xml:space="preserve">Used an analytical verb to explain the effect of Fraillon’s writing on the reader.</w:t>
-            </w:r>
-          </w:p>
-        </w:tc>
-        <w:tc>
-          <w:tcPr>
-            <w:tcW w:type="dxa" w:w="2399"/>
-            <w:tcMar>
-              <w:top w:type="dxa" w:w="60"/>
-              <w:left w:type="dxa" w:w="90"/>
-              <w:bottom w:type="dxa" w:w="60"/>
-              <w:right w:type="dxa" w:w="90"/>
-            </w:tcMar>
-          </w:tcPr>
-          <w:p>
-            <w:pPr>
-              <w:spacing w:after="0"/>
-            </w:pPr>
-            <w:r>
-              <w:rPr>
-                <w:rFonts w:ascii="Arial" w:cs="Arial" w:eastAsia="Arial" w:hAnsi="Arial"/>
-                <w:sz w:val="17"/>
-                <w:szCs w:val="17"/>
-              </w:rPr>
-              <w:t xml:space="preserve">Explained the effect precisely, naming the language feature that creates it.</w:t>
-            </w:r>
-          </w:p>
-        </w:tc>
-        <w:tc>
-          <w:tcPr>
-            <w:tcW w:type="dxa" w:w="2399"/>
-            <w:tcMar>
-              <w:top w:type="dxa" w:w="60"/>
-              <w:left w:type="dxa" w:w="90"/>
-              <w:bottom w:type="dxa" w:w="60"/>
-              <w:right w:type="dxa" w:w="90"/>
-            </w:tcMar>
-          </w:tcPr>
-          <w:p>
-            <w:pPr>
-              <w:spacing w:after="0"/>
-            </w:pPr>
-            <w:r>
-              <w:rPr>
-                <w:rFonts w:ascii="Arial" w:cs="Arial" w:eastAsia="Arial" w:hAnsi="Arial"/>
-                <w:sz w:val="17"/>
-                <w:szCs w:val="17"/>
-              </w:rPr>
-              <w:t xml:space="preserve">Explained how the writer’s choice works on the reader, including what the writing implies or withholds.</w:t>
+                <w:sz w:val="16"/>
+                <w:szCs w:val="16"/>
+              </w:rPr>
+              <w:t xml:space="preserve">I can explain the relevance of a quote</w:t>
+            </w:r>
+          </w:p>
+        </w:tc>
+        <w:tc>
+          <w:tcPr>
+            <w:tcW w:type="dxa" w:w="2479"/>
+            <w:tcMar>
+              <w:top w:type="dxa" w:w="60"/>
+              <w:left w:type="dxa" w:w="90"/>
+              <w:bottom w:type="dxa" w:w="60"/>
+              <w:right w:type="dxa" w:w="90"/>
+            </w:tcMar>
+          </w:tcPr>
+          <w:p>
+            <w:pPr>
+              <w:spacing w:after="0"/>
+            </w:pPr>
+            <w:r>
+              <w:rPr>
+                <w:rFonts w:ascii="Arial" w:cs="Arial" w:eastAsia="Arial" w:hAnsi="Arial"/>
+                <w:sz w:val="16"/>
+                <w:szCs w:val="16"/>
+              </w:rPr>
+              <w:t xml:space="preserve">I can embed quotes into sentences</w:t>
+            </w:r>
+          </w:p>
+        </w:tc>
+        <w:tc>
+          <w:tcPr>
+            <w:tcW w:type="dxa" w:w="2479"/>
+            <w:tcMar>
+              <w:top w:type="dxa" w:w="60"/>
+              <w:left w:type="dxa" w:w="90"/>
+              <w:bottom w:type="dxa" w:w="60"/>
+              <w:right w:type="dxa" w:w="90"/>
+            </w:tcMar>
+          </w:tcPr>
+          <w:p>
+            <w:pPr>
+              <w:spacing w:after="0"/>
+            </w:pPr>
+            <w:r>
+              <w:rPr>
+                <w:rFonts w:ascii="Arial" w:cs="Arial" w:eastAsia="Arial" w:hAnsi="Arial"/>
+                <w:sz w:val="16"/>
+                <w:szCs w:val="16"/>
+              </w:rPr>
+              <w:t xml:space="preserve">I can correctly embed quotes within an explanation sentence</w:t>
             </w:r>
           </w:p>
         </w:tc>
@@ -1868,7 +1947,7 @@
       <w:tr>
         <w:tc>
           <w:tcPr>
-            <w:tcW w:type="dxa" w:w="3400"/>
+            <w:tcW w:type="dxa" w:w="3000"/>
             <w:tcMar>
               <w:top w:type="dxa" w:w="60"/>
               <w:left w:type="dxa" w:w="90"/>
@@ -1888,61 +1967,89 @@
                 <w:sz w:val="17"/>
                 <w:szCs w:val="17"/>
               </w:rPr>
-              <w:t xml:space="preserve">Structure – the shape of the paragraph: topic sentence, evidence, explanation, link.</w:t>
-            </w:r>
-          </w:p>
-        </w:tc>
-        <w:tc>
-          <w:tcPr>
-            <w:tcW w:type="dxa" w:w="2399"/>
-            <w:tcMar>
-              <w:top w:type="dxa" w:w="60"/>
-              <w:left w:type="dxa" w:w="90"/>
-              <w:bottom w:type="dxa" w:w="60"/>
-              <w:right w:type="dxa" w:w="90"/>
-            </w:tcMar>
-          </w:tcPr>
-          <w:p>
-            <w:pPr>
-              <w:spacing w:after="0"/>
-            </w:pPr>
-            <w:r>
-              <w:rPr>
-                <w:rFonts w:ascii="Arial" w:cs="Arial" w:eastAsia="Arial" w:hAnsi="Arial"/>
-                <w:sz w:val="17"/>
-                <w:szCs w:val="17"/>
-              </w:rPr>
-              <w:t xml:space="preserve">The paragraph lacked a clear topic sentence, or ran several ideas together.</w:t>
-            </w:r>
-          </w:p>
-        </w:tc>
-        <w:tc>
-          <w:tcPr>
-            <w:tcW w:type="dxa" w:w="2399"/>
-            <w:tcMar>
-              <w:top w:type="dxa" w:w="60"/>
-              <w:left w:type="dxa" w:w="90"/>
-              <w:bottom w:type="dxa" w:w="60"/>
-              <w:right w:type="dxa" w:w="90"/>
-            </w:tcMar>
-          </w:tcPr>
-          <w:p>
-            <w:pPr>
-              <w:spacing w:after="0"/>
-            </w:pPr>
-            <w:r>
-              <w:rPr>
-                <w:rFonts w:ascii="Arial" w:cs="Arial" w:eastAsia="Arial" w:hAnsi="Arial"/>
-                <w:sz w:val="17"/>
-                <w:szCs w:val="17"/>
-              </w:rPr>
-              <w:t xml:space="preserve">Some elements of TEEL were used; the link sentence was missing, or repeated the topic sentence.</w:t>
-            </w:r>
-          </w:p>
-        </w:tc>
-        <w:tc>
-          <w:tcPr>
-            <w:tcW w:type="dxa" w:w="2399"/>
+              <w:t xml:space="preserve">Evaluating texts</w:t>
+            </w:r>
+          </w:p>
+          <w:p>
+            <w:pPr>
+              <w:spacing w:after="0"/>
+            </w:pPr>
+            <w:r>
+              <w:rPr>
+                <w:rFonts w:ascii="Arial" w:cs="Arial" w:eastAsia="Arial" w:hAnsi="Arial"/>
+                <w:color w:val="595959"/>
+                <w:sz w:val="15"/>
+                <w:szCs w:val="15"/>
+              </w:rPr>
+              <w:t xml:space="preserve">the effect on the reader</w:t>
+            </w:r>
+          </w:p>
+          <w:p>
+            <w:pPr>
+              <w:spacing w:after="0"/>
+            </w:pPr>
+            <w:r>
+              <w:rPr>
+                <w:rFonts w:ascii="Arial" w:cs="Arial" w:eastAsia="Arial" w:hAnsi="Arial"/>
+                <w:color w:val="808080"/>
+                <w:sz w:val="14"/>
+                <w:szCs w:val="14"/>
+              </w:rPr>
+              <w:t xml:space="preserve">Reading and Viewing</w:t>
+            </w:r>
+          </w:p>
+        </w:tc>
+        <w:tc>
+          <w:tcPr>
+            <w:tcW w:type="dxa" w:w="2479"/>
+            <w:tcMar>
+              <w:top w:type="dxa" w:w="60"/>
+              <w:left w:type="dxa" w:w="90"/>
+              <w:bottom w:type="dxa" w:w="60"/>
+              <w:right w:type="dxa" w:w="90"/>
+            </w:tcMar>
+          </w:tcPr>
+          <w:p>
+            <w:pPr>
+              <w:spacing w:after="0"/>
+            </w:pPr>
+            <w:r>
+              <w:rPr>
+                <w:rFonts w:ascii="Arial" w:cs="Arial" w:eastAsia="Arial" w:hAnsi="Arial"/>
+                <w:sz w:val="16"/>
+                <w:szCs w:val="16"/>
+              </w:rPr>
+              <w:t xml:space="preserve">I can use metalanguage to discuss the effect of texts on the reader</w:t>
+            </w:r>
+          </w:p>
+        </w:tc>
+        <w:tc>
+          <w:tcPr>
+            <w:tcW w:type="dxa" w:w="2479"/>
+            <w:tcMar>
+              <w:top w:type="dxa" w:w="60"/>
+              <w:left w:type="dxa" w:w="90"/>
+              <w:bottom w:type="dxa" w:w="60"/>
+              <w:right w:type="dxa" w:w="90"/>
+            </w:tcMar>
+          </w:tcPr>
+          <w:p>
+            <w:pPr>
+              <w:spacing w:after="0"/>
+            </w:pPr>
+            <w:r>
+              <w:rPr>
+                <w:rFonts w:ascii="Arial" w:cs="Arial" w:eastAsia="Arial" w:hAnsi="Arial"/>
+                <w:sz w:val="16"/>
+                <w:szCs w:val="16"/>
+              </w:rPr>
+              <w:t xml:space="preserve">I can describe how repetition, emphasis and metaphor can influence the way a reader feels</w:t>
+            </w:r>
+          </w:p>
+        </w:tc>
+        <w:tc>
+          <w:tcPr>
+            <w:tcW w:type="dxa" w:w="2479"/>
             <w:shd w:fill="F2F2F2" w:color="auto" w:val="clear"/>
             <w:tcMar>
               <w:top w:type="dxa" w:w="60"/>
@@ -1958,58 +2065,58 @@
             <w:r>
               <w:rPr>
                 <w:rFonts w:ascii="Arial" w:cs="Arial" w:eastAsia="Arial" w:hAnsi="Arial"/>
-                <w:sz w:val="17"/>
-                <w:szCs w:val="17"/>
-              </w:rPr>
-              <w:t xml:space="preserve">Used the TEEL structure, finishing with a link sentence that returns to the idea.</w:t>
-            </w:r>
-          </w:p>
-        </w:tc>
-        <w:tc>
-          <w:tcPr>
-            <w:tcW w:type="dxa" w:w="2399"/>
-            <w:tcMar>
-              <w:top w:type="dxa" w:w="60"/>
-              <w:left w:type="dxa" w:w="90"/>
-              <w:bottom w:type="dxa" w:w="60"/>
-              <w:right w:type="dxa" w:w="90"/>
-            </w:tcMar>
-          </w:tcPr>
-          <w:p>
-            <w:pPr>
-              <w:spacing w:after="0"/>
-            </w:pPr>
-            <w:r>
-              <w:rPr>
-                <w:rFonts w:ascii="Arial" w:cs="Arial" w:eastAsia="Arial" w:hAnsi="Arial"/>
-                <w:sz w:val="17"/>
-                <w:szCs w:val="17"/>
-              </w:rPr>
-              <w:t xml:space="preserve">Used TEEL fluently, with a link sentence that said more than the topic sentence did.</w:t>
-            </w:r>
-          </w:p>
-        </w:tc>
-        <w:tc>
-          <w:tcPr>
-            <w:tcW w:type="dxa" w:w="2399"/>
-            <w:tcMar>
-              <w:top w:type="dxa" w:w="60"/>
-              <w:left w:type="dxa" w:w="90"/>
-              <w:bottom w:type="dxa" w:w="60"/>
-              <w:right w:type="dxa" w:w="90"/>
-            </w:tcMar>
-          </w:tcPr>
-          <w:p>
-            <w:pPr>
-              <w:spacing w:after="0"/>
-            </w:pPr>
-            <w:r>
-              <w:rPr>
-                <w:rFonts w:ascii="Arial" w:cs="Arial" w:eastAsia="Arial" w:hAnsi="Arial"/>
-                <w:sz w:val="17"/>
-                <w:szCs w:val="17"/>
-              </w:rPr>
-              <w:t xml:space="preserve">Controlled the structure so that each sentence built on the one before, and the link drew both halves of the paragraph together.</w:t>
+                <w:sz w:val="16"/>
+                <w:szCs w:val="16"/>
+              </w:rPr>
+              <w:t xml:space="preserve">I can use examples from the text to discuss how language helps to create character</w:t>
+            </w:r>
+          </w:p>
+        </w:tc>
+        <w:tc>
+          <w:tcPr>
+            <w:tcW w:type="dxa" w:w="2479"/>
+            <w:tcMar>
+              <w:top w:type="dxa" w:w="60"/>
+              <w:left w:type="dxa" w:w="90"/>
+              <w:bottom w:type="dxa" w:w="60"/>
+              <w:right w:type="dxa" w:w="90"/>
+            </w:tcMar>
+          </w:tcPr>
+          <w:p>
+            <w:pPr>
+              <w:spacing w:after="0"/>
+            </w:pPr>
+            <w:r>
+              <w:rPr>
+                <w:rFonts w:ascii="Arial" w:cs="Arial" w:eastAsia="Arial" w:hAnsi="Arial"/>
+                <w:sz w:val="16"/>
+                <w:szCs w:val="16"/>
+              </w:rPr>
+              <w:t xml:space="preserve">I can explain how different types of evidence can add authority to a text</w:t>
+            </w:r>
+          </w:p>
+        </w:tc>
+        <w:tc>
+          <w:tcPr>
+            <w:tcW w:type="dxa" w:w="2479"/>
+            <w:tcMar>
+              <w:top w:type="dxa" w:w="60"/>
+              <w:left w:type="dxa" w:w="90"/>
+              <w:bottom w:type="dxa" w:w="60"/>
+              <w:right w:type="dxa" w:w="90"/>
+            </w:tcMar>
+          </w:tcPr>
+          <w:p>
+            <w:pPr>
+              <w:spacing w:after="0"/>
+            </w:pPr>
+            <w:r>
+              <w:rPr>
+                <w:rFonts w:ascii="Arial" w:cs="Arial" w:eastAsia="Arial" w:hAnsi="Arial"/>
+                <w:sz w:val="16"/>
+                <w:szCs w:val="16"/>
+              </w:rPr>
+              <w:t xml:space="preserve">I can explain how a text explores issues that relate to our own lives</w:t>
             </w:r>
           </w:p>
         </w:tc>
@@ -2017,7 +2124,7 @@
       <w:tr>
         <w:tc>
           <w:tcPr>
-            <w:tcW w:type="dxa" w:w="3400"/>
+            <w:tcW w:type="dxa" w:w="3000"/>
             <w:tcMar>
               <w:top w:type="dxa" w:w="60"/>
               <w:left w:type="dxa" w:w="90"/>
@@ -2037,61 +2144,443 @@
                 <w:sz w:val="17"/>
                 <w:szCs w:val="17"/>
               </w:rPr>
-              <w:t xml:space="preserve">Expression – formal register, and control of grammar, spelling and punctuation.</w:t>
-            </w:r>
-          </w:p>
-        </w:tc>
-        <w:tc>
-          <w:tcPr>
-            <w:tcW w:type="dxa" w:w="2399"/>
-            <w:tcMar>
-              <w:top w:type="dxa" w:w="60"/>
-              <w:left w:type="dxa" w:w="90"/>
-              <w:bottom w:type="dxa" w:w="60"/>
-              <w:right w:type="dxa" w:w="90"/>
-            </w:tcMar>
-          </w:tcPr>
-          <w:p>
-            <w:pPr>
-              <w:spacing w:after="0"/>
-            </w:pPr>
-            <w:r>
-              <w:rPr>
-                <w:rFonts w:ascii="Arial" w:cs="Arial" w:eastAsia="Arial" w:hAnsi="Arial"/>
+              <w:t xml:space="preserve">Text structure and organisation</w:t>
+            </w:r>
+          </w:p>
+          <w:p>
+            <w:pPr>
+              <w:spacing w:after="0"/>
+            </w:pPr>
+            <w:r>
+              <w:rPr>
+                <w:rFonts w:ascii="Arial" w:cs="Arial" w:eastAsia="Arial" w:hAnsi="Arial"/>
+                <w:color w:val="595959"/>
+                <w:sz w:val="15"/>
+                <w:szCs w:val="15"/>
+              </w:rPr>
+              <w:t xml:space="preserve">the shape of the paragraph</w:t>
+            </w:r>
+          </w:p>
+          <w:p>
+            <w:pPr>
+              <w:spacing w:after="0"/>
+            </w:pPr>
+            <w:r>
+              <w:rPr>
+                <w:rFonts w:ascii="Arial" w:cs="Arial" w:eastAsia="Arial" w:hAnsi="Arial"/>
+                <w:color w:val="808080"/>
+                <w:sz w:val="14"/>
+                <w:szCs w:val="14"/>
+              </w:rPr>
+              <w:t xml:space="preserve">Writing</w:t>
+            </w:r>
+          </w:p>
+        </w:tc>
+        <w:tc>
+          <w:tcPr>
+            <w:tcW w:type="dxa" w:w="2479"/>
+            <w:tcMar>
+              <w:top w:type="dxa" w:w="60"/>
+              <w:left w:type="dxa" w:w="90"/>
+              <w:bottom w:type="dxa" w:w="60"/>
+              <w:right w:type="dxa" w:w="90"/>
+            </w:tcMar>
+          </w:tcPr>
+          <w:p>
+            <w:pPr>
+              <w:spacing w:after="0"/>
+            </w:pPr>
+            <w:r>
+              <w:rPr>
+                <w:rFonts w:ascii="Arial" w:cs="Arial" w:eastAsia="Arial" w:hAnsi="Arial"/>
+                <w:sz w:val="16"/>
+                <w:szCs w:val="16"/>
+              </w:rPr>
+              <w:t xml:space="preserve">I can change the focus of a sentence by modifying the subject</w:t>
+            </w:r>
+          </w:p>
+        </w:tc>
+        <w:tc>
+          <w:tcPr>
+            <w:tcW w:type="dxa" w:w="2479"/>
+            <w:tcMar>
+              <w:top w:type="dxa" w:w="60"/>
+              <w:left w:type="dxa" w:w="90"/>
+              <w:bottom w:type="dxa" w:w="60"/>
+              <w:right w:type="dxa" w:w="90"/>
+            </w:tcMar>
+          </w:tcPr>
+          <w:p>
+            <w:pPr>
+              <w:spacing w:after="0"/>
+            </w:pPr>
+            <w:r>
+              <w:rPr>
+                <w:rFonts w:ascii="Arial" w:cs="Arial" w:eastAsia="Arial" w:hAnsi="Arial"/>
+                <w:sz w:val="16"/>
+                <w:szCs w:val="16"/>
+              </w:rPr>
+              <w:t xml:space="preserve">I can avoid repetition by changing the participants in a follow-on idea</w:t>
+            </w:r>
+          </w:p>
+        </w:tc>
+        <w:tc>
+          <w:tcPr>
+            <w:tcW w:type="dxa" w:w="2479"/>
+            <w:shd w:fill="F2F2F2" w:color="auto" w:val="clear"/>
+            <w:tcMar>
+              <w:top w:type="dxa" w:w="60"/>
+              <w:left w:type="dxa" w:w="90"/>
+              <w:bottom w:type="dxa" w:w="60"/>
+              <w:right w:type="dxa" w:w="90"/>
+            </w:tcMar>
+          </w:tcPr>
+          <w:p>
+            <w:pPr>
+              <w:spacing w:after="0"/>
+            </w:pPr>
+            <w:r>
+              <w:rPr>
+                <w:rFonts w:ascii="Arial" w:cs="Arial" w:eastAsia="Arial" w:hAnsi="Arial"/>
+                <w:sz w:val="16"/>
+                <w:szCs w:val="16"/>
+              </w:rPr>
+              <w:t xml:space="preserve">I can write a paragraph for informative and narrative texts</w:t>
+            </w:r>
+          </w:p>
+        </w:tc>
+        <w:tc>
+          <w:tcPr>
+            <w:tcW w:type="dxa" w:w="2479"/>
+            <w:tcMar>
+              <w:top w:type="dxa" w:w="60"/>
+              <w:left w:type="dxa" w:w="90"/>
+              <w:bottom w:type="dxa" w:w="60"/>
+              <w:right w:type="dxa" w:w="90"/>
+            </w:tcMar>
+          </w:tcPr>
+          <w:p>
+            <w:pPr>
+              <w:spacing w:after="0"/>
+            </w:pPr>
+            <w:r>
+              <w:rPr>
+                <w:rFonts w:ascii="Arial" w:cs="Arial" w:eastAsia="Arial" w:hAnsi="Arial"/>
+                <w:sz w:val="16"/>
+                <w:szCs w:val="16"/>
+              </w:rPr>
+              <w:t xml:space="preserve">I can sequence ideas relating to a topic within a given structure</w:t>
+            </w:r>
+          </w:p>
+        </w:tc>
+        <w:tc>
+          <w:tcPr>
+            <w:tcW w:type="dxa" w:w="2479"/>
+            <w:tcMar>
+              <w:top w:type="dxa" w:w="60"/>
+              <w:left w:type="dxa" w:w="90"/>
+              <w:bottom w:type="dxa" w:w="60"/>
+              <w:right w:type="dxa" w:w="90"/>
+            </w:tcMar>
+          </w:tcPr>
+          <w:p>
+            <w:pPr>
+              <w:spacing w:after="0"/>
+            </w:pPr>
+            <w:r>
+              <w:rPr>
+                <w:rFonts w:ascii="Arial" w:cs="Arial" w:eastAsia="Arial" w:hAnsi="Arial"/>
+                <w:sz w:val="16"/>
+                <w:szCs w:val="16"/>
+              </w:rPr>
+              <w:t xml:space="preserve">I can sequence ideas to present a clear argument</w:t>
+            </w:r>
+          </w:p>
+        </w:tc>
+      </w:tr>
+      <w:tr>
+        <w:tc>
+          <w:tcPr>
+            <w:tcW w:type="dxa" w:w="3000"/>
+            <w:tcMar>
+              <w:top w:type="dxa" w:w="60"/>
+              <w:left w:type="dxa" w:w="90"/>
+              <w:bottom w:type="dxa" w:w="60"/>
+              <w:right w:type="dxa" w:w="90"/>
+            </w:tcMar>
+          </w:tcPr>
+          <w:p>
+            <w:pPr>
+              <w:spacing w:after="0"/>
+            </w:pPr>
+            <w:r>
+              <w:rPr>
+                <w:rFonts w:ascii="Arial" w:cs="Arial" w:eastAsia="Arial" w:hAnsi="Arial"/>
+                <w:b/>
+                <w:bCs/>
                 <w:sz w:val="17"/>
                 <w:szCs w:val="17"/>
               </w:rPr>
-              <w:t xml:space="preserve">Frequent errors in grammar, spelling and punctuation impeded the meaning.</w:t>
-            </w:r>
-          </w:p>
-        </w:tc>
-        <w:tc>
-          <w:tcPr>
-            <w:tcW w:type="dxa" w:w="2399"/>
-            <w:tcMar>
-              <w:top w:type="dxa" w:w="60"/>
-              <w:left w:type="dxa" w:w="90"/>
-              <w:bottom w:type="dxa" w:w="60"/>
-              <w:right w:type="dxa" w:w="90"/>
-            </w:tcMar>
-          </w:tcPr>
-          <w:p>
-            <w:pPr>
-              <w:spacing w:after="0"/>
-            </w:pPr>
-            <w:r>
-              <w:rPr>
-                <w:rFonts w:ascii="Arial" w:cs="Arial" w:eastAsia="Arial" w:hAnsi="Arial"/>
+              <w:t xml:space="preserve">Voice and register</w:t>
+            </w:r>
+          </w:p>
+          <w:p>
+            <w:pPr>
+              <w:spacing w:after="0"/>
+            </w:pPr>
+            <w:r>
+              <w:rPr>
+                <w:rFonts w:ascii="Arial" w:cs="Arial" w:eastAsia="Arial" w:hAnsi="Arial"/>
+                <w:color w:val="595959"/>
+                <w:sz w:val="15"/>
+                <w:szCs w:val="15"/>
+              </w:rPr>
+              <w:t xml:space="preserve">the analytical verb, and how formal it sounds</w:t>
+            </w:r>
+          </w:p>
+          <w:p>
+            <w:pPr>
+              <w:spacing w:after="0"/>
+            </w:pPr>
+            <w:r>
+              <w:rPr>
+                <w:rFonts w:ascii="Arial" w:cs="Arial" w:eastAsia="Arial" w:hAnsi="Arial"/>
+                <w:color w:val="808080"/>
+                <w:sz w:val="14"/>
+                <w:szCs w:val="14"/>
+              </w:rPr>
+              <w:t xml:space="preserve">Writing</w:t>
+            </w:r>
+          </w:p>
+        </w:tc>
+        <w:tc>
+          <w:tcPr>
+            <w:tcW w:type="dxa" w:w="2479"/>
+            <w:tcMar>
+              <w:top w:type="dxa" w:w="60"/>
+              <w:left w:type="dxa" w:w="90"/>
+              <w:bottom w:type="dxa" w:w="60"/>
+              <w:right w:type="dxa" w:w="90"/>
+            </w:tcMar>
+          </w:tcPr>
+          <w:p>
+            <w:pPr>
+              <w:spacing w:after="0"/>
+            </w:pPr>
+            <w:r>
+              <w:rPr>
+                <w:rFonts w:ascii="Arial" w:cs="Arial" w:eastAsia="Arial" w:hAnsi="Arial"/>
+                <w:sz w:val="16"/>
+                <w:szCs w:val="16"/>
+              </w:rPr>
+              <w:t xml:space="preserve">I can write using the correct relevant tense</w:t>
+            </w:r>
+          </w:p>
+        </w:tc>
+        <w:tc>
+          <w:tcPr>
+            <w:tcW w:type="dxa" w:w="2479"/>
+            <w:tcMar>
+              <w:top w:type="dxa" w:w="60"/>
+              <w:left w:type="dxa" w:w="90"/>
+              <w:bottom w:type="dxa" w:w="60"/>
+              <w:right w:type="dxa" w:w="90"/>
+            </w:tcMar>
+          </w:tcPr>
+          <w:p>
+            <w:pPr>
+              <w:spacing w:after="0"/>
+            </w:pPr>
+            <w:r>
+              <w:rPr>
+                <w:rFonts w:ascii="Arial" w:cs="Arial" w:eastAsia="Arial" w:hAnsi="Arial"/>
+                <w:sz w:val="16"/>
+                <w:szCs w:val="16"/>
+              </w:rPr>
+              <w:t xml:space="preserve">I can use different types of verbs in my writing (existing, doing, thinking, feeling)</w:t>
+            </w:r>
+          </w:p>
+        </w:tc>
+        <w:tc>
+          <w:tcPr>
+            <w:tcW w:type="dxa" w:w="2479"/>
+            <w:shd w:fill="F2F2F2" w:color="auto" w:val="clear"/>
+            <w:tcMar>
+              <w:top w:type="dxa" w:w="60"/>
+              <w:left w:type="dxa" w:w="90"/>
+              <w:bottom w:type="dxa" w:w="60"/>
+              <w:right w:type="dxa" w:w="90"/>
+            </w:tcMar>
+          </w:tcPr>
+          <w:p>
+            <w:pPr>
+              <w:spacing w:after="0"/>
+            </w:pPr>
+            <w:r>
+              <w:rPr>
+                <w:rFonts w:ascii="Arial" w:cs="Arial" w:eastAsia="Arial" w:hAnsi="Arial"/>
+                <w:sz w:val="16"/>
+                <w:szCs w:val="16"/>
+              </w:rPr>
+              <w:t xml:space="preserve">I can change my choice of words to be appropriate for spoken and written texts</w:t>
+            </w:r>
+          </w:p>
+        </w:tc>
+        <w:tc>
+          <w:tcPr>
+            <w:tcW w:type="dxa" w:w="2479"/>
+            <w:tcMar>
+              <w:top w:type="dxa" w:w="60"/>
+              <w:left w:type="dxa" w:w="90"/>
+              <w:bottom w:type="dxa" w:w="60"/>
+              <w:right w:type="dxa" w:w="90"/>
+            </w:tcMar>
+          </w:tcPr>
+          <w:p>
+            <w:pPr>
+              <w:spacing w:after="0"/>
+            </w:pPr>
+            <w:r>
+              <w:rPr>
+                <w:rFonts w:ascii="Arial" w:cs="Arial" w:eastAsia="Arial" w:hAnsi="Arial"/>
+                <w:sz w:val="16"/>
+                <w:szCs w:val="16"/>
+              </w:rPr>
+              <w:t xml:space="preserve">I can change my word choice to alter the tone of written and spoken texts</w:t>
+            </w:r>
+          </w:p>
+        </w:tc>
+        <w:tc>
+          <w:tcPr>
+            <w:tcW w:type="dxa" w:w="2479"/>
+            <w:tcMar>
+              <w:top w:type="dxa" w:w="60"/>
+              <w:left w:type="dxa" w:w="90"/>
+              <w:bottom w:type="dxa" w:w="60"/>
+              <w:right w:type="dxa" w:w="90"/>
+            </w:tcMar>
+          </w:tcPr>
+          <w:p>
+            <w:pPr>
+              <w:spacing w:after="0"/>
+            </w:pPr>
+            <w:r>
+              <w:rPr>
+                <w:rFonts w:ascii="Arial" w:cs="Arial" w:eastAsia="Arial" w:hAnsi="Arial"/>
+                <w:sz w:val="16"/>
+                <w:szCs w:val="16"/>
+              </w:rPr>
+              <w:t xml:space="preserve">I can write using a formal register</w:t>
+            </w:r>
+          </w:p>
+        </w:tc>
+      </w:tr>
+      <w:tr>
+        <w:tc>
+          <w:tcPr>
+            <w:tcW w:type="dxa" w:w="3000"/>
+            <w:tcMar>
+              <w:top w:type="dxa" w:w="60"/>
+              <w:left w:type="dxa" w:w="90"/>
+              <w:bottom w:type="dxa" w:w="60"/>
+              <w:right w:type="dxa" w:w="90"/>
+            </w:tcMar>
+          </w:tcPr>
+          <w:p>
+            <w:pPr>
+              <w:spacing w:after="0"/>
+            </w:pPr>
+            <w:r>
+              <w:rPr>
+                <w:rFonts w:ascii="Arial" w:cs="Arial" w:eastAsia="Arial" w:hAnsi="Arial"/>
+                <w:b/>
+                <w:bCs/>
                 <w:sz w:val="17"/>
                 <w:szCs w:val="17"/>
               </w:rPr>
-              <w:t xml:space="preserve">Some persistent errors, and expression was informal in places.</w:t>
-            </w:r>
-          </w:p>
-        </w:tc>
-        <w:tc>
-          <w:tcPr>
-            <w:tcW w:type="dxa" w:w="2399"/>
+              <w:t xml:space="preserve">Spelling and punctuation</w:t>
+            </w:r>
+          </w:p>
+          <w:p>
+            <w:pPr>
+              <w:spacing w:after="0"/>
+            </w:pPr>
+            <w:r>
+              <w:rPr>
+                <w:rFonts w:ascii="Arial" w:cs="Arial" w:eastAsia="Arial" w:hAnsi="Arial"/>
+                <w:color w:val="595959"/>
+                <w:sz w:val="15"/>
+                <w:szCs w:val="15"/>
+              </w:rPr>
+              <w:t xml:space="preserve">control of the writing</w:t>
+            </w:r>
+          </w:p>
+          <w:p>
+            <w:pPr>
+              <w:spacing w:after="0"/>
+            </w:pPr>
+            <w:r>
+              <w:rPr>
+                <w:rFonts w:ascii="Arial" w:cs="Arial" w:eastAsia="Arial" w:hAnsi="Arial"/>
+                <w:color w:val="808080"/>
+                <w:sz w:val="14"/>
+                <w:szCs w:val="14"/>
+              </w:rPr>
+              <w:t xml:space="preserve">Writing</w:t>
+            </w:r>
+          </w:p>
+        </w:tc>
+        <w:tc>
+          <w:tcPr>
+            <w:tcW w:type="dxa" w:w="2479"/>
+            <w:tcMar>
+              <w:top w:type="dxa" w:w="60"/>
+              <w:left w:type="dxa" w:w="90"/>
+              <w:bottom w:type="dxa" w:w="60"/>
+              <w:right w:type="dxa" w:w="90"/>
+            </w:tcMar>
+          </w:tcPr>
+          <w:p>
+            <w:pPr>
+              <w:spacing w:after="0"/>
+            </w:pPr>
+            <w:r>
+              <w:rPr>
+                <w:rFonts w:ascii="Arial" w:cs="Arial" w:eastAsia="Arial" w:hAnsi="Arial"/>
+                <w:sz w:val="16"/>
+                <w:szCs w:val="16"/>
+              </w:rPr>
+              <w:t xml:space="preserve">I can correctly spell common homophones. I can use apostrophes to show possession</w:t>
+            </w:r>
+          </w:p>
+        </w:tc>
+        <w:tc>
+          <w:tcPr>
+            <w:tcW w:type="dxa" w:w="2479"/>
+            <w:tcMar>
+              <w:top w:type="dxa" w:w="60"/>
+              <w:left w:type="dxa" w:w="90"/>
+              <w:bottom w:type="dxa" w:w="60"/>
+              <w:right w:type="dxa" w:w="90"/>
+            </w:tcMar>
+          </w:tcPr>
+          <w:p>
+            <w:pPr>
+              <w:spacing w:after="0"/>
+            </w:pPr>
+            <w:r>
+              <w:rPr>
+                <w:rFonts w:ascii="Arial" w:cs="Arial" w:eastAsia="Arial" w:hAnsi="Arial"/>
+                <w:sz w:val="16"/>
+                <w:szCs w:val="16"/>
+              </w:rPr>
+              <w:t xml:space="preserve">I can use common prefixes, suffixes and base words to spell new words. I can correctly use commas and full stops between clauses</w:t>
+            </w:r>
+          </w:p>
+        </w:tc>
+        <w:tc>
+          <w:tcPr>
+            <w:tcW w:type="dxa" w:w="2479"/>
             <w:shd w:fill="F2F2F2" w:color="auto" w:val="clear"/>
             <w:tcMar>
               <w:top w:type="dxa" w:w="60"/>
@@ -2107,58 +2596,58 @@
             <w:r>
               <w:rPr>
                 <w:rFonts w:ascii="Arial" w:cs="Arial" w:eastAsia="Arial" w:hAnsi="Arial"/>
-                <w:sz w:val="17"/>
-                <w:szCs w:val="17"/>
-              </w:rPr>
-              <w:t xml:space="preserve">Wrote in a formal register, with mostly correct grammar, spelling and punctuation.</w:t>
-            </w:r>
-          </w:p>
-        </w:tc>
-        <w:tc>
-          <w:tcPr>
-            <w:tcW w:type="dxa" w:w="2399"/>
-            <w:tcMar>
-              <w:top w:type="dxa" w:w="60"/>
-              <w:left w:type="dxa" w:w="90"/>
-              <w:bottom w:type="dxa" w:w="60"/>
-              <w:right w:type="dxa" w:w="90"/>
-            </w:tcMar>
-          </w:tcPr>
-          <w:p>
-            <w:pPr>
-              <w:spacing w:after="0"/>
-            </w:pPr>
-            <w:r>
-              <w:rPr>
-                <w:rFonts w:ascii="Arial" w:cs="Arial" w:eastAsia="Arial" w:hAnsi="Arial"/>
-                <w:sz w:val="17"/>
-                <w:szCs w:val="17"/>
-              </w:rPr>
-              <w:t xml:space="preserve">Wrote fluently and formally, varying sentence length to keep the writing clear.</w:t>
-            </w:r>
-          </w:p>
-        </w:tc>
-        <w:tc>
-          <w:tcPr>
-            <w:tcW w:type="dxa" w:w="2399"/>
-            <w:tcMar>
-              <w:top w:type="dxa" w:w="60"/>
-              <w:left w:type="dxa" w:w="90"/>
-              <w:bottom w:type="dxa" w:w="60"/>
-              <w:right w:type="dxa" w:w="90"/>
-            </w:tcMar>
-          </w:tcPr>
-          <w:p>
-            <w:pPr>
-              <w:spacing w:after="0"/>
-            </w:pPr>
-            <w:r>
-              <w:rPr>
-                <w:rFonts w:ascii="Arial" w:cs="Arial" w:eastAsia="Arial" w:hAnsi="Arial"/>
-                <w:sz w:val="17"/>
-                <w:szCs w:val="17"/>
-              </w:rPr>
-              <w:t xml:space="preserve">Wrote with control and style; word choice was precise and the register was consistently formal.</w:t>
+                <w:sz w:val="16"/>
+                <w:szCs w:val="16"/>
+              </w:rPr>
+              <w:t xml:space="preserve">I can use spelling rules and word origins to spell new words. I can correctly punctuate complex sentences and circumstantial phrases</w:t>
+            </w:r>
+          </w:p>
+        </w:tc>
+        <w:tc>
+          <w:tcPr>
+            <w:tcW w:type="dxa" w:w="2479"/>
+            <w:tcMar>
+              <w:top w:type="dxa" w:w="60"/>
+              <w:left w:type="dxa" w:w="90"/>
+              <w:bottom w:type="dxa" w:w="60"/>
+              <w:right w:type="dxa" w:w="90"/>
+            </w:tcMar>
+          </w:tcPr>
+          <w:p>
+            <w:pPr>
+              <w:spacing w:after="0"/>
+            </w:pPr>
+            <w:r>
+              <w:rPr>
+                <w:rFonts w:ascii="Arial" w:cs="Arial" w:eastAsia="Arial" w:hAnsi="Arial"/>
+                <w:sz w:val="16"/>
+                <w:szCs w:val="16"/>
+              </w:rPr>
+              <w:t xml:space="preserve">I can remember and use the correct spelling of new subject-related words. I can use colons, semicolons, dashes and brackets in my writing</w:t>
+            </w:r>
+          </w:p>
+        </w:tc>
+        <w:tc>
+          <w:tcPr>
+            <w:tcW w:type="dxa" w:w="2479"/>
+            <w:tcMar>
+              <w:top w:type="dxa" w:w="60"/>
+              <w:left w:type="dxa" w:w="90"/>
+              <w:bottom w:type="dxa" w:w="60"/>
+              <w:right w:type="dxa" w:w="90"/>
+            </w:tcMar>
+          </w:tcPr>
+          <w:p>
+            <w:pPr>
+              <w:spacing w:after="0"/>
+            </w:pPr>
+            <w:r>
+              <w:rPr>
+                <w:rFonts w:ascii="Arial" w:cs="Arial" w:eastAsia="Arial" w:hAnsi="Arial"/>
+                <w:sz w:val="16"/>
+                <w:szCs w:val="16"/>
+              </w:rPr>
+              <w:t xml:space="preserve">I can develop precise and persuasive texts with accurate spelling. I can use punctuation, layout and font for different audience and purpose</w:t>
             </w:r>
           </w:p>
         </w:tc>
@@ -2166,7 +2655,31 @@
     </w:tbl>
     <w:p>
       <w:pPr>
-        <w:spacing w:before="200"/>
+        <w:spacing w:before="140"/>
+      </w:pPr>
+      <w:r>
+        <w:rPr>
+          <w:rFonts w:ascii="Arial" w:cs="Arial" w:eastAsia="Arial" w:hAnsi="Arial"/>
+          <w:sz w:val="18"/>
+          <w:szCs w:val="18"/>
+        </w:rPr>
+        <w:t xml:space="preserve">Mark each row at the level the writing shows. The grade is the average across the rows, which is where the half levels come from. </w:t>
+      </w:r>
+      <w:r>
+        <w:rPr>
+          <w:rFonts w:ascii="Arial" w:cs="Arial" w:eastAsia="Arial" w:hAnsi="Arial"/>
+          <w:i/>
+          <w:iCs/>
+          <w:color w:val="595959"/>
+          <w:sz w:val="18"/>
+          <w:szCs w:val="18"/>
+        </w:rPr>
+        <w:t xml:space="preserve">Wording quoted from the Learning Continuum master sheet, English tab.</w:t>
+      </w:r>
+    </w:p>
+    <w:p>
+      <w:pPr>
+        <w:spacing w:before="160"/>
       </w:pPr>
       <w:r>
         <w:rPr>
@@ -2342,7 +2855,7 @@
           <w:sz w:val="24"/>
           <w:szCs w:val="24"/>
         </w:rPr>
-        <w:t xml:space="preserve">The At the Standard column is the school’s Learning Continuum, English tab, at Level 7: explain how the structure and language used in a text helps influence the audience; explain the relevance of a quote; use examples from the text to discuss how language helps to create character.</w:t>
+        <w:t xml:space="preserve">Every row is a substrand of the Learning Continuum master sheet, English tab, and every cell is its wording, unaltered, at that level. Six of the seven rows are what the analytical writing wall already teaches; Text structure and organisation is the row the wall does not cover, because the wall is a ladder of sentences and this task asks for a paragraph.</w:t>
       </w:r>
     </w:p>
     <w:p>

</xml_diff>

<commit_message>
Folio booklets on the TEEL sheet's layout; EAL rubric is the ELC one
The booklets now use the same frames, bars and colours as the TEEL
sheets: the prompt, the worked paragraph to colour, an introduction
carrying the first idea, frames for the paragraphs, a conclusion, then
the self assessment. The third paragraph and the third piece of
evidence in each are marked for whoever gets there.

The EAL rubric is the ELC analytical writing rubric as it stands — Ideas
& Themes, Evidence & Metalanguage, Language & Structure, Purpose &
Interpretation across C2 to VCE 1 — instead of the thinner reading rows
I had built, and no C band is tied to a year level. The continuum rubric
shows levels only: no emerging, at or above the standard. Neither task
sheet prints the prompts.

Co-Authored-By: Claude Opus 5 <noreply@anthropic.com>
Claude-Session: https://claude.ai/code/session_01TX2KYiJGekMNoBBPASQh6e
</commit_message>
<xml_diff>
--- a/BoneSparrow-assessment-folio.docx
+++ b/BoneSparrow-assessment-folio.docx
@@ -129,7 +129,7 @@
           <w:sz w:val="24"/>
           <w:szCs w:val="24"/>
         </w:rPr>
-        <w:t xml:space="preserve">You will write three folio pieces about The Bone Sparrow, one for each prompt below. Each one is written in class in 30 minutes. In each booklet the introduction has the first idea written in and the first paragraph is written out for you; you write the second and third paragraphs.</w:t>
+        <w:t xml:space="preserve">You will write three folio pieces about The Bone Sparrow. Each one is written in class in 30 minutes, and each one has its own prompt, which you are given at the start of the sitting. In each booklet the introduction has the first idea written in and the first paragraph is written out for you; you write the second paragraph, and the third if you can.</w:t>
       </w:r>
     </w:p>
     <w:p>
@@ -575,122 +575,6 @@
       </w:pPr>
       <w:r>
         <w:br w:type="page"/>
-      </w:r>
-    </w:p>
-    <w:p>
-      <w:pPr>
-        <w:spacing w:after="80"/>
-      </w:pPr>
-      <w:r>
-        <w:rPr>
-          <w:rFonts w:ascii="Arial" w:cs="Arial" w:eastAsia="Arial" w:hAnsi="Arial"/>
-          <w:b/>
-          <w:bCs/>
-          <w:sz w:val="32"/>
-          <w:szCs w:val="32"/>
-        </w:rPr>
-        <w:t xml:space="preserve">The three tasks</w:t>
-      </w:r>
-    </w:p>
-    <w:p>
-      <w:pPr>
-        <w:spacing w:after="200"/>
-      </w:pPr>
-      <w:r>
-        <w:rPr>
-          <w:rFonts w:ascii="Arial" w:cs="Arial" w:eastAsia="Arial" w:hAnsi="Arial"/>
-          <w:color w:val="595959"/>
-          <w:sz w:val="24"/>
-          <w:szCs w:val="24"/>
-        </w:rPr>
-        <w:t xml:space="preserve">All three go in the folio. Your teacher marks the one you nominate on the cover of the folio.</w:t>
-      </w:r>
-    </w:p>
-    <w:p>
-      <w:pPr>
-        <w:spacing w:after="40"/>
-      </w:pPr>
-      <w:r>
-        <w:rPr>
-          <w:rFonts w:ascii="Arial" w:cs="Arial" w:eastAsia="Arial" w:hAnsi="Arial"/>
-          <w:b/>
-          <w:bCs/>
-          <w:color w:val="595959"/>
-          <w:sz w:val="24"/>
-          <w:szCs w:val="24"/>
-        </w:rPr>
-        <w:t xml:space="preserve">Task 1</w:t>
-      </w:r>
-    </w:p>
-    <w:p>
-      <w:pPr>
-        <w:spacing w:after="220"/>
-      </w:pPr>
-      <w:r>
-        <w:rPr>
-          <w:rFonts w:ascii="Arial" w:cs="Arial" w:eastAsia="Arial" w:hAnsi="Arial"/>
-          <w:sz w:val="25"/>
-          <w:szCs w:val="25"/>
-        </w:rPr>
-        <w:t xml:space="preserve">‘But reading is important.’ (p39) Discuss how stories and imagination are important for characters in The Bone Sparrow.</w:t>
-      </w:r>
-    </w:p>
-    <w:p>
-      <w:pPr>
-        <w:spacing w:after="40"/>
-      </w:pPr>
-      <w:r>
-        <w:rPr>
-          <w:rFonts w:ascii="Arial" w:cs="Arial" w:eastAsia="Arial" w:hAnsi="Arial"/>
-          <w:b/>
-          <w:bCs/>
-          <w:color w:val="595959"/>
-          <w:sz w:val="24"/>
-          <w:szCs w:val="24"/>
-        </w:rPr>
-        <w:t xml:space="preserve">Task 2</w:t>
-      </w:r>
-    </w:p>
-    <w:p>
-      <w:pPr>
-        <w:spacing w:after="220"/>
-      </w:pPr>
-      <w:r>
-        <w:rPr>
-          <w:rFonts w:ascii="Arial" w:cs="Arial" w:eastAsia="Arial" w:hAnsi="Arial"/>
-          <w:sz w:val="25"/>
-          <w:szCs w:val="25"/>
-        </w:rPr>
-        <w:t xml:space="preserve">‘Soon they’ll see that living in here isn’t living at all. We just need to show them who we are, that we’re people, and then they’ll remember.’ (p108) Discuss the living conditions for characters inside and outside the centre.</w:t>
-      </w:r>
-    </w:p>
-    <w:p>
-      <w:pPr>
-        <w:spacing w:after="40"/>
-      </w:pPr>
-      <w:r>
-        <w:rPr>
-          <w:rFonts w:ascii="Arial" w:cs="Arial" w:eastAsia="Arial" w:hAnsi="Arial"/>
-          <w:b/>
-          <w:bCs/>
-          <w:color w:val="595959"/>
-          <w:sz w:val="24"/>
-          <w:szCs w:val="24"/>
-        </w:rPr>
-        <w:t xml:space="preserve">Task 3</w:t>
-      </w:r>
-    </w:p>
-    <w:p>
-      <w:pPr>
-        <w:spacing w:after="220"/>
-      </w:pPr>
-      <w:r>
-        <w:rPr>
-          <w:rFonts w:ascii="Arial" w:cs="Arial" w:eastAsia="Arial" w:hAnsi="Arial"/>
-          <w:sz w:val="25"/>
-          <w:szCs w:val="25"/>
-        </w:rPr>
-        <w:t xml:space="preserve">The Bone Sparrow explores themes of family and friendship. Discuss.</w:t>
       </w:r>
     </w:p>
     <w:p>
@@ -869,7 +753,7 @@
                 <w:sz w:val="24"/>
                 <w:szCs w:val="24"/>
               </w:rPr>
-              <w:t xml:space="preserve">1 · stories and imagination</w:t>
+              <w:t xml:space="preserve">Task 1</w:t>
             </w:r>
           </w:p>
         </w:tc>
@@ -946,7 +830,7 @@
                 <w:sz w:val="24"/>
                 <w:szCs w:val="24"/>
               </w:rPr>
-              <w:t xml:space="preserve">2 · life inside and outside</w:t>
+              <w:t xml:space="preserve">Task 2</w:t>
             </w:r>
           </w:p>
         </w:tc>
@@ -1023,7 +907,7 @@
                 <w:sz w:val="24"/>
                 <w:szCs w:val="24"/>
               </w:rPr>
-              <w:t xml:space="preserve">3 · family and friendship</w:t>
+              <w:t xml:space="preserve">Task 3</w:t>
             </w:r>
           </w:p>
         </w:tc>
@@ -1254,20 +1138,6 @@
               <w:t xml:space="preserve">Level 5</w:t>
             </w:r>
           </w:p>
-          <w:p>
-            <w:pPr>
-              <w:spacing w:after="0"/>
-            </w:pPr>
-            <w:r>
-              <w:rPr>
-                <w:rFonts w:ascii="Arial" w:cs="Arial" w:eastAsia="Arial" w:hAnsi="Arial"/>
-                <w:color w:val="595959"/>
-                <w:sz w:val="15"/>
-                <w:szCs w:val="15"/>
-              </w:rPr>
-              <w:t xml:space="preserve">Emerging</w:t>
-            </w:r>
-          </w:p>
         </w:tc>
         <w:tc>
           <w:tcPr>
@@ -1295,20 +1165,6 @@
               <w:t xml:space="preserve">Level 6</w:t>
             </w:r>
           </w:p>
-          <w:p>
-            <w:pPr>
-              <w:spacing w:after="0"/>
-            </w:pPr>
-            <w:r>
-              <w:rPr>
-                <w:rFonts w:ascii="Arial" w:cs="Arial" w:eastAsia="Arial" w:hAnsi="Arial"/>
-                <w:color w:val="595959"/>
-                <w:sz w:val="15"/>
-                <w:szCs w:val="15"/>
-              </w:rPr>
-              <w:t xml:space="preserve">Working towards</w:t>
-            </w:r>
-          </w:p>
         </w:tc>
         <w:tc>
           <w:tcPr>
@@ -1333,21 +1189,7 @@
                 <w:sz w:val="18"/>
                 <w:szCs w:val="18"/>
               </w:rPr>
-              <w:t xml:space="preserve">Level 7 · expected at Year 7</w:t>
-            </w:r>
-          </w:p>
-          <w:p>
-            <w:pPr>
-              <w:spacing w:after="0"/>
-            </w:pPr>
-            <w:r>
-              <w:rPr>
-                <w:rFonts w:ascii="Arial" w:cs="Arial" w:eastAsia="Arial" w:hAnsi="Arial"/>
-                <w:color w:val="595959"/>
-                <w:sz w:val="15"/>
-                <w:szCs w:val="15"/>
-              </w:rPr>
-              <w:t xml:space="preserve">At the standard</w:t>
+              <w:t xml:space="preserve">Level 7</w:t>
             </w:r>
           </w:p>
         </w:tc>
@@ -1377,20 +1219,6 @@
               <w:t xml:space="preserve">Level 8</w:t>
             </w:r>
           </w:p>
-          <w:p>
-            <w:pPr>
-              <w:spacing w:after="0"/>
-            </w:pPr>
-            <w:r>
-              <w:rPr>
-                <w:rFonts w:ascii="Arial" w:cs="Arial" w:eastAsia="Arial" w:hAnsi="Arial"/>
-                <w:color w:val="595959"/>
-                <w:sz w:val="15"/>
-                <w:szCs w:val="15"/>
-              </w:rPr>
-              <w:t xml:space="preserve">Above</w:t>
-            </w:r>
-          </w:p>
         </w:tc>
         <w:tc>
           <w:tcPr>
@@ -1416,20 +1244,6 @@
                 <w:szCs w:val="18"/>
               </w:rPr>
               <w:t xml:space="preserve">Level 9</w:t>
-            </w:r>
-          </w:p>
-          <w:p>
-            <w:pPr>
-              <w:spacing w:after="0"/>
-            </w:pPr>
-            <w:r>
-              <w:rPr>
-                <w:rFonts w:ascii="Arial" w:cs="Arial" w:eastAsia="Arial" w:hAnsi="Arial"/>
-                <w:color w:val="595959"/>
-                <w:sz w:val="15"/>
-                <w:szCs w:val="15"/>
-              </w:rPr>
-              <w:t xml:space="preserve">Well above</w:t>
             </w:r>
           </w:p>
         </w:tc>
@@ -2500,7 +2314,7 @@
                 <w:sz w:val="18"/>
                 <w:szCs w:val="18"/>
               </w:rPr>
-              <w:t xml:space="preserve">Criteria</w:t>
+              <w:t xml:space="preserve"/>
             </w:r>
           </w:p>
         </w:tc>
@@ -2530,25 +2344,11 @@
               <w:t xml:space="preserve">C2</w:t>
             </w:r>
           </w:p>
-          <w:p>
-            <w:pPr>
-              <w:spacing w:after="0"/>
-            </w:pPr>
-            <w:r>
-              <w:rPr>
-                <w:rFonts w:ascii="Arial" w:cs="Arial" w:eastAsia="Arial" w:hAnsi="Arial"/>
-                <w:color w:val="595959"/>
-                <w:sz w:val="15"/>
-                <w:szCs w:val="15"/>
-              </w:rPr>
-              <w:t xml:space="preserve">Describe</w:t>
-            </w:r>
-          </w:p>
         </w:tc>
         <w:tc>
           <w:tcPr>
             <w:tcW w:type="dxa" w:w="3099"/>
-            <w:shd w:fill="E7E6E6" w:color="auto" w:val="clear"/>
+            <w:shd w:fill="D9D9D9" w:color="auto" w:val="clear"/>
             <w:tcMar>
               <w:top w:type="dxa" w:w="70"/>
               <w:left w:type="dxa" w:w="90"/>
@@ -2568,21 +2368,7 @@
                 <w:sz w:val="18"/>
                 <w:szCs w:val="18"/>
               </w:rPr>
-              <w:t xml:space="preserve">C3 · expected at Year 7</w:t>
-            </w:r>
-          </w:p>
-          <w:p>
-            <w:pPr>
-              <w:spacing w:after="0"/>
-            </w:pPr>
-            <w:r>
-              <w:rPr>
-                <w:rFonts w:ascii="Arial" w:cs="Arial" w:eastAsia="Arial" w:hAnsi="Arial"/>
-                <w:color w:val="595959"/>
-                <w:sz w:val="15"/>
-                <w:szCs w:val="15"/>
-              </w:rPr>
-              <w:t xml:space="preserve">Explain</w:t>
+              <w:t xml:space="preserve">C3</w:t>
             </w:r>
           </w:p>
         </w:tc>
@@ -2612,20 +2398,6 @@
               <w:t xml:space="preserve">C4</w:t>
             </w:r>
           </w:p>
-          <w:p>
-            <w:pPr>
-              <w:spacing w:after="0"/>
-            </w:pPr>
-            <w:r>
-              <w:rPr>
-                <w:rFonts w:ascii="Arial" w:cs="Arial" w:eastAsia="Arial" w:hAnsi="Arial"/>
-                <w:color w:val="595959"/>
-                <w:sz w:val="15"/>
-                <w:szCs w:val="15"/>
-              </w:rPr>
-              <w:t xml:space="preserve">Analyse</w:t>
-            </w:r>
-          </w:p>
         </w:tc>
         <w:tc>
           <w:tcPr>
@@ -2653,20 +2425,6 @@
               <w:t xml:space="preserve">VCE 1</w:t>
             </w:r>
           </w:p>
-          <w:p>
-            <w:pPr>
-              <w:spacing w:after="0"/>
-            </w:pPr>
-            <w:r>
-              <w:rPr>
-                <w:rFonts w:ascii="Arial" w:cs="Arial" w:eastAsia="Arial" w:hAnsi="Arial"/>
-                <w:color w:val="595959"/>
-                <w:sz w:val="15"/>
-                <w:szCs w:val="15"/>
-              </w:rPr>
-              <w:t xml:space="preserve">Interpret</w:t>
-            </w:r>
-          </w:p>
         </w:tc>
       </w:tr>
       <w:tr>
@@ -2692,35 +2450,7 @@
                 <w:sz w:val="18"/>
                 <w:szCs w:val="18"/>
               </w:rPr>
-              <w:t xml:space="preserve">Skill focus</w:t>
-            </w:r>
-          </w:p>
-          <w:p>
-            <w:pPr>
-              <w:spacing w:after="0"/>
-            </w:pPr>
-            <w:r>
-              <w:rPr>
-                <w:rFonts w:ascii="Arial" w:cs="Arial" w:eastAsia="Arial" w:hAnsi="Arial"/>
-                <w:color w:val="595959"/>
-                <w:sz w:val="16"/>
-                <w:szCs w:val="16"/>
-              </w:rPr>
-              <w:t xml:space="preserve">what the writing is doing</w:t>
-            </w:r>
-          </w:p>
-          <w:p>
-            <w:pPr>
-              <w:spacing w:after="0"/>
-            </w:pPr>
-            <w:r>
-              <w:rPr>
-                <w:rFonts w:ascii="Arial" w:cs="Arial" w:eastAsia="Arial" w:hAnsi="Arial"/>
-                <w:color w:val="808080"/>
-                <w:sz w:val="14"/>
-                <w:szCs w:val="14"/>
-              </w:rPr>
-              <w:t xml:space="preserve">EAL analytical writing WAGOLL</w:t>
+              <w:t xml:space="preserve">Ideas &amp; Themes</w:t>
             </w:r>
           </w:p>
         </w:tc>
@@ -2744,32 +2474,31 @@
                 <w:sz w:val="17"/>
                 <w:szCs w:val="17"/>
               </w:rPr>
-              <w:t xml:space="preserve">Say what happens</w:t>
+              <w:t xml:space="preserve">Recognises what happens in the text or scene. Retells key details with little interpretation.</w:t>
             </w:r>
           </w:p>
         </w:tc>
         <w:tc>
           <w:tcPr>
             <w:tcW w:type="dxa" w:w="3099"/>
-            <w:shd w:fill="F2F2F2" w:color="auto" w:val="clear"/>
-            <w:tcMar>
-              <w:top w:type="dxa" w:w="70"/>
-              <w:left w:type="dxa" w:w="90"/>
-              <w:bottom w:type="dxa" w:w="70"/>
-              <w:right w:type="dxa" w:w="90"/>
-            </w:tcMar>
-          </w:tcPr>
-          <w:p>
-            <w:pPr>
-              <w:spacing w:after="0"/>
-            </w:pPr>
-            <w:r>
-              <w:rPr>
-                <w:rFonts w:ascii="Arial" w:cs="Arial" w:eastAsia="Arial" w:hAnsi="Arial"/>
-                <w:sz w:val="17"/>
-                <w:szCs w:val="17"/>
-              </w:rPr>
-              <w:t xml:space="preserve">Explain effect or meaning</w:t>
+            <w:tcMar>
+              <w:top w:type="dxa" w:w="70"/>
+              <w:left w:type="dxa" w:w="90"/>
+              <w:bottom w:type="dxa" w:w="70"/>
+              <w:right w:type="dxa" w:w="90"/>
+            </w:tcMar>
+          </w:tcPr>
+          <w:p>
+            <w:pPr>
+              <w:spacing w:after="0"/>
+            </w:pPr>
+            <w:r>
+              <w:rPr>
+                <w:rFonts w:ascii="Arial" w:cs="Arial" w:eastAsia="Arial" w:hAnsi="Arial"/>
+                <w:sz w:val="17"/>
+                <w:szCs w:val="17"/>
+              </w:rPr>
+              <w:t xml:space="preserve">Explains basic feelings or ideas suggested by the text. Begins linking choices to simple themes.</w:t>
             </w:r>
           </w:p>
         </w:tc>
@@ -2793,7 +2522,7 @@
                 <w:sz w:val="17"/>
                 <w:szCs w:val="17"/>
               </w:rPr>
-              <w:t xml:space="preserve">Link language choices to ideas or themes</w:t>
+              <w:t xml:space="preserve">Connects specific language or film techniques to themes or concepts. Explains what the creator might be saying.</w:t>
             </w:r>
           </w:p>
         </w:tc>
@@ -2817,7 +2546,7 @@
                 <w:sz w:val="17"/>
                 <w:szCs w:val="17"/>
               </w:rPr>
-              <w:t xml:space="preserve">Link literary, structural and stylistic features, to messages, values, and creator’s intents</w:t>
+              <w:t xml:space="preserve">Analyses how choices express messages, values, or perspectives. Analyses the creator’s purpose in representing social or cultural issues.</w:t>
             </w:r>
           </w:p>
         </w:tc>
@@ -2845,35 +2574,7 @@
                 <w:sz w:val="18"/>
                 <w:szCs w:val="18"/>
               </w:rPr>
-              <w:t xml:space="preserve">Summary</w:t>
-            </w:r>
-          </w:p>
-          <w:p>
-            <w:pPr>
-              <w:spacing w:after="0"/>
-            </w:pPr>
-            <w:r>
-              <w:rPr>
-                <w:rFonts w:ascii="Arial" w:cs="Arial" w:eastAsia="Arial" w:hAnsi="Arial"/>
-                <w:color w:val="595959"/>
-                <w:sz w:val="16"/>
-                <w:szCs w:val="16"/>
-              </w:rPr>
-              <w:t xml:space="preserve">the ideas in the novel</w:t>
-            </w:r>
-          </w:p>
-          <w:p>
-            <w:pPr>
-              <w:spacing w:after="0"/>
-            </w:pPr>
-            <w:r>
-              <w:rPr>
-                <w:rFonts w:ascii="Arial" w:cs="Arial" w:eastAsia="Arial" w:hAnsi="Arial"/>
-                <w:color w:val="808080"/>
-                <w:sz w:val="14"/>
-                <w:szCs w:val="14"/>
-              </w:rPr>
-              <w:t xml:space="preserve">EAL reading rubric</w:t>
+              <w:t xml:space="preserve">Evidence &amp; Metalanguage</w:t>
             </w:r>
           </w:p>
         </w:tc>
@@ -2897,32 +2598,31 @@
                 <w:sz w:val="17"/>
                 <w:szCs w:val="17"/>
               </w:rPr>
-              <w:t xml:space="preserve">Extract main ideas from texts</w:t>
+              <w:t xml:space="preserve">Gives a simple quote or description from the text or scene.</w:t>
             </w:r>
           </w:p>
         </w:tc>
         <w:tc>
           <w:tcPr>
             <w:tcW w:type="dxa" w:w="3099"/>
-            <w:shd w:fill="F2F2F2" w:color="auto" w:val="clear"/>
-            <w:tcMar>
-              <w:top w:type="dxa" w:w="70"/>
-              <w:left w:type="dxa" w:w="90"/>
-              <w:bottom w:type="dxa" w:w="70"/>
-              <w:right w:type="dxa" w:w="90"/>
-            </w:tcMar>
-          </w:tcPr>
-          <w:p>
-            <w:pPr>
-              <w:spacing w:after="0"/>
-            </w:pPr>
-            <w:r>
-              <w:rPr>
-                <w:rFonts w:ascii="Arial" w:cs="Arial" w:eastAsia="Arial" w:hAnsi="Arial"/>
-                <w:sz w:val="17"/>
-                <w:szCs w:val="17"/>
-              </w:rPr>
-              <w:t xml:space="preserve">Explain main ideas and plot developments</w:t>
+            <w:tcMar>
+              <w:top w:type="dxa" w:w="70"/>
+              <w:left w:type="dxa" w:w="90"/>
+              <w:bottom w:type="dxa" w:w="70"/>
+              <w:right w:type="dxa" w:w="90"/>
+            </w:tcMar>
+          </w:tcPr>
+          <w:p>
+            <w:pPr>
+              <w:spacing w:after="0"/>
+            </w:pPr>
+            <w:r>
+              <w:rPr>
+                <w:rFonts w:ascii="Arial" w:cs="Arial" w:eastAsia="Arial" w:hAnsi="Arial"/>
+                <w:sz w:val="17"/>
+                <w:szCs w:val="17"/>
+              </w:rPr>
+              <w:t xml:space="preserve">Names a language or film feature and begins linking it to meaning.</w:t>
             </w:r>
           </w:p>
         </w:tc>
@@ -2946,7 +2646,7 @@
                 <w:sz w:val="17"/>
                 <w:szCs w:val="17"/>
               </w:rPr>
-              <w:t xml:space="preserve">Use appropriate language to identify and infer ideas, themes, and plot details</w:t>
+              <w:t xml:space="preserve">Uses terminology accurately with short, embedded evidence.</w:t>
             </w:r>
           </w:p>
         </w:tc>
@@ -2970,7 +2670,7 @@
                 <w:sz w:val="17"/>
                 <w:szCs w:val="17"/>
               </w:rPr>
-              <w:t xml:space="preserve">Uses precise and appropriate language to explore interconnected ideas and values presented in the text, including discussion of character, setting and other aspects of the text</w:t>
+              <w:t xml:space="preserve">Integrates evidence and metalanguage fluently to build interpretation.</w:t>
             </w:r>
           </w:p>
         </w:tc>
@@ -2998,35 +2698,7 @@
                 <w:sz w:val="18"/>
                 <w:szCs w:val="18"/>
               </w:rPr>
-              <w:t xml:space="preserve">Evidence</w:t>
-            </w:r>
-          </w:p>
-          <w:p>
-            <w:pPr>
-              <w:spacing w:after="0"/>
-            </w:pPr>
-            <w:r>
-              <w:rPr>
-                <w:rFonts w:ascii="Arial" w:cs="Arial" w:eastAsia="Arial" w:hAnsi="Arial"/>
-                <w:color w:val="595959"/>
-                <w:sz w:val="16"/>
-                <w:szCs w:val="16"/>
-              </w:rPr>
-              <w:t xml:space="preserve">the quote, and what it is doing there</w:t>
-            </w:r>
-          </w:p>
-          <w:p>
-            <w:pPr>
-              <w:spacing w:after="0"/>
-            </w:pPr>
-            <w:r>
-              <w:rPr>
-                <w:rFonts w:ascii="Arial" w:cs="Arial" w:eastAsia="Arial" w:hAnsi="Arial"/>
-                <w:color w:val="808080"/>
-                <w:sz w:val="14"/>
-                <w:szCs w:val="14"/>
-              </w:rPr>
-              <w:t xml:space="preserve">EAL reading rubric</w:t>
+              <w:t xml:space="preserve">Language &amp; Structure</w:t>
             </w:r>
           </w:p>
         </w:tc>
@@ -3050,32 +2722,31 @@
                 <w:sz w:val="17"/>
                 <w:szCs w:val="17"/>
               </w:rPr>
-              <w:t xml:space="preserve">Use quotes to link to ideas</w:t>
+              <w:t xml:space="preserve">Writes short, simple sentences using mostly literal verbs (“shows”, “uses”).</w:t>
             </w:r>
           </w:p>
         </w:tc>
         <w:tc>
           <w:tcPr>
             <w:tcW w:type="dxa" w:w="3099"/>
-            <w:shd w:fill="F2F2F2" w:color="auto" w:val="clear"/>
-            <w:tcMar>
-              <w:top w:type="dxa" w:w="70"/>
-              <w:left w:type="dxa" w:w="90"/>
-              <w:bottom w:type="dxa" w:w="70"/>
-              <w:right w:type="dxa" w:w="90"/>
-            </w:tcMar>
-          </w:tcPr>
-          <w:p>
-            <w:pPr>
-              <w:spacing w:after="0"/>
-            </w:pPr>
-            <w:r>
-              <w:rPr>
-                <w:rFonts w:ascii="Arial" w:cs="Arial" w:eastAsia="Arial" w:hAnsi="Arial"/>
-                <w:sz w:val="17"/>
-                <w:szCs w:val="17"/>
-              </w:rPr>
-              <w:t xml:space="preserve">Use metalanguage, and quotes to support ideas</w:t>
+            <w:tcMar>
+              <w:top w:type="dxa" w:w="70"/>
+              <w:left w:type="dxa" w:w="90"/>
+              <w:bottom w:type="dxa" w:w="70"/>
+              <w:right w:type="dxa" w:w="90"/>
+            </w:tcMar>
+          </w:tcPr>
+          <w:p>
+            <w:pPr>
+              <w:spacing w:after="0"/>
+            </w:pPr>
+            <w:r>
+              <w:rPr>
+                <w:rFonts w:ascii="Arial" w:cs="Arial" w:eastAsia="Arial" w:hAnsi="Arial"/>
+                <w:sz w:val="17"/>
+                <w:szCs w:val="17"/>
+              </w:rPr>
+              <w:t xml:space="preserve">Expands sentences with connectives such as because, so, or to. Uses basic evaluative words.</w:t>
             </w:r>
           </w:p>
         </w:tc>
@@ -3099,7 +2770,7 @@
                 <w:sz w:val="17"/>
                 <w:szCs w:val="17"/>
               </w:rPr>
-              <w:t xml:space="preserve">Embed evidence and use appropriate metalanguage to discuss. Make clear links to themes and ideas</w:t>
+              <w:t xml:space="preserve">Uses more complex sentences and analytical verbs (“suggests”, “highlights”).</w:t>
             </w:r>
           </w:p>
         </w:tc>
@@ -3123,7 +2794,7 @@
                 <w:sz w:val="17"/>
                 <w:szCs w:val="17"/>
               </w:rPr>
-              <w:t xml:space="preserve">Embeds relevant textual evidence to explain how the author has conveyed ideas in the text presented in response to the topic</w:t>
+              <w:t xml:space="preserve">Writes fluently in a cohesive formal style, varying sentence structures to show cause, effect, and interpretation.</w:t>
             </w:r>
           </w:p>
         </w:tc>
@@ -3151,35 +2822,7 @@
                 <w:sz w:val="18"/>
                 <w:szCs w:val="18"/>
               </w:rPr>
-              <w:t xml:space="preserve">Text purpose</w:t>
-            </w:r>
-          </w:p>
-          <w:p>
-            <w:pPr>
-              <w:spacing w:after="0"/>
-            </w:pPr>
-            <w:r>
-              <w:rPr>
-                <w:rFonts w:ascii="Arial" w:cs="Arial" w:eastAsia="Arial" w:hAnsi="Arial"/>
-                <w:color w:val="595959"/>
-                <w:sz w:val="16"/>
-                <w:szCs w:val="16"/>
-              </w:rPr>
-              <w:t xml:space="preserve">what Fraillon is doing to the reader</w:t>
-            </w:r>
-          </w:p>
-          <w:p>
-            <w:pPr>
-              <w:spacing w:after="0"/>
-            </w:pPr>
-            <w:r>
-              <w:rPr>
-                <w:rFonts w:ascii="Arial" w:cs="Arial" w:eastAsia="Arial" w:hAnsi="Arial"/>
-                <w:color w:val="808080"/>
-                <w:sz w:val="14"/>
-                <w:szCs w:val="14"/>
-              </w:rPr>
-              <w:t xml:space="preserve">EAL reading rubric</w:t>
+              <w:t xml:space="preserve">Purpose &amp; Interpretation</w:t>
             </w:r>
           </w:p>
         </w:tc>
@@ -3203,32 +2846,31 @@
                 <w:sz w:val="17"/>
                 <w:szCs w:val="17"/>
               </w:rPr>
-              <w:t xml:space="preserve">Identify common text types and features</w:t>
+              <w:t xml:space="preserve">Identifies the basic meaning or message.</w:t>
             </w:r>
           </w:p>
         </w:tc>
         <w:tc>
           <w:tcPr>
             <w:tcW w:type="dxa" w:w="3099"/>
-            <w:shd w:fill="F2F2F2" w:color="auto" w:val="clear"/>
-            <w:tcMar>
-              <w:top w:type="dxa" w:w="70"/>
-              <w:left w:type="dxa" w:w="90"/>
-              <w:bottom w:type="dxa" w:w="70"/>
-              <w:right w:type="dxa" w:w="90"/>
-            </w:tcMar>
-          </w:tcPr>
-          <w:p>
-            <w:pPr>
-              <w:spacing w:after="0"/>
-            </w:pPr>
-            <w:r>
-              <w:rPr>
-                <w:rFonts w:ascii="Arial" w:cs="Arial" w:eastAsia="Arial" w:hAnsi="Arial"/>
-                <w:sz w:val="17"/>
-                <w:szCs w:val="17"/>
-              </w:rPr>
-              <w:t xml:space="preserve">Identify the main purpose of the text and describe text features</w:t>
+            <w:tcMar>
+              <w:top w:type="dxa" w:w="70"/>
+              <w:left w:type="dxa" w:w="90"/>
+              <w:bottom w:type="dxa" w:w="70"/>
+              <w:right w:type="dxa" w:w="90"/>
+            </w:tcMar>
+          </w:tcPr>
+          <w:p>
+            <w:pPr>
+              <w:spacing w:after="0"/>
+            </w:pPr>
+            <w:r>
+              <w:rPr>
+                <w:rFonts w:ascii="Arial" w:cs="Arial" w:eastAsia="Arial" w:hAnsi="Arial"/>
+                <w:sz w:val="17"/>
+                <w:szCs w:val="17"/>
+              </w:rPr>
+              <w:t xml:space="preserve">Explains the effect on the reader or viewer.</w:t>
             </w:r>
           </w:p>
         </w:tc>
@@ -3252,7 +2894,7 @@
                 <w:sz w:val="17"/>
                 <w:szCs w:val="17"/>
               </w:rPr>
-              <w:t xml:space="preserve">Discuss how specific text features relate to the purpose. Make inferences about the author’s intent</w:t>
+              <w:t xml:space="preserve">Makes inferences about the creator’s intent or perspective.</w:t>
             </w:r>
           </w:p>
         </w:tc>
@@ -3276,7 +2918,7 @@
                 <w:sz w:val="17"/>
                 <w:szCs w:val="17"/>
               </w:rPr>
-              <w:t xml:space="preserve">Discuss and examine how structures, language features and vocabulary choices relate to the purpose. Make inferences about the author’s complex and nuanced ideas</w:t>
+              <w:t xml:space="preserve">Discusses deeper social, moral, or ethical ideas, linking choices to broader context.</w:t>
             </w:r>
           </w:p>
         </w:tc>
@@ -3303,7 +2945,7 @@
           <w:sz w:val="18"/>
           <w:szCs w:val="18"/>
         </w:rPr>
-        <w:t xml:space="preserve">Skill focus quoted from the EAL analytical writing WAGOLL; the other rows from the EAL reading rubric, C levels.</w:t>
+        <w:t xml:space="preserve">The EAL analytical writing rubric, as it stands.</w:t>
       </w:r>
     </w:p>
     <w:p>

</xml_diff>

<commit_message>
Booklets: the model already coloured, lines to write on, no stem column
Each booklet now runs prompt and introduction, then the model paragraph
on its own page in the same frame the students write in, already
coloured; then a frame of ruled lines for their paragraph, another for
whoever gets there, a conclusion, and the self assessment. The column of
sentence stems is gone.

The rubric drops Understanding language devices — its Level 6 is about
rhymes, which is no use on a novel — and the rows carry the unit's
colours: blue for the idea, yellow for evidence, green for the effect.
The EAL rubric takes the same colours. Teacher notes are out of both
documents. The folio expects one paragraph a sitting and a second from
whoever gets there; the single period expects two from everyone.

Co-Authored-By: Claude Opus 5 <noreply@anthropic.com>
Claude-Session: https://claude.ai/code/session_01TX2KYiJGekMNoBBPASQh6e
</commit_message>
<xml_diff>
--- a/BoneSparrow-assessment-folio.docx
+++ b/BoneSparrow-assessment-folio.docx
@@ -129,7 +129,7 @@
           <w:sz w:val="24"/>
           <w:szCs w:val="24"/>
         </w:rPr>
-        <w:t xml:space="preserve">You will write three folio pieces about The Bone Sparrow. Each one is written in class in 30 minutes, and each one has its own prompt, which you are given at the start of the sitting. In each booklet the introduction has the first idea written in and the first paragraph is written out for you; you write the second paragraph, and the third if you can.</w:t>
+        <w:t xml:space="preserve">You will write three folio pieces about The Bone Sparrow. Each one is written in class in 30 minutes, and each one has its own prompt, which you are given at the start of the sitting. The booklet gives you the model paragraph and starts the introduction. You write one paragraph of your own, and a second one if you get there.</w:t>
       </w:r>
     </w:p>
     <w:p>
@@ -360,15 +360,15 @@
           <w:sz w:val="24"/>
           <w:szCs w:val="24"/>
         </w:rPr>
-        <w:t xml:space="preserve">Write the second and third paragraphs.</w:t>
-      </w:r>
-      <w:r>
-        <w:rPr>
-          <w:rFonts w:ascii="Arial" w:cs="Arial" w:eastAsia="Arial" w:hAnsi="Arial"/>
-          <w:sz w:val="24"/>
-          <w:szCs w:val="24"/>
-        </w:rPr>
-        <w:t xml:space="preserve">  One idea each. The printed paragraph shows you the shape.</w:t>
+        <w:t xml:space="preserve">Write your paragraph.</w:t>
+      </w:r>
+      <w:r>
+        <w:rPr>
+          <w:rFonts w:ascii="Arial" w:cs="Arial" w:eastAsia="Arial" w:hAnsi="Arial"/>
+          <w:sz w:val="24"/>
+          <w:szCs w:val="24"/>
+        </w:rPr>
+        <w:t xml:space="preserve">  One idea. The model shows you the shape. Write a second paragraph if you get there.</w:t>
       </w:r>
     </w:p>
     <w:p>
@@ -1252,6 +1252,7 @@
         <w:tc>
           <w:tcPr>
             <w:tcW w:type="dxa" w:w="3000"/>
+            <w:shd w:fill="D6EAFC" w:color="auto" w:val="clear"/>
             <w:tcMar>
               <w:top w:type="dxa" w:w="70"/>
               <w:left w:type="dxa" w:w="90"/>
@@ -1306,6 +1307,7 @@
         <w:tc>
           <w:tcPr>
             <w:tcW w:type="dxa" w:w="2479"/>
+            <w:shd w:fill="EAF4FD" w:color="auto" w:val="clear"/>
             <w:tcMar>
               <w:top w:type="dxa" w:w="70"/>
               <w:left w:type="dxa" w:w="90"/>
@@ -1330,6 +1332,7 @@
         <w:tc>
           <w:tcPr>
             <w:tcW w:type="dxa" w:w="2479"/>
+            <w:shd w:fill="EAF4FD" w:color="auto" w:val="clear"/>
             <w:tcMar>
               <w:top w:type="dxa" w:w="70"/>
               <w:left w:type="dxa" w:w="90"/>
@@ -1354,7 +1357,7 @@
         <w:tc>
           <w:tcPr>
             <w:tcW w:type="dxa" w:w="2479"/>
-            <w:shd w:fill="F2F2F2" w:color="auto" w:val="clear"/>
+            <w:shd w:fill="EAF4FD" w:color="auto" w:val="clear"/>
             <w:tcMar>
               <w:top w:type="dxa" w:w="70"/>
               <w:left w:type="dxa" w:w="90"/>
@@ -1379,6 +1382,7 @@
         <w:tc>
           <w:tcPr>
             <w:tcW w:type="dxa" w:w="2479"/>
+            <w:shd w:fill="EAF4FD" w:color="auto" w:val="clear"/>
             <w:tcMar>
               <w:top w:type="dxa" w:w="70"/>
               <w:left w:type="dxa" w:w="90"/>
@@ -1403,6 +1407,7 @@
         <w:tc>
           <w:tcPr>
             <w:tcW w:type="dxa" w:w="2479"/>
+            <w:shd w:fill="EAF4FD" w:color="auto" w:val="clear"/>
             <w:tcMar>
               <w:top w:type="dxa" w:w="70"/>
               <w:left w:type="dxa" w:w="90"/>
@@ -1429,6 +1434,7 @@
         <w:tc>
           <w:tcPr>
             <w:tcW w:type="dxa" w:w="3000"/>
+            <w:shd w:fill="FFF3B0" w:color="auto" w:val="clear"/>
             <w:tcMar>
               <w:top w:type="dxa" w:w="70"/>
               <w:left w:type="dxa" w:w="90"/>
@@ -1448,7 +1454,7 @@
                 <w:sz w:val="18"/>
                 <w:szCs w:val="18"/>
               </w:rPr>
-              <w:t xml:space="preserve">Understanding language devices</w:t>
+              <w:t xml:space="preserve">Using evidence</w:t>
             </w:r>
           </w:p>
           <w:p>
@@ -1462,7 +1468,7 @@
                 <w:sz w:val="16"/>
                 <w:szCs w:val="16"/>
               </w:rPr>
-              <w:t xml:space="preserve">what Fraillon has done with the words</w:t>
+              <w:t xml:space="preserve">choosing the quote, and putting it in the sentence</w:t>
             </w:r>
           </w:p>
           <w:p>
@@ -1476,128 +1482,132 @@
                 <w:sz w:val="14"/>
                 <w:szCs w:val="14"/>
               </w:rPr>
-              <w:t xml:space="preserve">Reading and Viewing</w:t>
+              <w:t xml:space="preserve">Reading and Viewing · Writing</w:t>
             </w:r>
           </w:p>
         </w:tc>
         <w:tc>
           <w:tcPr>
             <w:tcW w:type="dxa" w:w="2479"/>
-            <w:tcMar>
-              <w:top w:type="dxa" w:w="70"/>
-              <w:left w:type="dxa" w:w="90"/>
-              <w:bottom w:type="dxa" w:w="70"/>
-              <w:right w:type="dxa" w:w="90"/>
-            </w:tcMar>
-          </w:tcPr>
-          <w:p>
-            <w:pPr>
-              <w:spacing w:after="0"/>
-            </w:pPr>
-            <w:r>
-              <w:rPr>
-                <w:rFonts w:ascii="Arial" w:cs="Arial" w:eastAsia="Arial" w:hAnsi="Arial"/>
-                <w:sz w:val="17"/>
-                <w:szCs w:val="17"/>
-              </w:rPr>
-              <w:t xml:space="preserve">I can describe the meaning of different similes and metaphors</w:t>
+            <w:shd w:fill="FFF9DC" w:color="auto" w:val="clear"/>
+            <w:tcMar>
+              <w:top w:type="dxa" w:w="70"/>
+              <w:left w:type="dxa" w:w="90"/>
+              <w:bottom w:type="dxa" w:w="70"/>
+              <w:right w:type="dxa" w:w="90"/>
+            </w:tcMar>
+          </w:tcPr>
+          <w:p>
+            <w:pPr>
+              <w:spacing w:after="0"/>
+            </w:pPr>
+            <w:r>
+              <w:rPr>
+                <w:rFonts w:ascii="Arial" w:cs="Arial" w:eastAsia="Arial" w:hAnsi="Arial"/>
+                <w:sz w:val="17"/>
+                <w:szCs w:val="17"/>
+              </w:rPr>
+              <w:t xml:space="preserve">I can describe the depiction of events, characters and settings in texts and explain my responses to them</w:t>
             </w:r>
           </w:p>
         </w:tc>
         <w:tc>
           <w:tcPr>
             <w:tcW w:type="dxa" w:w="2479"/>
-            <w:tcMar>
-              <w:top w:type="dxa" w:w="70"/>
-              <w:left w:type="dxa" w:w="90"/>
-              <w:bottom w:type="dxa" w:w="70"/>
-              <w:right w:type="dxa" w:w="90"/>
-            </w:tcMar>
-          </w:tcPr>
-          <w:p>
-            <w:pPr>
-              <w:spacing w:after="0"/>
-            </w:pPr>
-            <w:r>
-              <w:rPr>
-                <w:rFonts w:ascii="Arial" w:cs="Arial" w:eastAsia="Arial" w:hAnsi="Arial"/>
-                <w:sz w:val="17"/>
-                <w:szCs w:val="17"/>
-              </w:rPr>
-              <w:t xml:space="preserve">I can explain how rhymes can add to descriptions in writing</w:t>
+            <w:shd w:fill="FFF9DC" w:color="auto" w:val="clear"/>
+            <w:tcMar>
+              <w:top w:type="dxa" w:w="70"/>
+              <w:left w:type="dxa" w:w="90"/>
+              <w:bottom w:type="dxa" w:w="70"/>
+              <w:right w:type="dxa" w:w="90"/>
+            </w:tcMar>
+          </w:tcPr>
+          <w:p>
+            <w:pPr>
+              <w:spacing w:after="0"/>
+            </w:pPr>
+            <w:r>
+              <w:rPr>
+                <w:rFonts w:ascii="Arial" w:cs="Arial" w:eastAsia="Arial" w:hAnsi="Arial"/>
+                <w:sz w:val="17"/>
+                <w:szCs w:val="17"/>
+              </w:rPr>
+              <w:t xml:space="preserve">I can select specific details from texts to develop and explain my own responses. I can include quotes in an explanation with teacher guidance</w:t>
             </w:r>
           </w:p>
         </w:tc>
         <w:tc>
           <w:tcPr>
             <w:tcW w:type="dxa" w:w="2479"/>
-            <w:shd w:fill="F2F2F2" w:color="auto" w:val="clear"/>
-            <w:tcMar>
-              <w:top w:type="dxa" w:w="70"/>
-              <w:left w:type="dxa" w:w="90"/>
-              <w:bottom w:type="dxa" w:w="70"/>
-              <w:right w:type="dxa" w:w="90"/>
-            </w:tcMar>
-          </w:tcPr>
-          <w:p>
-            <w:pPr>
-              <w:spacing w:after="0"/>
-            </w:pPr>
-            <w:r>
-              <w:rPr>
-                <w:rFonts w:ascii="Arial" w:cs="Arial" w:eastAsia="Arial" w:hAnsi="Arial"/>
-                <w:sz w:val="17"/>
-                <w:szCs w:val="17"/>
-              </w:rPr>
-              <w:t xml:space="preserve">I can explain the meaning of non-literal language in narrative and poetic texts</w:t>
+            <w:shd w:fill="FFF9DC" w:color="auto" w:val="clear"/>
+            <w:tcMar>
+              <w:top w:type="dxa" w:w="70"/>
+              <w:left w:type="dxa" w:w="90"/>
+              <w:bottom w:type="dxa" w:w="70"/>
+              <w:right w:type="dxa" w:w="90"/>
+            </w:tcMar>
+          </w:tcPr>
+          <w:p>
+            <w:pPr>
+              <w:spacing w:after="0"/>
+            </w:pPr>
+            <w:r>
+              <w:rPr>
+                <w:rFonts w:ascii="Arial" w:cs="Arial" w:eastAsia="Arial" w:hAnsi="Arial"/>
+                <w:sz w:val="17"/>
+                <w:szCs w:val="17"/>
+              </w:rPr>
+              <w:t xml:space="preserve">I can select and use evidence from texts to explain my response to it. I can explain the relevance of a quote</w:t>
             </w:r>
           </w:p>
         </w:tc>
         <w:tc>
           <w:tcPr>
             <w:tcW w:type="dxa" w:w="2479"/>
-            <w:tcMar>
-              <w:top w:type="dxa" w:w="70"/>
-              <w:left w:type="dxa" w:w="90"/>
-              <w:bottom w:type="dxa" w:w="70"/>
-              <w:right w:type="dxa" w:w="90"/>
-            </w:tcMar>
-          </w:tcPr>
-          <w:p>
-            <w:pPr>
-              <w:spacing w:after="0"/>
-            </w:pPr>
-            <w:r>
-              <w:rPr>
-                <w:rFonts w:ascii="Arial" w:cs="Arial" w:eastAsia="Arial" w:hAnsi="Arial"/>
-                <w:sz w:val="17"/>
-                <w:szCs w:val="17"/>
-              </w:rPr>
-              <w:t xml:space="preserve">I can explain the effect of descriptions, different sentence types and figurative language</w:t>
+            <w:shd w:fill="FFF9DC" w:color="auto" w:val="clear"/>
+            <w:tcMar>
+              <w:top w:type="dxa" w:w="70"/>
+              <w:left w:type="dxa" w:w="90"/>
+              <w:bottom w:type="dxa" w:w="70"/>
+              <w:right w:type="dxa" w:w="90"/>
+            </w:tcMar>
+          </w:tcPr>
+          <w:p>
+            <w:pPr>
+              <w:spacing w:after="0"/>
+            </w:pPr>
+            <w:r>
+              <w:rPr>
+                <w:rFonts w:ascii="Arial" w:cs="Arial" w:eastAsia="Arial" w:hAnsi="Arial"/>
+                <w:sz w:val="17"/>
+                <w:szCs w:val="17"/>
+              </w:rPr>
+              <w:t xml:space="preserve">I can select evidence from texts to describe how authors depict events, situations, and people from different viewpoints. I can embed quotes into sentences</w:t>
             </w:r>
           </w:p>
         </w:tc>
         <w:tc>
           <w:tcPr>
             <w:tcW w:type="dxa" w:w="2479"/>
-            <w:tcMar>
-              <w:top w:type="dxa" w:w="70"/>
-              <w:left w:type="dxa" w:w="90"/>
-              <w:bottom w:type="dxa" w:w="70"/>
-              <w:right w:type="dxa" w:w="90"/>
-            </w:tcMar>
-          </w:tcPr>
-          <w:p>
-            <w:pPr>
-              <w:spacing w:after="0"/>
-            </w:pPr>
-            <w:r>
-              <w:rPr>
-                <w:rFonts w:ascii="Arial" w:cs="Arial" w:eastAsia="Arial" w:hAnsi="Arial"/>
-                <w:sz w:val="17"/>
-                <w:szCs w:val="17"/>
-              </w:rPr>
-              <w:t xml:space="preserve">I can analyse the way writing techniques work together to convey ideas and feelings</w:t>
+            <w:shd w:fill="FFF9DC" w:color="auto" w:val="clear"/>
+            <w:tcMar>
+              <w:top w:type="dxa" w:w="70"/>
+              <w:left w:type="dxa" w:w="90"/>
+              <w:bottom w:type="dxa" w:w="70"/>
+              <w:right w:type="dxa" w:w="90"/>
+            </w:tcMar>
+          </w:tcPr>
+          <w:p>
+            <w:pPr>
+              <w:spacing w:after="0"/>
+            </w:pPr>
+            <w:r>
+              <w:rPr>
+                <w:rFonts w:ascii="Arial" w:cs="Arial" w:eastAsia="Arial" w:hAnsi="Arial"/>
+                <w:sz w:val="17"/>
+                <w:szCs w:val="17"/>
+              </w:rPr>
+              <w:t xml:space="preserve">I can select evidence from texts to explain how language choices influence an audience. I can correctly embed quotes within an explanation sentence</w:t>
             </w:r>
           </w:p>
         </w:tc>
@@ -1606,6 +1616,7 @@
         <w:tc>
           <w:tcPr>
             <w:tcW w:type="dxa" w:w="3000"/>
+            <w:shd w:fill="DFF0E2" w:color="auto" w:val="clear"/>
             <w:tcMar>
               <w:top w:type="dxa" w:w="70"/>
               <w:left w:type="dxa" w:w="90"/>
@@ -1625,7 +1636,7 @@
                 <w:sz w:val="18"/>
                 <w:szCs w:val="18"/>
               </w:rPr>
-              <w:t xml:space="preserve">Using evidence</w:t>
+              <w:t xml:space="preserve">Evaluating texts</w:t>
             </w:r>
           </w:p>
           <w:p>
@@ -1639,7 +1650,7 @@
                 <w:sz w:val="16"/>
                 <w:szCs w:val="16"/>
               </w:rPr>
-              <w:t xml:space="preserve">choosing the quote, and putting it in the sentence</w:t>
+              <w:t xml:space="preserve">the effect on the reader, and the verb that carries it</w:t>
             </w:r>
           </w:p>
           <w:p>
@@ -1653,128 +1664,132 @@
                 <w:sz w:val="14"/>
                 <w:szCs w:val="14"/>
               </w:rPr>
-              <w:t xml:space="preserve">Reading and Viewing · Writing</w:t>
+              <w:t xml:space="preserve">Reading and Viewing</w:t>
             </w:r>
           </w:p>
         </w:tc>
         <w:tc>
           <w:tcPr>
             <w:tcW w:type="dxa" w:w="2479"/>
-            <w:tcMar>
-              <w:top w:type="dxa" w:w="70"/>
-              <w:left w:type="dxa" w:w="90"/>
-              <w:bottom w:type="dxa" w:w="70"/>
-              <w:right w:type="dxa" w:w="90"/>
-            </w:tcMar>
-          </w:tcPr>
-          <w:p>
-            <w:pPr>
-              <w:spacing w:after="0"/>
-            </w:pPr>
-            <w:r>
-              <w:rPr>
-                <w:rFonts w:ascii="Arial" w:cs="Arial" w:eastAsia="Arial" w:hAnsi="Arial"/>
-                <w:sz w:val="17"/>
-                <w:szCs w:val="17"/>
-              </w:rPr>
-              <w:t xml:space="preserve">I can describe the depiction of events, characters and settings in texts and explain my responses to them</w:t>
+            <w:shd w:fill="EFF7F0" w:color="auto" w:val="clear"/>
+            <w:tcMar>
+              <w:top w:type="dxa" w:w="70"/>
+              <w:left w:type="dxa" w:w="90"/>
+              <w:bottom w:type="dxa" w:w="70"/>
+              <w:right w:type="dxa" w:w="90"/>
+            </w:tcMar>
+          </w:tcPr>
+          <w:p>
+            <w:pPr>
+              <w:spacing w:after="0"/>
+            </w:pPr>
+            <w:r>
+              <w:rPr>
+                <w:rFonts w:ascii="Arial" w:cs="Arial" w:eastAsia="Arial" w:hAnsi="Arial"/>
+                <w:sz w:val="17"/>
+                <w:szCs w:val="17"/>
+              </w:rPr>
+              <w:t xml:space="preserve">I can use metalanguage to discuss the effect of texts on the reader</w:t>
             </w:r>
           </w:p>
         </w:tc>
         <w:tc>
           <w:tcPr>
             <w:tcW w:type="dxa" w:w="2479"/>
-            <w:tcMar>
-              <w:top w:type="dxa" w:w="70"/>
-              <w:left w:type="dxa" w:w="90"/>
-              <w:bottom w:type="dxa" w:w="70"/>
-              <w:right w:type="dxa" w:w="90"/>
-            </w:tcMar>
-          </w:tcPr>
-          <w:p>
-            <w:pPr>
-              <w:spacing w:after="0"/>
-            </w:pPr>
-            <w:r>
-              <w:rPr>
-                <w:rFonts w:ascii="Arial" w:cs="Arial" w:eastAsia="Arial" w:hAnsi="Arial"/>
-                <w:sz w:val="17"/>
-                <w:szCs w:val="17"/>
-              </w:rPr>
-              <w:t xml:space="preserve">I can select specific details from texts to develop and explain my own responses. I can include quotes in an explanation with teacher guidance</w:t>
+            <w:shd w:fill="EFF7F0" w:color="auto" w:val="clear"/>
+            <w:tcMar>
+              <w:top w:type="dxa" w:w="70"/>
+              <w:left w:type="dxa" w:w="90"/>
+              <w:bottom w:type="dxa" w:w="70"/>
+              <w:right w:type="dxa" w:w="90"/>
+            </w:tcMar>
+          </w:tcPr>
+          <w:p>
+            <w:pPr>
+              <w:spacing w:after="0"/>
+            </w:pPr>
+            <w:r>
+              <w:rPr>
+                <w:rFonts w:ascii="Arial" w:cs="Arial" w:eastAsia="Arial" w:hAnsi="Arial"/>
+                <w:sz w:val="17"/>
+                <w:szCs w:val="17"/>
+              </w:rPr>
+              <w:t xml:space="preserve">I can describe how repetition, emphasis and metaphor can influence the way a reader feels</w:t>
             </w:r>
           </w:p>
         </w:tc>
         <w:tc>
           <w:tcPr>
             <w:tcW w:type="dxa" w:w="2479"/>
-            <w:shd w:fill="F2F2F2" w:color="auto" w:val="clear"/>
-            <w:tcMar>
-              <w:top w:type="dxa" w:w="70"/>
-              <w:left w:type="dxa" w:w="90"/>
-              <w:bottom w:type="dxa" w:w="70"/>
-              <w:right w:type="dxa" w:w="90"/>
-            </w:tcMar>
-          </w:tcPr>
-          <w:p>
-            <w:pPr>
-              <w:spacing w:after="0"/>
-            </w:pPr>
-            <w:r>
-              <w:rPr>
-                <w:rFonts w:ascii="Arial" w:cs="Arial" w:eastAsia="Arial" w:hAnsi="Arial"/>
-                <w:sz w:val="17"/>
-                <w:szCs w:val="17"/>
-              </w:rPr>
-              <w:t xml:space="preserve">I can select and use evidence from texts to explain my response to it. I can explain the relevance of a quote</w:t>
+            <w:shd w:fill="EFF7F0" w:color="auto" w:val="clear"/>
+            <w:tcMar>
+              <w:top w:type="dxa" w:w="70"/>
+              <w:left w:type="dxa" w:w="90"/>
+              <w:bottom w:type="dxa" w:w="70"/>
+              <w:right w:type="dxa" w:w="90"/>
+            </w:tcMar>
+          </w:tcPr>
+          <w:p>
+            <w:pPr>
+              <w:spacing w:after="0"/>
+            </w:pPr>
+            <w:r>
+              <w:rPr>
+                <w:rFonts w:ascii="Arial" w:cs="Arial" w:eastAsia="Arial" w:hAnsi="Arial"/>
+                <w:sz w:val="17"/>
+                <w:szCs w:val="17"/>
+              </w:rPr>
+              <w:t xml:space="preserve">I can use examples from the text to discuss how language helps to create character</w:t>
             </w:r>
           </w:p>
         </w:tc>
         <w:tc>
           <w:tcPr>
             <w:tcW w:type="dxa" w:w="2479"/>
-            <w:tcMar>
-              <w:top w:type="dxa" w:w="70"/>
-              <w:left w:type="dxa" w:w="90"/>
-              <w:bottom w:type="dxa" w:w="70"/>
-              <w:right w:type="dxa" w:w="90"/>
-            </w:tcMar>
-          </w:tcPr>
-          <w:p>
-            <w:pPr>
-              <w:spacing w:after="0"/>
-            </w:pPr>
-            <w:r>
-              <w:rPr>
-                <w:rFonts w:ascii="Arial" w:cs="Arial" w:eastAsia="Arial" w:hAnsi="Arial"/>
-                <w:sz w:val="17"/>
-                <w:szCs w:val="17"/>
-              </w:rPr>
-              <w:t xml:space="preserve">I can select evidence from texts to describe how authors depict events, situations, and people from different viewpoints. I can embed quotes into sentences</w:t>
+            <w:shd w:fill="EFF7F0" w:color="auto" w:val="clear"/>
+            <w:tcMar>
+              <w:top w:type="dxa" w:w="70"/>
+              <w:left w:type="dxa" w:w="90"/>
+              <w:bottom w:type="dxa" w:w="70"/>
+              <w:right w:type="dxa" w:w="90"/>
+            </w:tcMar>
+          </w:tcPr>
+          <w:p>
+            <w:pPr>
+              <w:spacing w:after="0"/>
+            </w:pPr>
+            <w:r>
+              <w:rPr>
+                <w:rFonts w:ascii="Arial" w:cs="Arial" w:eastAsia="Arial" w:hAnsi="Arial"/>
+                <w:sz w:val="17"/>
+                <w:szCs w:val="17"/>
+              </w:rPr>
+              <w:t xml:space="preserve">I can explain how different types of evidence can add authority to a text</w:t>
             </w:r>
           </w:p>
         </w:tc>
         <w:tc>
           <w:tcPr>
             <w:tcW w:type="dxa" w:w="2479"/>
-            <w:tcMar>
-              <w:top w:type="dxa" w:w="70"/>
-              <w:left w:type="dxa" w:w="90"/>
-              <w:bottom w:type="dxa" w:w="70"/>
-              <w:right w:type="dxa" w:w="90"/>
-            </w:tcMar>
-          </w:tcPr>
-          <w:p>
-            <w:pPr>
-              <w:spacing w:after="0"/>
-            </w:pPr>
-            <w:r>
-              <w:rPr>
-                <w:rFonts w:ascii="Arial" w:cs="Arial" w:eastAsia="Arial" w:hAnsi="Arial"/>
-                <w:sz w:val="17"/>
-                <w:szCs w:val="17"/>
-              </w:rPr>
-              <w:t xml:space="preserve">I can select evidence from texts to explain how language choices influence an audience. I can correctly embed quotes within an explanation sentence</w:t>
+            <w:shd w:fill="EFF7F0" w:color="auto" w:val="clear"/>
+            <w:tcMar>
+              <w:top w:type="dxa" w:w="70"/>
+              <w:left w:type="dxa" w:w="90"/>
+              <w:bottom w:type="dxa" w:w="70"/>
+              <w:right w:type="dxa" w:w="90"/>
+            </w:tcMar>
+          </w:tcPr>
+          <w:p>
+            <w:pPr>
+              <w:spacing w:after="0"/>
+            </w:pPr>
+            <w:r>
+              <w:rPr>
+                <w:rFonts w:ascii="Arial" w:cs="Arial" w:eastAsia="Arial" w:hAnsi="Arial"/>
+                <w:sz w:val="17"/>
+                <w:szCs w:val="17"/>
+              </w:rPr>
+              <w:t xml:space="preserve">I can explain how a text explores issues that relate to our own lives</w:t>
             </w:r>
           </w:p>
         </w:tc>
@@ -1783,6 +1798,7 @@
         <w:tc>
           <w:tcPr>
             <w:tcW w:type="dxa" w:w="3000"/>
+            <w:shd w:fill="F1EDE3" w:color="auto" w:val="clear"/>
             <w:tcMar>
               <w:top w:type="dxa" w:w="70"/>
               <w:left w:type="dxa" w:w="90"/>
@@ -1802,7 +1818,7 @@
                 <w:sz w:val="18"/>
                 <w:szCs w:val="18"/>
               </w:rPr>
-              <w:t xml:space="preserve">Evaluating texts</w:t>
+              <w:t xml:space="preserve">Text structure and organisation</w:t>
             </w:r>
           </w:p>
           <w:p>
@@ -1816,7 +1832,7 @@
                 <w:sz w:val="16"/>
                 <w:szCs w:val="16"/>
               </w:rPr>
-              <w:t xml:space="preserve">the effect on the reader, and the verb that carries it</w:t>
+              <w:t xml:space="preserve">the shape of the paragraph</w:t>
             </w:r>
           </w:p>
           <w:p>
@@ -1830,287 +1846,114 @@
                 <w:sz w:val="14"/>
                 <w:szCs w:val="14"/>
               </w:rPr>
-              <w:t xml:space="preserve">Reading and Viewing</w:t>
+              <w:t xml:space="preserve">Writing</w:t>
             </w:r>
           </w:p>
         </w:tc>
         <w:tc>
           <w:tcPr>
             <w:tcW w:type="dxa" w:w="2479"/>
-            <w:tcMar>
-              <w:top w:type="dxa" w:w="70"/>
-              <w:left w:type="dxa" w:w="90"/>
-              <w:bottom w:type="dxa" w:w="70"/>
-              <w:right w:type="dxa" w:w="90"/>
-            </w:tcMar>
-          </w:tcPr>
-          <w:p>
-            <w:pPr>
-              <w:spacing w:after="0"/>
-            </w:pPr>
-            <w:r>
-              <w:rPr>
-                <w:rFonts w:ascii="Arial" w:cs="Arial" w:eastAsia="Arial" w:hAnsi="Arial"/>
-                <w:sz w:val="17"/>
-                <w:szCs w:val="17"/>
-              </w:rPr>
-              <w:t xml:space="preserve">I can use metalanguage to discuss the effect of texts on the reader</w:t>
+            <w:shd w:fill="FFFFFF" w:color="auto" w:val="clear"/>
+            <w:tcMar>
+              <w:top w:type="dxa" w:w="70"/>
+              <w:left w:type="dxa" w:w="90"/>
+              <w:bottom w:type="dxa" w:w="70"/>
+              <w:right w:type="dxa" w:w="90"/>
+            </w:tcMar>
+          </w:tcPr>
+          <w:p>
+            <w:pPr>
+              <w:spacing w:after="0"/>
+            </w:pPr>
+            <w:r>
+              <w:rPr>
+                <w:rFonts w:ascii="Arial" w:cs="Arial" w:eastAsia="Arial" w:hAnsi="Arial"/>
+                <w:sz w:val="17"/>
+                <w:szCs w:val="17"/>
+              </w:rPr>
+              <w:t xml:space="preserve">I can change the focus of a sentence by modifying the subject</w:t>
             </w:r>
           </w:p>
         </w:tc>
         <w:tc>
           <w:tcPr>
             <w:tcW w:type="dxa" w:w="2479"/>
-            <w:tcMar>
-              <w:top w:type="dxa" w:w="70"/>
-              <w:left w:type="dxa" w:w="90"/>
-              <w:bottom w:type="dxa" w:w="70"/>
-              <w:right w:type="dxa" w:w="90"/>
-            </w:tcMar>
-          </w:tcPr>
-          <w:p>
-            <w:pPr>
-              <w:spacing w:after="0"/>
-            </w:pPr>
-            <w:r>
-              <w:rPr>
-                <w:rFonts w:ascii="Arial" w:cs="Arial" w:eastAsia="Arial" w:hAnsi="Arial"/>
-                <w:sz w:val="17"/>
-                <w:szCs w:val="17"/>
-              </w:rPr>
-              <w:t xml:space="preserve">I can describe how repetition, emphasis and metaphor can influence the way a reader feels</w:t>
+            <w:shd w:fill="FFFFFF" w:color="auto" w:val="clear"/>
+            <w:tcMar>
+              <w:top w:type="dxa" w:w="70"/>
+              <w:left w:type="dxa" w:w="90"/>
+              <w:bottom w:type="dxa" w:w="70"/>
+              <w:right w:type="dxa" w:w="90"/>
+            </w:tcMar>
+          </w:tcPr>
+          <w:p>
+            <w:pPr>
+              <w:spacing w:after="0"/>
+            </w:pPr>
+            <w:r>
+              <w:rPr>
+                <w:rFonts w:ascii="Arial" w:cs="Arial" w:eastAsia="Arial" w:hAnsi="Arial"/>
+                <w:sz w:val="17"/>
+                <w:szCs w:val="17"/>
+              </w:rPr>
+              <w:t xml:space="preserve">I can avoid repetition by changing the participants in a follow-on idea</w:t>
             </w:r>
           </w:p>
         </w:tc>
         <w:tc>
           <w:tcPr>
             <w:tcW w:type="dxa" w:w="2479"/>
-            <w:shd w:fill="F2F2F2" w:color="auto" w:val="clear"/>
-            <w:tcMar>
-              <w:top w:type="dxa" w:w="70"/>
-              <w:left w:type="dxa" w:w="90"/>
-              <w:bottom w:type="dxa" w:w="70"/>
-              <w:right w:type="dxa" w:w="90"/>
-            </w:tcMar>
-          </w:tcPr>
-          <w:p>
-            <w:pPr>
-              <w:spacing w:after="0"/>
-            </w:pPr>
-            <w:r>
-              <w:rPr>
-                <w:rFonts w:ascii="Arial" w:cs="Arial" w:eastAsia="Arial" w:hAnsi="Arial"/>
-                <w:sz w:val="17"/>
-                <w:szCs w:val="17"/>
-              </w:rPr>
-              <w:t xml:space="preserve">I can use examples from the text to discuss how language helps to create character</w:t>
+            <w:shd w:fill="FFFFFF" w:color="auto" w:val="clear"/>
+            <w:tcMar>
+              <w:top w:type="dxa" w:w="70"/>
+              <w:left w:type="dxa" w:w="90"/>
+              <w:bottom w:type="dxa" w:w="70"/>
+              <w:right w:type="dxa" w:w="90"/>
+            </w:tcMar>
+          </w:tcPr>
+          <w:p>
+            <w:pPr>
+              <w:spacing w:after="0"/>
+            </w:pPr>
+            <w:r>
+              <w:rPr>
+                <w:rFonts w:ascii="Arial" w:cs="Arial" w:eastAsia="Arial" w:hAnsi="Arial"/>
+                <w:sz w:val="17"/>
+                <w:szCs w:val="17"/>
+              </w:rPr>
+              <w:t xml:space="preserve">I can write a paragraph for informative and narrative texts</w:t>
             </w:r>
           </w:p>
         </w:tc>
         <w:tc>
           <w:tcPr>
             <w:tcW w:type="dxa" w:w="2479"/>
-            <w:tcMar>
-              <w:top w:type="dxa" w:w="70"/>
-              <w:left w:type="dxa" w:w="90"/>
-              <w:bottom w:type="dxa" w:w="70"/>
-              <w:right w:type="dxa" w:w="90"/>
-            </w:tcMar>
-          </w:tcPr>
-          <w:p>
-            <w:pPr>
-              <w:spacing w:after="0"/>
-            </w:pPr>
-            <w:r>
-              <w:rPr>
-                <w:rFonts w:ascii="Arial" w:cs="Arial" w:eastAsia="Arial" w:hAnsi="Arial"/>
-                <w:sz w:val="17"/>
-                <w:szCs w:val="17"/>
-              </w:rPr>
-              <w:t xml:space="preserve">I can explain how different types of evidence can add authority to a text</w:t>
+            <w:shd w:fill="FFFFFF" w:color="auto" w:val="clear"/>
+            <w:tcMar>
+              <w:top w:type="dxa" w:w="70"/>
+              <w:left w:type="dxa" w:w="90"/>
+              <w:bottom w:type="dxa" w:w="70"/>
+              <w:right w:type="dxa" w:w="90"/>
+            </w:tcMar>
+          </w:tcPr>
+          <w:p>
+            <w:pPr>
+              <w:spacing w:after="0"/>
+            </w:pPr>
+            <w:r>
+              <w:rPr>
+                <w:rFonts w:ascii="Arial" w:cs="Arial" w:eastAsia="Arial" w:hAnsi="Arial"/>
+                <w:sz w:val="17"/>
+                <w:szCs w:val="17"/>
+              </w:rPr>
+              <w:t xml:space="preserve">I can sequence ideas relating to a topic within a given structure</w:t>
             </w:r>
           </w:p>
         </w:tc>
         <w:tc>
           <w:tcPr>
             <w:tcW w:type="dxa" w:w="2479"/>
-            <w:tcMar>
-              <w:top w:type="dxa" w:w="70"/>
-              <w:left w:type="dxa" w:w="90"/>
-              <w:bottom w:type="dxa" w:w="70"/>
-              <w:right w:type="dxa" w:w="90"/>
-            </w:tcMar>
-          </w:tcPr>
-          <w:p>
-            <w:pPr>
-              <w:spacing w:after="0"/>
-            </w:pPr>
-            <w:r>
-              <w:rPr>
-                <w:rFonts w:ascii="Arial" w:cs="Arial" w:eastAsia="Arial" w:hAnsi="Arial"/>
-                <w:sz w:val="17"/>
-                <w:szCs w:val="17"/>
-              </w:rPr>
-              <w:t xml:space="preserve">I can explain how a text explores issues that relate to our own lives</w:t>
-            </w:r>
-          </w:p>
-        </w:tc>
-      </w:tr>
-      <w:tr>
-        <w:tc>
-          <w:tcPr>
-            <w:tcW w:type="dxa" w:w="3000"/>
-            <w:tcMar>
-              <w:top w:type="dxa" w:w="70"/>
-              <w:left w:type="dxa" w:w="90"/>
-              <w:bottom w:type="dxa" w:w="70"/>
-              <w:right w:type="dxa" w:w="90"/>
-            </w:tcMar>
-          </w:tcPr>
-          <w:p>
-            <w:pPr>
-              <w:spacing w:after="0"/>
-            </w:pPr>
-            <w:r>
-              <w:rPr>
-                <w:rFonts w:ascii="Arial" w:cs="Arial" w:eastAsia="Arial" w:hAnsi="Arial"/>
-                <w:b/>
-                <w:bCs/>
-                <w:sz w:val="18"/>
-                <w:szCs w:val="18"/>
-              </w:rPr>
-              <w:t xml:space="preserve">Text structure and organisation</w:t>
-            </w:r>
-          </w:p>
-          <w:p>
-            <w:pPr>
-              <w:spacing w:after="0"/>
-            </w:pPr>
-            <w:r>
-              <w:rPr>
-                <w:rFonts w:ascii="Arial" w:cs="Arial" w:eastAsia="Arial" w:hAnsi="Arial"/>
-                <w:color w:val="595959"/>
-                <w:sz w:val="16"/>
-                <w:szCs w:val="16"/>
-              </w:rPr>
-              <w:t xml:space="preserve">the shape of the paragraph</w:t>
-            </w:r>
-          </w:p>
-          <w:p>
-            <w:pPr>
-              <w:spacing w:after="0"/>
-            </w:pPr>
-            <w:r>
-              <w:rPr>
-                <w:rFonts w:ascii="Arial" w:cs="Arial" w:eastAsia="Arial" w:hAnsi="Arial"/>
-                <w:color w:val="808080"/>
-                <w:sz w:val="14"/>
-                <w:szCs w:val="14"/>
-              </w:rPr>
-              <w:t xml:space="preserve">Writing</w:t>
-            </w:r>
-          </w:p>
-        </w:tc>
-        <w:tc>
-          <w:tcPr>
-            <w:tcW w:type="dxa" w:w="2479"/>
-            <w:tcMar>
-              <w:top w:type="dxa" w:w="70"/>
-              <w:left w:type="dxa" w:w="90"/>
-              <w:bottom w:type="dxa" w:w="70"/>
-              <w:right w:type="dxa" w:w="90"/>
-            </w:tcMar>
-          </w:tcPr>
-          <w:p>
-            <w:pPr>
-              <w:spacing w:after="0"/>
-            </w:pPr>
-            <w:r>
-              <w:rPr>
-                <w:rFonts w:ascii="Arial" w:cs="Arial" w:eastAsia="Arial" w:hAnsi="Arial"/>
-                <w:sz w:val="17"/>
-                <w:szCs w:val="17"/>
-              </w:rPr>
-              <w:t xml:space="preserve">I can change the focus of a sentence by modifying the subject</w:t>
-            </w:r>
-          </w:p>
-        </w:tc>
-        <w:tc>
-          <w:tcPr>
-            <w:tcW w:type="dxa" w:w="2479"/>
-            <w:tcMar>
-              <w:top w:type="dxa" w:w="70"/>
-              <w:left w:type="dxa" w:w="90"/>
-              <w:bottom w:type="dxa" w:w="70"/>
-              <w:right w:type="dxa" w:w="90"/>
-            </w:tcMar>
-          </w:tcPr>
-          <w:p>
-            <w:pPr>
-              <w:spacing w:after="0"/>
-            </w:pPr>
-            <w:r>
-              <w:rPr>
-                <w:rFonts w:ascii="Arial" w:cs="Arial" w:eastAsia="Arial" w:hAnsi="Arial"/>
-                <w:sz w:val="17"/>
-                <w:szCs w:val="17"/>
-              </w:rPr>
-              <w:t xml:space="preserve">I can avoid repetition by changing the participants in a follow-on idea</w:t>
-            </w:r>
-          </w:p>
-        </w:tc>
-        <w:tc>
-          <w:tcPr>
-            <w:tcW w:type="dxa" w:w="2479"/>
-            <w:shd w:fill="F2F2F2" w:color="auto" w:val="clear"/>
-            <w:tcMar>
-              <w:top w:type="dxa" w:w="70"/>
-              <w:left w:type="dxa" w:w="90"/>
-              <w:bottom w:type="dxa" w:w="70"/>
-              <w:right w:type="dxa" w:w="90"/>
-            </w:tcMar>
-          </w:tcPr>
-          <w:p>
-            <w:pPr>
-              <w:spacing w:after="0"/>
-            </w:pPr>
-            <w:r>
-              <w:rPr>
-                <w:rFonts w:ascii="Arial" w:cs="Arial" w:eastAsia="Arial" w:hAnsi="Arial"/>
-                <w:sz w:val="17"/>
-                <w:szCs w:val="17"/>
-              </w:rPr>
-              <w:t xml:space="preserve">I can write a paragraph for informative and narrative texts</w:t>
-            </w:r>
-          </w:p>
-        </w:tc>
-        <w:tc>
-          <w:tcPr>
-            <w:tcW w:type="dxa" w:w="2479"/>
-            <w:tcMar>
-              <w:top w:type="dxa" w:w="70"/>
-              <w:left w:type="dxa" w:w="90"/>
-              <w:bottom w:type="dxa" w:w="70"/>
-              <w:right w:type="dxa" w:w="90"/>
-            </w:tcMar>
-          </w:tcPr>
-          <w:p>
-            <w:pPr>
-              <w:spacing w:after="0"/>
-            </w:pPr>
-            <w:r>
-              <w:rPr>
-                <w:rFonts w:ascii="Arial" w:cs="Arial" w:eastAsia="Arial" w:hAnsi="Arial"/>
-                <w:sz w:val="17"/>
-                <w:szCs w:val="17"/>
-              </w:rPr>
-              <w:t xml:space="preserve">I can sequence ideas relating to a topic within a given structure</w:t>
-            </w:r>
-          </w:p>
-        </w:tc>
-        <w:tc>
-          <w:tcPr>
-            <w:tcW w:type="dxa" w:w="2479"/>
+            <w:shd w:fill="FFFFFF" w:color="auto" w:val="clear"/>
             <w:tcMar>
               <w:top w:type="dxa" w:w="70"/>
               <w:left w:type="dxa" w:w="90"/>
@@ -2431,6 +2274,7 @@
         <w:tc>
           <w:tcPr>
             <w:tcW w:type="dxa" w:w="3000"/>
+            <w:shd w:fill="D6EAFC" w:color="auto" w:val="clear"/>
             <w:tcMar>
               <w:top w:type="dxa" w:w="70"/>
               <w:left w:type="dxa" w:w="90"/>
@@ -2457,6 +2301,7 @@
         <w:tc>
           <w:tcPr>
             <w:tcW w:type="dxa" w:w="3099"/>
+            <w:shd w:fill="EAF4FD" w:color="auto" w:val="clear"/>
             <w:tcMar>
               <w:top w:type="dxa" w:w="70"/>
               <w:left w:type="dxa" w:w="90"/>
@@ -2481,6 +2326,7 @@
         <w:tc>
           <w:tcPr>
             <w:tcW w:type="dxa" w:w="3099"/>
+            <w:shd w:fill="EAF4FD" w:color="auto" w:val="clear"/>
             <w:tcMar>
               <w:top w:type="dxa" w:w="70"/>
               <w:left w:type="dxa" w:w="90"/>
@@ -2505,6 +2351,7 @@
         <w:tc>
           <w:tcPr>
             <w:tcW w:type="dxa" w:w="3099"/>
+            <w:shd w:fill="EAF4FD" w:color="auto" w:val="clear"/>
             <w:tcMar>
               <w:top w:type="dxa" w:w="70"/>
               <w:left w:type="dxa" w:w="90"/>
@@ -2529,6 +2376,7 @@
         <w:tc>
           <w:tcPr>
             <w:tcW w:type="dxa" w:w="3099"/>
+            <w:shd w:fill="EAF4FD" w:color="auto" w:val="clear"/>
             <w:tcMar>
               <w:top w:type="dxa" w:w="70"/>
               <w:left w:type="dxa" w:w="90"/>
@@ -2555,6 +2403,7 @@
         <w:tc>
           <w:tcPr>
             <w:tcW w:type="dxa" w:w="3000"/>
+            <w:shd w:fill="FFF3B0" w:color="auto" w:val="clear"/>
             <w:tcMar>
               <w:top w:type="dxa" w:w="70"/>
               <w:left w:type="dxa" w:w="90"/>
@@ -2581,6 +2430,7 @@
         <w:tc>
           <w:tcPr>
             <w:tcW w:type="dxa" w:w="3099"/>
+            <w:shd w:fill="FFF9DC" w:color="auto" w:val="clear"/>
             <w:tcMar>
               <w:top w:type="dxa" w:w="70"/>
               <w:left w:type="dxa" w:w="90"/>
@@ -2605,6 +2455,7 @@
         <w:tc>
           <w:tcPr>
             <w:tcW w:type="dxa" w:w="3099"/>
+            <w:shd w:fill="FFF9DC" w:color="auto" w:val="clear"/>
             <w:tcMar>
               <w:top w:type="dxa" w:w="70"/>
               <w:left w:type="dxa" w:w="90"/>
@@ -2629,6 +2480,7 @@
         <w:tc>
           <w:tcPr>
             <w:tcW w:type="dxa" w:w="3099"/>
+            <w:shd w:fill="FFF9DC" w:color="auto" w:val="clear"/>
             <w:tcMar>
               <w:top w:type="dxa" w:w="70"/>
               <w:left w:type="dxa" w:w="90"/>
@@ -2653,6 +2505,7 @@
         <w:tc>
           <w:tcPr>
             <w:tcW w:type="dxa" w:w="3099"/>
+            <w:shd w:fill="FFF9DC" w:color="auto" w:val="clear"/>
             <w:tcMar>
               <w:top w:type="dxa" w:w="70"/>
               <w:left w:type="dxa" w:w="90"/>
@@ -2679,6 +2532,7 @@
         <w:tc>
           <w:tcPr>
             <w:tcW w:type="dxa" w:w="3000"/>
+            <w:shd w:fill="F1EDE3" w:color="auto" w:val="clear"/>
             <w:tcMar>
               <w:top w:type="dxa" w:w="70"/>
               <w:left w:type="dxa" w:w="90"/>
@@ -2705,6 +2559,7 @@
         <w:tc>
           <w:tcPr>
             <w:tcW w:type="dxa" w:w="3099"/>
+            <w:shd w:fill="FFFFFF" w:color="auto" w:val="clear"/>
             <w:tcMar>
               <w:top w:type="dxa" w:w="70"/>
               <w:left w:type="dxa" w:w="90"/>
@@ -2729,6 +2584,7 @@
         <w:tc>
           <w:tcPr>
             <w:tcW w:type="dxa" w:w="3099"/>
+            <w:shd w:fill="FFFFFF" w:color="auto" w:val="clear"/>
             <w:tcMar>
               <w:top w:type="dxa" w:w="70"/>
               <w:left w:type="dxa" w:w="90"/>
@@ -2753,6 +2609,7 @@
         <w:tc>
           <w:tcPr>
             <w:tcW w:type="dxa" w:w="3099"/>
+            <w:shd w:fill="FFFFFF" w:color="auto" w:val="clear"/>
             <w:tcMar>
               <w:top w:type="dxa" w:w="70"/>
               <w:left w:type="dxa" w:w="90"/>
@@ -2777,6 +2634,7 @@
         <w:tc>
           <w:tcPr>
             <w:tcW w:type="dxa" w:w="3099"/>
+            <w:shd w:fill="FFFFFF" w:color="auto" w:val="clear"/>
             <w:tcMar>
               <w:top w:type="dxa" w:w="70"/>
               <w:left w:type="dxa" w:w="90"/>
@@ -2803,6 +2661,7 @@
         <w:tc>
           <w:tcPr>
             <w:tcW w:type="dxa" w:w="3000"/>
+            <w:shd w:fill="DFF0E2" w:color="auto" w:val="clear"/>
             <w:tcMar>
               <w:top w:type="dxa" w:w="70"/>
               <w:left w:type="dxa" w:w="90"/>
@@ -2829,6 +2688,7 @@
         <w:tc>
           <w:tcPr>
             <w:tcW w:type="dxa" w:w="3099"/>
+            <w:shd w:fill="EFF7F0" w:color="auto" w:val="clear"/>
             <w:tcMar>
               <w:top w:type="dxa" w:w="70"/>
               <w:left w:type="dxa" w:w="90"/>
@@ -2853,6 +2713,7 @@
         <w:tc>
           <w:tcPr>
             <w:tcW w:type="dxa" w:w="3099"/>
+            <w:shd w:fill="EFF7F0" w:color="auto" w:val="clear"/>
             <w:tcMar>
               <w:top w:type="dxa" w:w="70"/>
               <w:left w:type="dxa" w:w="90"/>
@@ -2877,6 +2738,7 @@
         <w:tc>
           <w:tcPr>
             <w:tcW w:type="dxa" w:w="3099"/>
+            <w:shd w:fill="EFF7F0" w:color="auto" w:val="clear"/>
             <w:tcMar>
               <w:top w:type="dxa" w:w="70"/>
               <w:left w:type="dxa" w:w="90"/>
@@ -2901,6 +2763,7 @@
         <w:tc>
           <w:tcPr>
             <w:tcW w:type="dxa" w:w="3099"/>
+            <w:shd w:fill="EFF7F0" w:color="auto" w:val="clear"/>
             <w:tcMar>
               <w:top w:type="dxa" w:w="70"/>
               <w:left w:type="dxa" w:w="90"/>
@@ -2991,188 +2854,8 @@
         <w:t xml:space="preserve">______________________________________________________________________________________________________________________________________________________</w:t>
       </w:r>
     </w:p>
-    <w:p>
-      <w:pPr>
-        <w:sectPr>
-          <w:pgSz w:w="16838" w:h="11906" w:orient="landscape"/>
-          <w:pgMar w:top="720" w:right="720" w:bottom="720" w:left="720" w:header="708" w:footer="708" w:gutter="0"/>
-          <w:pgNumType/>
-          <w:docGrid w:linePitch="360"/>
-        </w:sectPr>
-      </w:pPr>
-    </w:p>
-    <w:p>
-      <w:pPr>
-        <w:spacing w:after="120"/>
-      </w:pPr>
-      <w:r>
-        <w:rPr>
-          <w:rFonts w:ascii="Arial" w:cs="Arial" w:eastAsia="Arial" w:hAnsi="Arial"/>
-          <w:b/>
-          <w:bCs/>
-          <w:sz w:val="28"/>
-          <w:szCs w:val="28"/>
-        </w:rPr>
-        <w:t xml:space="preserve">Teacher notes — Option A</w:t>
-      </w:r>
-    </w:p>
-    <w:p>
-      <w:pPr>
-        <w:spacing w:after="80" w:before="220"/>
-      </w:pPr>
-      <w:r>
-        <w:rPr>
-          <w:rFonts w:ascii="Arial" w:cs="Arial" w:eastAsia="Arial" w:hAnsi="Arial"/>
-          <w:b/>
-          <w:bCs/>
-          <w:sz w:val="26"/>
-          <w:szCs w:val="26"/>
-        </w:rPr>
-        <w:t xml:space="preserve">What is marked</w:t>
-      </w:r>
-    </w:p>
-    <w:p>
-      <w:pPr>
-        <w:spacing w:after="120"/>
-      </w:pPr>
-      <w:r>
-        <w:rPr>
-          <w:rFonts w:ascii="Arial" w:cs="Arial" w:eastAsia="Arial" w:hAnsi="Arial"/>
-          <w:sz w:val="24"/>
-          <w:szCs w:val="24"/>
-        </w:rPr>
-        <w:t xml:space="preserve">The task the student nominates on the folio cover. The other two stay in the folio as evidence of progress and are not marked separately. No nomination: the last task is marked. Only the paragraphs the student wrote are marked — not the printed paragraph, and not the introduction.</w:t>
-      </w:r>
-    </w:p>
-    <w:p>
-      <w:pPr>
-        <w:spacing w:after="80" w:before="220"/>
-      </w:pPr>
-      <w:r>
-        <w:rPr>
-          <w:rFonts w:ascii="Arial" w:cs="Arial" w:eastAsia="Arial" w:hAnsi="Arial"/>
-          <w:b/>
-          <w:bCs/>
-          <w:sz w:val="26"/>
-          <w:szCs w:val="26"/>
-        </w:rPr>
-        <w:t xml:space="preserve">Differentiation</w:t>
-      </w:r>
-    </w:p>
-    <w:p>
-      <w:pPr>
-        <w:spacing w:after="80"/>
-        <w:ind w:left="400" w:hanging="220"/>
-      </w:pPr>
-      <w:r>
-        <w:rPr>
-          <w:rFonts w:ascii="Arial" w:cs="Arial" w:eastAsia="Arial" w:hAnsi="Arial"/>
-          <w:sz w:val="24"/>
-          <w:szCs w:val="24"/>
-        </w:rPr>
-        <w:t xml:space="preserve">•	Support — the topic sentence is printed in the frame; the evidence and explanation are theirs.</w:t>
-      </w:r>
-    </w:p>
-    <w:p>
-      <w:pPr>
-        <w:spacing w:after="80"/>
-        <w:ind w:left="400" w:hanging="220"/>
-      </w:pPr>
-      <w:r>
-        <w:rPr>
-          <w:rFonts w:ascii="Arial" w:cs="Arial" w:eastAsia="Arial" w:hAnsi="Arial"/>
-          <w:sz w:val="24"/>
-          <w:szCs w:val="24"/>
-        </w:rPr>
-        <w:t xml:space="preserve">•	Feedback between sittings is the point of the folio: one thing named, and the same thing looked for next time.</w:t>
-      </w:r>
-    </w:p>
-    <w:p>
-      <w:pPr>
-        <w:spacing w:after="80"/>
-        <w:ind w:left="400" w:hanging="220"/>
-      </w:pPr>
-      <w:r>
-        <w:rPr>
-          <w:rFonts w:ascii="Arial" w:cs="Arial" w:eastAsia="Arial" w:hAnsi="Arial"/>
-          <w:sz w:val="24"/>
-          <w:szCs w:val="24"/>
-        </w:rPr>
-        <w:t xml:space="preserve">•	EAL — word list first, shorter sentences, one sentence per line in the frame.</w:t>
-      </w:r>
-    </w:p>
-    <w:p>
-      <w:pPr>
-        <w:spacing w:after="80"/>
-        <w:ind w:left="400" w:hanging="220"/>
-      </w:pPr>
-      <w:r>
-        <w:rPr>
-          <w:rFonts w:ascii="Arial" w:cs="Arial" w:eastAsia="Arial" w:hAnsi="Arial"/>
-          <w:sz w:val="24"/>
-          <w:szCs w:val="24"/>
-        </w:rPr>
-        <w:t xml:space="preserve">•	Extension — TEEAL, two evidence sentences in a paragraph, and a third paragraph of their own.</w:t>
-      </w:r>
-    </w:p>
-    <w:p>
-      <w:pPr>
-        <w:spacing w:after="80" w:before="220"/>
-      </w:pPr>
-      <w:r>
-        <w:rPr>
-          <w:rFonts w:ascii="Arial" w:cs="Arial" w:eastAsia="Arial" w:hAnsi="Arial"/>
-          <w:b/>
-          <w:bCs/>
-          <w:sz w:val="26"/>
-          <w:szCs w:val="26"/>
-        </w:rPr>
-        <w:t xml:space="preserve">Where the criteria come from</w:t>
-      </w:r>
-    </w:p>
-    <w:p>
-      <w:pPr>
-        <w:spacing w:after="120"/>
-      </w:pPr>
-      <w:r>
-        <w:rPr>
-          <w:rFonts w:ascii="Arial" w:cs="Arial" w:eastAsia="Arial" w:hAnsi="Arial"/>
-          <w:sz w:val="24"/>
-          <w:szCs w:val="24"/>
-        </w:rPr>
-        <w:t xml:space="preserve">Every row is a substrand of the Learning Continuum master sheet, English tab, and every cell is its wording, unaltered, at that level. Four of the five rows are Reading and Viewing, and are what the analytical writing wall already teaches. Text structure and organisation is the one Writing row, added because the wall is a ladder of sentences and this task asks for a paragraph. The analytical verb is not a row of its own: it is how the effect gets explained, so it is marked inside Evaluating texts.</w:t>
-      </w:r>
-    </w:p>
-    <w:p>
-      <w:pPr>
-        <w:spacing w:after="80" w:before="220"/>
-      </w:pPr>
-      <w:r>
-        <w:rPr>
-          <w:rFonts w:ascii="Arial" w:cs="Arial" w:eastAsia="Arial" w:hAnsi="Arial"/>
-          <w:b/>
-          <w:bCs/>
-          <w:sz w:val="26"/>
-          <w:szCs w:val="26"/>
-        </w:rPr>
-        <w:t xml:space="preserve">What this task does not assess</w:t>
-      </w:r>
-    </w:p>
-    <w:p>
-      <w:pPr>
-        <w:spacing w:after="120"/>
-      </w:pPr>
-      <w:r>
-        <w:rPr>
-          <w:rFonts w:ascii="Arial" w:cs="Arial" w:eastAsia="Arial" w:hAnsi="Arial"/>
-          <w:sz w:val="24"/>
-          <w:szCs w:val="24"/>
-        </w:rPr>
-        <w:t xml:space="preserve">Building an essay argument — a contention, three claims and a conclusion that follows from them. That has not been taught this unit.</w:t>
-      </w:r>
-    </w:p>
     <w:sectPr>
-      <w:pgSz w:w="11906" w:h="16838" w:orient="portrait"/>
+      <w:pgSz w:w="16838" w:h="11906" w:orient="landscape"/>
       <w:pgMar w:top="720" w:right="720" w:bottom="720" w:left="720" w:header="708" w:footer="708" w:gutter="0"/>
       <w:pgNumType/>
       <w:docGrid w:linePitch="360"/>

</xml_diff>

<commit_message>
Models rewritten: every E carries all four parts
Each E is one sentence now — the quote, the verb, the idea it shows and
what that does to the reader — so the four colours all appear in every E
row, the way the wall teaches it. The ideas are plainer, and each model
takes the idea a class is least likely to reach on its own: a story
changing how Subhi feels rather than where he is; the fence keeping out
information as well as people; a friend being the one thing he chooses.
The obvious readings are left for the students.

The EAL rubric keeps the ELC wording with the film references removed.

Co-Authored-By: Claude Opus 5 <noreply@anthropic.com>
Claude-Session: https://claude.ai/code/session_01TX2KYiJGekMNoBBPASQh6e
</commit_message>
<xml_diff>
--- a/BoneSparrow-assessment-folio.docx
+++ b/BoneSparrow-assessment-folio.docx
@@ -2319,7 +2319,7 @@
                 <w:sz w:val="17"/>
                 <w:szCs w:val="17"/>
               </w:rPr>
-              <w:t xml:space="preserve">Recognises what happens in the text or scene. Retells key details with little interpretation.</w:t>
+              <w:t xml:space="preserve">Recognises what happens in the text. Retells key details with little interpretation.</w:t>
             </w:r>
           </w:p>
         </w:tc>
@@ -2369,7 +2369,7 @@
                 <w:sz w:val="17"/>
                 <w:szCs w:val="17"/>
               </w:rPr>
-              <w:t xml:space="preserve">Connects specific language or film techniques to themes or concepts. Explains what the creator might be saying.</w:t>
+              <w:t xml:space="preserve">Connects specific language choices to themes or concepts. Explains what the creator might be saying.</w:t>
             </w:r>
           </w:p>
         </w:tc>
@@ -2448,7 +2448,7 @@
                 <w:sz w:val="17"/>
                 <w:szCs w:val="17"/>
               </w:rPr>
-              <w:t xml:space="preserve">Gives a simple quote or description from the text or scene.</w:t>
+              <w:t xml:space="preserve">Gives a simple quote or description from the text.</w:t>
             </w:r>
           </w:p>
         </w:tc>
@@ -2473,7 +2473,7 @@
                 <w:sz w:val="17"/>
                 <w:szCs w:val="17"/>
               </w:rPr>
-              <w:t xml:space="preserve">Names a language or film feature and begins linking it to meaning.</w:t>
+              <w:t xml:space="preserve">Names a language feature and begins linking it to meaning.</w:t>
             </w:r>
           </w:p>
         </w:tc>
@@ -2731,7 +2731,7 @@
                 <w:sz w:val="17"/>
                 <w:szCs w:val="17"/>
               </w:rPr>
-              <w:t xml:space="preserve">Explains the effect on the reader or viewer.</w:t>
+              <w:t xml:space="preserve">Explains the effect on the reader.</w:t>
             </w:r>
           </w:p>
         </w:tc>
@@ -2808,7 +2808,7 @@
           <w:sz w:val="18"/>
           <w:szCs w:val="18"/>
         </w:rPr>
-        <w:t xml:space="preserve">The EAL analytical writing rubric, as it stands.</w:t>
+        <w:t xml:space="preserve">The EAL analytical writing rubric, with its film wording taken out.</w:t>
       </w:r>
     </w:p>
     <w:p>

</xml_diff>

<commit_message>
Task sheets on the 2026 shape; booklets fill their four sides
The task sheets now follow the 2025 and 2026 tasks: a title, the task in
one paragraph, name and date, what you will need, the structure to help
you, and the rubric at the end of the same document. The EAL rubric is
C2 to C4 only, as a plain portrait table. Purpose, audience, time and
the numbered you-must list are gone.

Each booklet is four sides now: prompt, introduction and the model
share the first; a full page of lines for their paragraph; another for
whoever gets there; then the conclusion and self assessment. The
friendship model reads friends as giving Subhi what his worn-down family
cannot, rather than as a thing he chooses.

Co-Authored-By: Claude Fable 5.1 <noreply@anthropic.com>
Claude-Session: https://claude.ai/code/session_01TX2KYiJGekMNoBBPASQh6e
</commit_message>
<xml_diff>
--- a/BoneSparrow-assessment-folio.docx
+++ b/BoneSparrow-assessment-folio.docx
@@ -4,68 +4,35 @@
   <w:body>
     <w:p>
       <w:pPr>
-        <w:spacing w:after="0"/>
+        <w:spacing w:after="160"/>
       </w:pPr>
       <w:r>
         <w:rPr>
           <w:rFonts w:ascii="Arial" w:cs="Arial" w:eastAsia="Arial" w:hAnsi="Arial"/>
           <w:b/>
           <w:bCs/>
-          <w:sz w:val="40"/>
-          <w:szCs w:val="40"/>
-        </w:rPr>
-        <w:t xml:space="preserve">The Bone Sparrow</w:t>
-      </w:r>
-    </w:p>
-    <w:p>
-      <w:pPr>
-        <w:spacing w:after="0"/>
-      </w:pPr>
-      <w:r>
-        <w:rPr>
-          <w:rFonts w:ascii="Arial" w:cs="Arial" w:eastAsia="Arial" w:hAnsi="Arial"/>
           <w:sz w:val="32"/>
           <w:szCs w:val="32"/>
         </w:rPr>
-        <w:t xml:space="preserve">Analytical Paragraph Writing — Folio</w:t>
-      </w:r>
-    </w:p>
-    <w:p>
-      <w:pPr>
-        <w:spacing w:after="0"/>
-      </w:pPr>
-      <w:r>
-        <w:rPr>
-          <w:rFonts w:ascii="Arial" w:cs="Arial" w:eastAsia="Arial" w:hAnsi="Arial"/>
-          <w:color w:val="595959"/>
+        <w:t xml:space="preserve">The Bone Sparrow — Analytical Paragraph Writing (folio)</w:t>
+      </w:r>
+    </w:p>
+    <w:p>
+      <w:pPr>
+        <w:spacing w:after="120"/>
+      </w:pPr>
+      <w:r>
+        <w:rPr>
+          <w:rFonts w:ascii="Arial" w:cs="Arial" w:eastAsia="Arial" w:hAnsi="Arial"/>
           <w:sz w:val="24"/>
           <w:szCs w:val="24"/>
         </w:rPr>
-        <w:t xml:space="preserve">Reading and Viewing</w:t>
-      </w:r>
-    </w:p>
-    <w:p>
-      <w:pPr>
-        <w:spacing w:after="200"/>
-      </w:pPr>
-      <w:r>
-        <w:rPr>
-          <w:rFonts w:ascii="Arial" w:cs="Arial" w:eastAsia="Arial" w:hAnsi="Arial"/>
-          <w:b/>
-          <w:bCs/>
-          <w:color w:val="595959"/>
-          <w:sz w:val="24"/>
-          <w:szCs w:val="24"/>
-        </w:rPr>
-        <w:t xml:space="preserve">CAT 2 · Option A</w:t>
-      </w:r>
-    </w:p>
-    <w:p>
-      <w:pPr>
-        <w:pBdr>
-          <w:bottom w:val="single" w:color="808080" w:sz="6"/>
-        </w:pBdr>
-        <w:spacing w:after="260"/>
+        <w:t xml:space="preserve">Write three folio pieces about The Bone Sparrow, one in each of three lessons. Each one is written in 30 minutes, under test conditions, on a prompt you are given at the start. The booklet gives you the model paragraph and starts the introduction for you. You write one paragraph of your own, and a second if you get there. Your teacher gives you feedback between the tasks, and you choose which task is marked.</w:t>
+      </w:r>
+    </w:p>
+    <w:p>
+      <w:pPr>
+        <w:spacing w:after="240" w:before="120"/>
       </w:pPr>
       <w:r>
         <w:rPr>
@@ -83,7 +50,7 @@
           <w:sz w:val="24"/>
           <w:szCs w:val="24"/>
         </w:rPr>
-        <w:t xml:space="preserve">  __________________________________    </w:t>
+        <w:t xml:space="preserve">  ______________________________    </w:t>
       </w:r>
       <w:r>
         <w:rPr>
@@ -101,7 +68,7 @@
           <w:sz w:val="24"/>
           <w:szCs w:val="24"/>
         </w:rPr>
-        <w:t xml:space="preserve">  ______________________    </w:t>
+        <w:t xml:space="preserve">  ________________    </w:t>
       </w:r>
     </w:p>
     <w:p>
@@ -116,12 +83,13 @@
           <w:sz w:val="26"/>
           <w:szCs w:val="26"/>
         </w:rPr>
-        <w:t xml:space="preserve">Task:</w:t>
-      </w:r>
-    </w:p>
-    <w:p>
-      <w:pPr>
-        <w:spacing w:after="120"/>
+        <w:t xml:space="preserve">You will need:</w:t>
+      </w:r>
+    </w:p>
+    <w:p>
+      <w:pPr>
+        <w:spacing w:after="80"/>
+        <w:ind w:left="400" w:hanging="220"/>
       </w:pPr>
       <w:r>
         <w:rPr>
@@ -129,7 +97,35 @@
           <w:sz w:val="24"/>
           <w:szCs w:val="24"/>
         </w:rPr>
-        <w:t xml:space="preserve">You will write three folio pieces about The Bone Sparrow. Each one is written in class in 30 minutes, and each one has its own prompt, which you are given at the start of the sitting. The booklet gives you the model paragraph and starts the introduction. You write one paragraph of your own, and a second one if you get there.</w:t>
+        <w:t xml:space="preserve">•	Your copy of the novel</w:t>
+      </w:r>
+    </w:p>
+    <w:p>
+      <w:pPr>
+        <w:spacing w:after="80"/>
+        <w:ind w:left="400" w:hanging="220"/>
+      </w:pPr>
+      <w:r>
+        <w:rPr>
+          <w:rFonts w:ascii="Arial" w:cs="Arial" w:eastAsia="Arial" w:hAnsi="Arial"/>
+          <w:sz w:val="24"/>
+          <w:szCs w:val="24"/>
+        </w:rPr>
+        <w:t xml:space="preserve">•	Your own notes</w:t>
+      </w:r>
+    </w:p>
+    <w:p>
+      <w:pPr>
+        <w:spacing w:after="80"/>
+        <w:ind w:left="400" w:hanging="220"/>
+      </w:pPr>
+      <w:r>
+        <w:rPr>
+          <w:rFonts w:ascii="Arial" w:cs="Arial" w:eastAsia="Arial" w:hAnsi="Arial"/>
+          <w:sz w:val="24"/>
+          <w:szCs w:val="24"/>
+        </w:rPr>
+        <w:t xml:space="preserve">•	The analytical writing wall</w:t>
       </w:r>
     </w:p>
     <w:p>
@@ -144,169 +140,12 @@
           <w:sz w:val="26"/>
           <w:szCs w:val="26"/>
         </w:rPr>
-        <w:t xml:space="preserve">Purpose:</w:t>
-      </w:r>
-    </w:p>
-    <w:p>
-      <w:pPr>
-        <w:spacing w:after="120"/>
-      </w:pPr>
-      <w:r>
-        <w:rPr>
-          <w:rFonts w:ascii="Arial" w:cs="Arial" w:eastAsia="Arial" w:hAnsi="Arial"/>
-          <w:sz w:val="24"/>
-          <w:szCs w:val="24"/>
-        </w:rPr>
-        <w:t xml:space="preserve">To explain an idea in the novel, and show how Fraillon’s writing puts that idea in front of the reader.</w:t>
-      </w:r>
-    </w:p>
-    <w:p>
-      <w:pPr>
-        <w:spacing w:after="80" w:before="220"/>
-      </w:pPr>
-      <w:r>
-        <w:rPr>
-          <w:rFonts w:ascii="Arial" w:cs="Arial" w:eastAsia="Arial" w:hAnsi="Arial"/>
-          <w:b/>
-          <w:bCs/>
-          <w:sz w:val="26"/>
-          <w:szCs w:val="26"/>
-        </w:rPr>
-        <w:t xml:space="preserve">Audience:</w:t>
-      </w:r>
-    </w:p>
-    <w:p>
-      <w:pPr>
-        <w:spacing w:after="120"/>
-      </w:pPr>
-      <w:r>
-        <w:rPr>
-          <w:rFonts w:ascii="Arial" w:cs="Arial" w:eastAsia="Arial" w:hAnsi="Arial"/>
-          <w:sz w:val="24"/>
-          <w:szCs w:val="24"/>
-        </w:rPr>
-        <w:t xml:space="preserve">Your teacher, and a reader who has already read the novel. You do not need to retell the story.</w:t>
-      </w:r>
-    </w:p>
-    <w:p>
-      <w:pPr>
-        <w:spacing w:after="80" w:before="220"/>
-      </w:pPr>
-      <w:r>
-        <w:rPr>
-          <w:rFonts w:ascii="Arial" w:cs="Arial" w:eastAsia="Arial" w:hAnsi="Arial"/>
-          <w:b/>
-          <w:bCs/>
-          <w:sz w:val="26"/>
-          <w:szCs w:val="26"/>
-        </w:rPr>
-        <w:t xml:space="preserve">Time:</w:t>
-      </w:r>
-    </w:p>
-    <w:p>
-      <w:pPr>
-        <w:spacing w:after="80"/>
-        <w:ind w:left="400" w:hanging="220"/>
-      </w:pPr>
-      <w:r>
-        <w:rPr>
-          <w:rFonts w:ascii="Arial" w:cs="Arial" w:eastAsia="Arial" w:hAnsi="Arial"/>
-          <w:sz w:val="24"/>
-          <w:szCs w:val="24"/>
-        </w:rPr>
-        <w:t xml:space="preserve">•	Three sittings of 30 minutes, one for each task, on separate days.</w:t>
-      </w:r>
-    </w:p>
-    <w:p>
-      <w:pPr>
-        <w:spacing w:after="80"/>
-        <w:ind w:left="400" w:hanging="220"/>
-      </w:pPr>
-      <w:r>
-        <w:rPr>
-          <w:rFonts w:ascii="Arial" w:cs="Arial" w:eastAsia="Arial" w:hAnsi="Arial"/>
-          <w:sz w:val="24"/>
-          <w:szCs w:val="24"/>
-        </w:rPr>
-        <w:t xml:space="preserve">•	Between the tasks your teacher gives you feedback on what you wrote, and you set yourself one thing to do better.</w:t>
-      </w:r>
-    </w:p>
-    <w:p>
-      <w:pPr>
-        <w:spacing w:after="80" w:before="220"/>
-      </w:pPr>
-      <w:r>
-        <w:rPr>
-          <w:rFonts w:ascii="Arial" w:cs="Arial" w:eastAsia="Arial" w:hAnsi="Arial"/>
-          <w:b/>
-          <w:bCs/>
-          <w:sz w:val="26"/>
-          <w:szCs w:val="26"/>
-        </w:rPr>
-        <w:t xml:space="preserve">Conditions:</w:t>
-      </w:r>
-    </w:p>
-    <w:p>
-      <w:pPr>
-        <w:spacing w:after="80"/>
-        <w:ind w:left="400" w:hanging="220"/>
-      </w:pPr>
-      <w:r>
-        <w:rPr>
-          <w:rFonts w:ascii="Arial" w:cs="Arial" w:eastAsia="Arial" w:hAnsi="Arial"/>
-          <w:sz w:val="24"/>
-          <w:szCs w:val="24"/>
-        </w:rPr>
-        <w:t xml:space="preserve">•	Written in class under test conditions. You work on your own and your teacher does not help you draft.</w:t>
-      </w:r>
-    </w:p>
-    <w:p>
-      <w:pPr>
-        <w:spacing w:after="80"/>
-        <w:ind w:left="400" w:hanging="220"/>
-      </w:pPr>
-      <w:r>
-        <w:rPr>
-          <w:rFonts w:ascii="Arial" w:cs="Arial" w:eastAsia="Arial" w:hAnsi="Arial"/>
-          <w:sz w:val="24"/>
-          <w:szCs w:val="24"/>
-        </w:rPr>
-        <w:t xml:space="preserve">•	On your desk: your copy of the novel, your own notes, and the analytical writing wall.</w:t>
-      </w:r>
-    </w:p>
-    <w:p>
-      <w:pPr>
-        <w:spacing w:after="80"/>
-        <w:ind w:left="400" w:hanging="220"/>
-      </w:pPr>
-      <w:r>
-        <w:rPr>
-          <w:rFonts w:ascii="Arial" w:cs="Arial" w:eastAsia="Arial" w:hAnsi="Arial"/>
-          <w:sz w:val="24"/>
-          <w:szCs w:val="24"/>
-        </w:rPr>
-        <w:t xml:space="preserve">•	The first paragraph is printed in the booklet. Read it before you start.</w:t>
-      </w:r>
-    </w:p>
-    <w:p>
-      <w:pPr>
-        <w:spacing w:after="80" w:before="220"/>
-      </w:pPr>
-      <w:r>
-        <w:rPr>
-          <w:rFonts w:ascii="Arial" w:cs="Arial" w:eastAsia="Arial" w:hAnsi="Arial"/>
-          <w:b/>
-          <w:bCs/>
-          <w:sz w:val="26"/>
-          <w:szCs w:val="26"/>
-        </w:rPr>
-        <w:t xml:space="preserve">You must:</w:t>
-      </w:r>
-    </w:p>
-    <w:p>
-      <w:pPr>
-        <w:spacing w:after="100"/>
-        <w:ind w:left="400" w:hanging="400"/>
+        <w:t xml:space="preserve">You can use this structure to help you:</w:t>
+      </w:r>
+    </w:p>
+    <w:p>
+      <w:pPr>
+        <w:spacing w:after="40"/>
       </w:pPr>
       <w:r>
         <w:rPr>
@@ -316,8 +155,41 @@
           <w:sz w:val="24"/>
           <w:szCs w:val="24"/>
         </w:rPr>
-        <w:t xml:space="preserve">1.	</w:t>
-      </w:r>
+        <w:t xml:space="preserve">Introduction</w:t>
+      </w:r>
+    </w:p>
+    <w:p>
+      <w:pPr>
+        <w:spacing w:after="80"/>
+        <w:ind w:left="400" w:hanging="220"/>
+      </w:pPr>
+      <w:r>
+        <w:rPr>
+          <w:rFonts w:ascii="Arial" w:cs="Arial" w:eastAsia="Arial" w:hAnsi="Arial"/>
+          <w:sz w:val="24"/>
+          <w:szCs w:val="24"/>
+        </w:rPr>
+        <w:t xml:space="preserve">•	The big idea sentence is written for you</w:t>
+      </w:r>
+    </w:p>
+    <w:p>
+      <w:pPr>
+        <w:spacing w:after="80"/>
+        <w:ind w:left="400" w:hanging="220"/>
+      </w:pPr>
+      <w:r>
+        <w:rPr>
+          <w:rFonts w:ascii="Arial" w:cs="Arial" w:eastAsia="Arial" w:hAnsi="Arial"/>
+          <w:sz w:val="24"/>
+          <w:szCs w:val="24"/>
+        </w:rPr>
+        <w:t xml:space="preserve">•	Add the ideas your paragraphs will be about</w:t>
+      </w:r>
+    </w:p>
+    <w:p>
+      <w:pPr>
+        <w:spacing w:after="40" w:before="80"/>
+      </w:pPr>
       <w:r>
         <w:rPr>
           <w:rFonts w:ascii="Arial" w:cs="Arial" w:eastAsia="Arial" w:hAnsi="Arial"/>
@@ -326,21 +198,68 @@
           <w:sz w:val="24"/>
           <w:szCs w:val="24"/>
         </w:rPr>
-        <w:t xml:space="preserve">Finish the introduction.</w:t>
-      </w:r>
+        <w:t xml:space="preserve">Body paragraphs</w:t>
+      </w:r>
+    </w:p>
+    <w:p>
+      <w:pPr>
+        <w:spacing w:after="80"/>
+        <w:ind w:left="400" w:hanging="220"/>
+      </w:pPr>
       <w:r>
         <w:rPr>
           <w:rFonts w:ascii="Arial" w:cs="Arial" w:eastAsia="Arial" w:hAnsi="Arial"/>
           <w:sz w:val="24"/>
           <w:szCs w:val="24"/>
         </w:rPr>
-        <w:t xml:space="preserve">  The first idea is written in. Add the two ideas your paragraphs will be about.</w:t>
-      </w:r>
-    </w:p>
-    <w:p>
-      <w:pPr>
-        <w:spacing w:after="100"/>
-        <w:ind w:left="400" w:hanging="400"/>
+        <w:t xml:space="preserve">•	Each paragraph is about one idea</w:t>
+      </w:r>
+    </w:p>
+    <w:p>
+      <w:pPr>
+        <w:spacing w:after="80"/>
+        <w:ind w:left="400" w:hanging="220"/>
+      </w:pPr>
+      <w:r>
+        <w:rPr>
+          <w:rFonts w:ascii="Arial" w:cs="Arial" w:eastAsia="Arial" w:hAnsi="Arial"/>
+          <w:sz w:val="24"/>
+          <w:szCs w:val="24"/>
+        </w:rPr>
+        <w:t xml:space="preserve">•	Use TEEL — topic sentence, evidence, explanation, link</w:t>
+      </w:r>
+    </w:p>
+    <w:p>
+      <w:pPr>
+        <w:spacing w:after="80"/>
+        <w:ind w:left="400" w:hanging="220"/>
+      </w:pPr>
+      <w:r>
+        <w:rPr>
+          <w:rFonts w:ascii="Arial" w:cs="Arial" w:eastAsia="Arial" w:hAnsi="Arial"/>
+          <w:sz w:val="24"/>
+          <w:szCs w:val="24"/>
+        </w:rPr>
+        <w:t xml:space="preserve">•	Put the quote inside a sentence of your own</w:t>
+      </w:r>
+    </w:p>
+    <w:p>
+      <w:pPr>
+        <w:spacing w:after="80"/>
+        <w:ind w:left="400" w:hanging="220"/>
+      </w:pPr>
+      <w:r>
+        <w:rPr>
+          <w:rFonts w:ascii="Arial" w:cs="Arial" w:eastAsia="Arial" w:hAnsi="Arial"/>
+          <w:sz w:val="24"/>
+          <w:szCs w:val="24"/>
+        </w:rPr>
+        <w:t xml:space="preserve">•	Explain what Fraillon’s writing does to the reader, not what happens in the story</w:t>
+      </w:r>
+    </w:p>
+    <w:p>
+      <w:pPr>
+        <w:spacing w:after="40" w:before="80"/>
       </w:pPr>
       <w:r>
         <w:rPr>
@@ -350,223 +269,21 @@
           <w:sz w:val="24"/>
           <w:szCs w:val="24"/>
         </w:rPr>
-        <w:t xml:space="preserve">2.	</w:t>
-      </w:r>
-      <w:r>
-        <w:rPr>
-          <w:rFonts w:ascii="Arial" w:cs="Arial" w:eastAsia="Arial" w:hAnsi="Arial"/>
-          <w:b/>
-          <w:bCs/>
+        <w:t xml:space="preserve">Conclusion</w:t>
+      </w:r>
+    </w:p>
+    <w:p>
+      <w:pPr>
+        <w:spacing w:after="80"/>
+        <w:ind w:left="400" w:hanging="220"/>
+      </w:pPr>
+      <w:r>
+        <w:rPr>
+          <w:rFonts w:ascii="Arial" w:cs="Arial" w:eastAsia="Arial" w:hAnsi="Arial"/>
           <w:sz w:val="24"/>
           <w:szCs w:val="24"/>
         </w:rPr>
-        <w:t xml:space="preserve">Write your paragraph.</w:t>
-      </w:r>
-      <w:r>
-        <w:rPr>
-          <w:rFonts w:ascii="Arial" w:cs="Arial" w:eastAsia="Arial" w:hAnsi="Arial"/>
-          <w:sz w:val="24"/>
-          <w:szCs w:val="24"/>
-        </w:rPr>
-        <w:t xml:space="preserve">  One idea. The model shows you the shape. Write a second paragraph if you get there.</w:t>
-      </w:r>
-    </w:p>
-    <w:p>
-      <w:pPr>
-        <w:spacing w:after="100"/>
-        <w:ind w:left="400" w:hanging="400"/>
-      </w:pPr>
-      <w:r>
-        <w:rPr>
-          <w:rFonts w:ascii="Arial" w:cs="Arial" w:eastAsia="Arial" w:hAnsi="Arial"/>
-          <w:b/>
-          <w:bCs/>
-          <w:sz w:val="24"/>
-          <w:szCs w:val="24"/>
-        </w:rPr>
-        <w:t xml:space="preserve">3.	</w:t>
-      </w:r>
-      <w:r>
-        <w:rPr>
-          <w:rFonts w:ascii="Arial" w:cs="Arial" w:eastAsia="Arial" w:hAnsi="Arial"/>
-          <w:b/>
-          <w:bCs/>
-          <w:sz w:val="24"/>
-          <w:szCs w:val="24"/>
-        </w:rPr>
-        <w:t xml:space="preserve">Use the TEEL structure.</w:t>
-      </w:r>
-      <w:r>
-        <w:rPr>
-          <w:rFonts w:ascii="Arial" w:cs="Arial" w:eastAsia="Arial" w:hAnsi="Arial"/>
-          <w:sz w:val="24"/>
-          <w:szCs w:val="24"/>
-        </w:rPr>
-        <w:t xml:space="preserve">  Topic sentence, evidence, explanation, link. Your last sentence must say more than your first one did.</w:t>
-      </w:r>
-    </w:p>
-    <w:p>
-      <w:pPr>
-        <w:spacing w:after="100"/>
-        <w:ind w:left="400" w:hanging="400"/>
-      </w:pPr>
-      <w:r>
-        <w:rPr>
-          <w:rFonts w:ascii="Arial" w:cs="Arial" w:eastAsia="Arial" w:hAnsi="Arial"/>
-          <w:b/>
-          <w:bCs/>
-          <w:sz w:val="24"/>
-          <w:szCs w:val="24"/>
-        </w:rPr>
-        <w:t xml:space="preserve">4.	</w:t>
-      </w:r>
-      <w:r>
-        <w:rPr>
-          <w:rFonts w:ascii="Arial" w:cs="Arial" w:eastAsia="Arial" w:hAnsi="Arial"/>
-          <w:b/>
-          <w:bCs/>
-          <w:sz w:val="24"/>
-          <w:szCs w:val="24"/>
-        </w:rPr>
-        <w:t xml:space="preserve">Embed your evidence.</w:t>
-      </w:r>
-      <w:r>
-        <w:rPr>
-          <w:rFonts w:ascii="Arial" w:cs="Arial" w:eastAsia="Arial" w:hAnsi="Arial"/>
-          <w:sz w:val="24"/>
-          <w:szCs w:val="24"/>
-        </w:rPr>
-        <w:t xml:space="preserve">  The quote goes inside a sentence of your own. Do not leave it sitting on its own line.</w:t>
-      </w:r>
-    </w:p>
-    <w:p>
-      <w:pPr>
-        <w:spacing w:after="100"/>
-        <w:ind w:left="400" w:hanging="400"/>
-      </w:pPr>
-      <w:r>
-        <w:rPr>
-          <w:rFonts w:ascii="Arial" w:cs="Arial" w:eastAsia="Arial" w:hAnsi="Arial"/>
-          <w:b/>
-          <w:bCs/>
-          <w:sz w:val="24"/>
-          <w:szCs w:val="24"/>
-        </w:rPr>
-        <w:t xml:space="preserve">5.	</w:t>
-      </w:r>
-      <w:r>
-        <w:rPr>
-          <w:rFonts w:ascii="Arial" w:cs="Arial" w:eastAsia="Arial" w:hAnsi="Arial"/>
-          <w:b/>
-          <w:bCs/>
-          <w:sz w:val="24"/>
-          <w:szCs w:val="24"/>
-        </w:rPr>
-        <w:t xml:space="preserve">Write about the writing, not the story.</w:t>
-      </w:r>
-      <w:r>
-        <w:rPr>
-          <w:rFonts w:ascii="Arial" w:cs="Arial" w:eastAsia="Arial" w:hAnsi="Arial"/>
-          <w:sz w:val="24"/>
-          <w:szCs w:val="24"/>
-        </w:rPr>
-        <w:t xml:space="preserve">  Your reader has read the novel. Explain what Fraillon’s writing does to them.</w:t>
-      </w:r>
-    </w:p>
-    <w:p>
-      <w:pPr>
-        <w:spacing w:after="100"/>
-        <w:ind w:left="400" w:hanging="400"/>
-      </w:pPr>
-      <w:r>
-        <w:rPr>
-          <w:rFonts w:ascii="Arial" w:cs="Arial" w:eastAsia="Arial" w:hAnsi="Arial"/>
-          <w:b/>
-          <w:bCs/>
-          <w:sz w:val="24"/>
-          <w:szCs w:val="24"/>
-        </w:rPr>
-        <w:t xml:space="preserve">6.	</w:t>
-      </w:r>
-      <w:r>
-        <w:rPr>
-          <w:rFonts w:ascii="Arial" w:cs="Arial" w:eastAsia="Arial" w:hAnsi="Arial"/>
-          <w:b/>
-          <w:bCs/>
-          <w:sz w:val="24"/>
-          <w:szCs w:val="24"/>
-        </w:rPr>
-        <w:t xml:space="preserve">Check your paragraph before you hand it in.</w:t>
-      </w:r>
-      <w:r>
-        <w:rPr>
-          <w:rFonts w:ascii="Arial" w:cs="Arial" w:eastAsia="Arial" w:hAnsi="Arial"/>
-          <w:sz w:val="24"/>
-          <w:szCs w:val="24"/>
-        </w:rPr>
-        <w:t xml:space="preserve">  Colour the parts: idea, evidence, analytical verb, effect. If a part is missing, write it in.</w:t>
-      </w:r>
-    </w:p>
-    <w:p>
-      <w:pPr>
-        <w:spacing w:after="100"/>
-        <w:ind w:left="400" w:hanging="400"/>
-      </w:pPr>
-      <w:r>
-        <w:rPr>
-          <w:rFonts w:ascii="Arial" w:cs="Arial" w:eastAsia="Arial" w:hAnsi="Arial"/>
-          <w:b/>
-          <w:bCs/>
-          <w:sz w:val="24"/>
-          <w:szCs w:val="24"/>
-        </w:rPr>
-        <w:t xml:space="preserve">7.	</w:t>
-      </w:r>
-      <w:r>
-        <w:rPr>
-          <w:rFonts w:ascii="Arial" w:cs="Arial" w:eastAsia="Arial" w:hAnsi="Arial"/>
-          <w:b/>
-          <w:bCs/>
-          <w:sz w:val="24"/>
-          <w:szCs w:val="24"/>
-        </w:rPr>
-        <w:t xml:space="preserve">Fill in the self assessment at the back.</w:t>
-      </w:r>
-      <w:r>
-        <w:rPr>
-          <w:rFonts w:ascii="Arial" w:cs="Arial" w:eastAsia="Arial" w:hAnsi="Arial"/>
-          <w:sz w:val="24"/>
-          <w:szCs w:val="24"/>
-        </w:rPr>
-        <w:t xml:space="preserve">  Tick a box in each row, and write the one thing you will do better next time.</w:t>
-      </w:r>
-    </w:p>
-    <w:p>
-      <w:pPr>
-        <w:spacing w:after="80"/>
-      </w:pPr>
-      <w:r>
-        <w:rPr>
-          <w:rFonts w:ascii="Arial" w:cs="Arial" w:eastAsia="Arial" w:hAnsi="Arial"/>
-          <w:sz w:val="24"/>
-          <w:szCs w:val="24"/>
-        </w:rPr>
-        <w:t xml:space="preserve"/>
-      </w:r>
-    </w:p>
-    <w:p>
-      <w:pPr>
-        <w:spacing w:after="120"/>
-      </w:pPr>
-      <w:r>
-        <w:rPr>
-          <w:rFonts w:ascii="Arial" w:cs="Arial" w:eastAsia="Arial" w:hAnsi="Arial"/>
-          <w:i/>
-          <w:iCs/>
-          <w:sz w:val="24"/>
-          <w:szCs w:val="24"/>
-        </w:rPr>
-        <w:t xml:space="preserve">Use the attached rubric to ensure that you are meeting the expected criteria.</w:t>
+        <w:t xml:space="preserve">•	Put your ideas back together — no new quotes</w:t>
       </w:r>
     </w:p>
     <w:p>
@@ -949,7 +666,7 @@
           <w:sz w:val="26"/>
           <w:szCs w:val="26"/>
         </w:rPr>
-        <w:t xml:space="preserve">Before you hand it in</w:t>
+        <w:t xml:space="preserve">Before you hand it in:</w:t>
       </w:r>
     </w:p>
     <w:p>
@@ -964,20 +681,6 @@
           <w:szCs w:val="24"/>
         </w:rPr>
         <w:t xml:space="preserve">•	Read your paragraphs out loud. Does every sentence say something about the idea?</w:t>
-      </w:r>
-    </w:p>
-    <w:p>
-      <w:pPr>
-        <w:spacing w:after="80"/>
-        <w:ind w:left="400" w:hanging="220"/>
-      </w:pPr>
-      <w:r>
-        <w:rPr>
-          <w:rFonts w:ascii="Arial" w:cs="Arial" w:eastAsia="Arial" w:hAnsi="Arial"/>
-          <w:sz w:val="24"/>
-          <w:szCs w:val="24"/>
-        </w:rPr>
-        <w:t xml:space="preserve">•	Colour the parts: idea, language feature, evidence, effect on the reader.</w:t>
       </w:r>
     </w:p>
     <w:p>
@@ -1016,7 +719,7 @@
           <w:sz w:val="28"/>
           <w:szCs w:val="28"/>
         </w:rPr>
-        <w:t xml:space="preserve">The Bone Sparrow — Analytical Paragraph Writing · Option A (folio)</w:t>
+        <w:t xml:space="preserve">The Bone Sparrow — Analytical Paragraph Writing (folio)</w:t>
       </w:r>
     </w:p>
     <w:p>
@@ -2056,7 +1759,7 @@
     </w:p>
     <w:p>
       <w:pPr>
-        <w:spacing w:after="60"/>
+        <w:spacing w:after="160"/>
       </w:pPr>
       <w:r>
         <w:rPr>
@@ -2066,23 +1769,7 @@
           <w:sz w:val="28"/>
           <w:szCs w:val="28"/>
         </w:rPr>
-        <w:t xml:space="preserve">The Bone Sparrow — Analytical Paragraph Writing · Option A (folio)</w:t>
-      </w:r>
-    </w:p>
-    <w:p>
-      <w:pPr>
-        <w:spacing w:after="160"/>
-      </w:pPr>
-      <w:r>
-        <w:rPr>
-          <w:rFonts w:ascii="Arial" w:cs="Arial" w:eastAsia="Arial" w:hAnsi="Arial"/>
-          <w:b/>
-          <w:bCs/>
-          <w:color w:val="595959"/>
-          <w:sz w:val="24"/>
-          <w:szCs w:val="24"/>
-        </w:rPr>
-        <w:t xml:space="preserve">RUBRIC · EAL</w:t>
+        <w:t xml:space="preserve">Rubric · EAL</w:t>
       </w:r>
       <w:r>
         <w:rPr>
@@ -2113,7 +1800,7 @@
     </w:p>
     <w:tbl>
       <w:tblPr>
-        <w:tblW w:type="dxa" w:w="15398"/>
+        <w:tblW w:type="dxa" w:w="10466"/>
         <w:tblBorders>
           <w:top w:val="single" w:color="808080" w:sz="6"/>
           <w:left w:val="single" w:color="808080" w:sz="6"/>
@@ -2125,10 +1812,9 @@
       </w:tblPr>
       <w:tblGrid>
         <w:gridCol w:w="3000"/>
-        <w:gridCol w:w="3099"/>
-        <w:gridCol w:w="3099"/>
-        <w:gridCol w:w="3099"/>
-        <w:gridCol w:w="3099"/>
+        <w:gridCol w:w="2488"/>
+        <w:gridCol w:w="2488"/>
+        <w:gridCol w:w="2488"/>
       </w:tblGrid>
       <w:tr>
         <w:trPr>
@@ -2163,7 +1849,7 @@
         </w:tc>
         <w:tc>
           <w:tcPr>
-            <w:tcW w:type="dxa" w:w="3099"/>
+            <w:tcW w:type="dxa" w:w="2488"/>
             <w:shd w:fill="D9D9D9" w:color="auto" w:val="clear"/>
             <w:tcMar>
               <w:top w:type="dxa" w:w="70"/>
@@ -2190,7 +1876,7 @@
         </w:tc>
         <w:tc>
           <w:tcPr>
-            <w:tcW w:type="dxa" w:w="3099"/>
+            <w:tcW w:type="dxa" w:w="2488"/>
             <w:shd w:fill="D9D9D9" w:color="auto" w:val="clear"/>
             <w:tcMar>
               <w:top w:type="dxa" w:w="70"/>
@@ -2217,7 +1903,7 @@
         </w:tc>
         <w:tc>
           <w:tcPr>
-            <w:tcW w:type="dxa" w:w="3099"/>
+            <w:tcW w:type="dxa" w:w="2488"/>
             <w:shd w:fill="D9D9D9" w:color="auto" w:val="clear"/>
             <w:tcMar>
               <w:top w:type="dxa" w:w="70"/>
@@ -2242,10 +1928,12 @@
             </w:r>
           </w:p>
         </w:tc>
-        <w:tc>
-          <w:tcPr>
-            <w:tcW w:type="dxa" w:w="3099"/>
-            <w:shd w:fill="D9D9D9" w:color="auto" w:val="clear"/>
+      </w:tr>
+      <w:tr>
+        <w:tc>
+          <w:tcPr>
+            <w:tcW w:type="dxa" w:w="3000"/>
+            <w:shd w:fill="D6EAFC" w:color="auto" w:val="clear"/>
             <w:tcMar>
               <w:top w:type="dxa" w:w="70"/>
               <w:left w:type="dxa" w:w="90"/>
@@ -2265,7 +1953,82 @@
                 <w:sz w:val="18"/>
                 <w:szCs w:val="18"/>
               </w:rPr>
-              <w:t xml:space="preserve">VCE 1</w:t>
+              <w:t xml:space="preserve">Ideas &amp; Themes</w:t>
+            </w:r>
+          </w:p>
+        </w:tc>
+        <w:tc>
+          <w:tcPr>
+            <w:tcW w:type="dxa" w:w="2488"/>
+            <w:shd w:fill="EAF4FD" w:color="auto" w:val="clear"/>
+            <w:tcMar>
+              <w:top w:type="dxa" w:w="70"/>
+              <w:left w:type="dxa" w:w="90"/>
+              <w:bottom w:type="dxa" w:w="70"/>
+              <w:right w:type="dxa" w:w="90"/>
+            </w:tcMar>
+          </w:tcPr>
+          <w:p>
+            <w:pPr>
+              <w:spacing w:after="0"/>
+            </w:pPr>
+            <w:r>
+              <w:rPr>
+                <w:rFonts w:ascii="Arial" w:cs="Arial" w:eastAsia="Arial" w:hAnsi="Arial"/>
+                <w:sz w:val="17"/>
+                <w:szCs w:val="17"/>
+              </w:rPr>
+              <w:t xml:space="preserve">Recognises what happens in the text. Retells key details with little interpretation.</w:t>
+            </w:r>
+          </w:p>
+        </w:tc>
+        <w:tc>
+          <w:tcPr>
+            <w:tcW w:type="dxa" w:w="2488"/>
+            <w:shd w:fill="EAF4FD" w:color="auto" w:val="clear"/>
+            <w:tcMar>
+              <w:top w:type="dxa" w:w="70"/>
+              <w:left w:type="dxa" w:w="90"/>
+              <w:bottom w:type="dxa" w:w="70"/>
+              <w:right w:type="dxa" w:w="90"/>
+            </w:tcMar>
+          </w:tcPr>
+          <w:p>
+            <w:pPr>
+              <w:spacing w:after="0"/>
+            </w:pPr>
+            <w:r>
+              <w:rPr>
+                <w:rFonts w:ascii="Arial" w:cs="Arial" w:eastAsia="Arial" w:hAnsi="Arial"/>
+                <w:sz w:val="17"/>
+                <w:szCs w:val="17"/>
+              </w:rPr>
+              <w:t xml:space="preserve">Explains basic feelings or ideas suggested by the text. Begins linking choices to simple themes.</w:t>
+            </w:r>
+          </w:p>
+        </w:tc>
+        <w:tc>
+          <w:tcPr>
+            <w:tcW w:type="dxa" w:w="2488"/>
+            <w:shd w:fill="EAF4FD" w:color="auto" w:val="clear"/>
+            <w:tcMar>
+              <w:top w:type="dxa" w:w="70"/>
+              <w:left w:type="dxa" w:w="90"/>
+              <w:bottom w:type="dxa" w:w="70"/>
+              <w:right w:type="dxa" w:w="90"/>
+            </w:tcMar>
+          </w:tcPr>
+          <w:p>
+            <w:pPr>
+              <w:spacing w:after="0"/>
+            </w:pPr>
+            <w:r>
+              <w:rPr>
+                <w:rFonts w:ascii="Arial" w:cs="Arial" w:eastAsia="Arial" w:hAnsi="Arial"/>
+                <w:sz w:val="17"/>
+                <w:szCs w:val="17"/>
+              </w:rPr>
+              <w:t xml:space="preserve">Connects specific language choices to themes or concepts. Explains what the creator might be saying.</w:t>
             </w:r>
           </w:p>
         </w:tc>
@@ -2274,7 +2037,7 @@
         <w:tc>
           <w:tcPr>
             <w:tcW w:type="dxa" w:w="3000"/>
-            <w:shd w:fill="D6EAFC" w:color="auto" w:val="clear"/>
+            <w:shd w:fill="FFF3B0" w:color="auto" w:val="clear"/>
             <w:tcMar>
               <w:top w:type="dxa" w:w="70"/>
               <w:left w:type="dxa" w:w="90"/>
@@ -2294,107 +2057,82 @@
                 <w:sz w:val="18"/>
                 <w:szCs w:val="18"/>
               </w:rPr>
-              <w:t xml:space="preserve">Ideas &amp; Themes</w:t>
-            </w:r>
-          </w:p>
-        </w:tc>
-        <w:tc>
-          <w:tcPr>
-            <w:tcW w:type="dxa" w:w="3099"/>
-            <w:shd w:fill="EAF4FD" w:color="auto" w:val="clear"/>
-            <w:tcMar>
-              <w:top w:type="dxa" w:w="70"/>
-              <w:left w:type="dxa" w:w="90"/>
-              <w:bottom w:type="dxa" w:w="70"/>
-              <w:right w:type="dxa" w:w="90"/>
-            </w:tcMar>
-          </w:tcPr>
-          <w:p>
-            <w:pPr>
-              <w:spacing w:after="0"/>
-            </w:pPr>
-            <w:r>
-              <w:rPr>
-                <w:rFonts w:ascii="Arial" w:cs="Arial" w:eastAsia="Arial" w:hAnsi="Arial"/>
-                <w:sz w:val="17"/>
-                <w:szCs w:val="17"/>
-              </w:rPr>
-              <w:t xml:space="preserve">Recognises what happens in the text. Retells key details with little interpretation.</w:t>
-            </w:r>
-          </w:p>
-        </w:tc>
-        <w:tc>
-          <w:tcPr>
-            <w:tcW w:type="dxa" w:w="3099"/>
-            <w:shd w:fill="EAF4FD" w:color="auto" w:val="clear"/>
-            <w:tcMar>
-              <w:top w:type="dxa" w:w="70"/>
-              <w:left w:type="dxa" w:w="90"/>
-              <w:bottom w:type="dxa" w:w="70"/>
-              <w:right w:type="dxa" w:w="90"/>
-            </w:tcMar>
-          </w:tcPr>
-          <w:p>
-            <w:pPr>
-              <w:spacing w:after="0"/>
-            </w:pPr>
-            <w:r>
-              <w:rPr>
-                <w:rFonts w:ascii="Arial" w:cs="Arial" w:eastAsia="Arial" w:hAnsi="Arial"/>
-                <w:sz w:val="17"/>
-                <w:szCs w:val="17"/>
-              </w:rPr>
-              <w:t xml:space="preserve">Explains basic feelings or ideas suggested by the text. Begins linking choices to simple themes.</w:t>
-            </w:r>
-          </w:p>
-        </w:tc>
-        <w:tc>
-          <w:tcPr>
-            <w:tcW w:type="dxa" w:w="3099"/>
-            <w:shd w:fill="EAF4FD" w:color="auto" w:val="clear"/>
-            <w:tcMar>
-              <w:top w:type="dxa" w:w="70"/>
-              <w:left w:type="dxa" w:w="90"/>
-              <w:bottom w:type="dxa" w:w="70"/>
-              <w:right w:type="dxa" w:w="90"/>
-            </w:tcMar>
-          </w:tcPr>
-          <w:p>
-            <w:pPr>
-              <w:spacing w:after="0"/>
-            </w:pPr>
-            <w:r>
-              <w:rPr>
-                <w:rFonts w:ascii="Arial" w:cs="Arial" w:eastAsia="Arial" w:hAnsi="Arial"/>
-                <w:sz w:val="17"/>
-                <w:szCs w:val="17"/>
-              </w:rPr>
-              <w:t xml:space="preserve">Connects specific language choices to themes or concepts. Explains what the creator might be saying.</w:t>
-            </w:r>
-          </w:p>
-        </w:tc>
-        <w:tc>
-          <w:tcPr>
-            <w:tcW w:type="dxa" w:w="3099"/>
-            <w:shd w:fill="EAF4FD" w:color="auto" w:val="clear"/>
-            <w:tcMar>
-              <w:top w:type="dxa" w:w="70"/>
-              <w:left w:type="dxa" w:w="90"/>
-              <w:bottom w:type="dxa" w:w="70"/>
-              <w:right w:type="dxa" w:w="90"/>
-            </w:tcMar>
-          </w:tcPr>
-          <w:p>
-            <w:pPr>
-              <w:spacing w:after="0"/>
-            </w:pPr>
-            <w:r>
-              <w:rPr>
-                <w:rFonts w:ascii="Arial" w:cs="Arial" w:eastAsia="Arial" w:hAnsi="Arial"/>
-                <w:sz w:val="17"/>
-                <w:szCs w:val="17"/>
-              </w:rPr>
-              <w:t xml:space="preserve">Analyses how choices express messages, values, or perspectives. Analyses the creator’s purpose in representing social or cultural issues.</w:t>
+              <w:t xml:space="preserve">Evidence &amp; Metalanguage</w:t>
+            </w:r>
+          </w:p>
+        </w:tc>
+        <w:tc>
+          <w:tcPr>
+            <w:tcW w:type="dxa" w:w="2488"/>
+            <w:shd w:fill="FFF9DC" w:color="auto" w:val="clear"/>
+            <w:tcMar>
+              <w:top w:type="dxa" w:w="70"/>
+              <w:left w:type="dxa" w:w="90"/>
+              <w:bottom w:type="dxa" w:w="70"/>
+              <w:right w:type="dxa" w:w="90"/>
+            </w:tcMar>
+          </w:tcPr>
+          <w:p>
+            <w:pPr>
+              <w:spacing w:after="0"/>
+            </w:pPr>
+            <w:r>
+              <w:rPr>
+                <w:rFonts w:ascii="Arial" w:cs="Arial" w:eastAsia="Arial" w:hAnsi="Arial"/>
+                <w:sz w:val="17"/>
+                <w:szCs w:val="17"/>
+              </w:rPr>
+              <w:t xml:space="preserve">Gives a simple quote or description from the text.</w:t>
+            </w:r>
+          </w:p>
+        </w:tc>
+        <w:tc>
+          <w:tcPr>
+            <w:tcW w:type="dxa" w:w="2488"/>
+            <w:shd w:fill="FFF9DC" w:color="auto" w:val="clear"/>
+            <w:tcMar>
+              <w:top w:type="dxa" w:w="70"/>
+              <w:left w:type="dxa" w:w="90"/>
+              <w:bottom w:type="dxa" w:w="70"/>
+              <w:right w:type="dxa" w:w="90"/>
+            </w:tcMar>
+          </w:tcPr>
+          <w:p>
+            <w:pPr>
+              <w:spacing w:after="0"/>
+            </w:pPr>
+            <w:r>
+              <w:rPr>
+                <w:rFonts w:ascii="Arial" w:cs="Arial" w:eastAsia="Arial" w:hAnsi="Arial"/>
+                <w:sz w:val="17"/>
+                <w:szCs w:val="17"/>
+              </w:rPr>
+              <w:t xml:space="preserve">Names a language feature and begins linking it to meaning.</w:t>
+            </w:r>
+          </w:p>
+        </w:tc>
+        <w:tc>
+          <w:tcPr>
+            <w:tcW w:type="dxa" w:w="2488"/>
+            <w:shd w:fill="FFF9DC" w:color="auto" w:val="clear"/>
+            <w:tcMar>
+              <w:top w:type="dxa" w:w="70"/>
+              <w:left w:type="dxa" w:w="90"/>
+              <w:bottom w:type="dxa" w:w="70"/>
+              <w:right w:type="dxa" w:w="90"/>
+            </w:tcMar>
+          </w:tcPr>
+          <w:p>
+            <w:pPr>
+              <w:spacing w:after="0"/>
+            </w:pPr>
+            <w:r>
+              <w:rPr>
+                <w:rFonts w:ascii="Arial" w:cs="Arial" w:eastAsia="Arial" w:hAnsi="Arial"/>
+                <w:sz w:val="17"/>
+                <w:szCs w:val="17"/>
+              </w:rPr>
+              <w:t xml:space="preserve">Uses terminology accurately with short, embedded evidence.</w:t>
             </w:r>
           </w:p>
         </w:tc>
@@ -2403,7 +2141,7 @@
         <w:tc>
           <w:tcPr>
             <w:tcW w:type="dxa" w:w="3000"/>
-            <w:shd w:fill="FFF3B0" w:color="auto" w:val="clear"/>
+            <w:shd w:fill="F1EDE3" w:color="auto" w:val="clear"/>
             <w:tcMar>
               <w:top w:type="dxa" w:w="70"/>
               <w:left w:type="dxa" w:w="90"/>
@@ -2423,107 +2161,82 @@
                 <w:sz w:val="18"/>
                 <w:szCs w:val="18"/>
               </w:rPr>
-              <w:t xml:space="preserve">Evidence &amp; Metalanguage</w:t>
-            </w:r>
-          </w:p>
-        </w:tc>
-        <w:tc>
-          <w:tcPr>
-            <w:tcW w:type="dxa" w:w="3099"/>
-            <w:shd w:fill="FFF9DC" w:color="auto" w:val="clear"/>
-            <w:tcMar>
-              <w:top w:type="dxa" w:w="70"/>
-              <w:left w:type="dxa" w:w="90"/>
-              <w:bottom w:type="dxa" w:w="70"/>
-              <w:right w:type="dxa" w:w="90"/>
-            </w:tcMar>
-          </w:tcPr>
-          <w:p>
-            <w:pPr>
-              <w:spacing w:after="0"/>
-            </w:pPr>
-            <w:r>
-              <w:rPr>
-                <w:rFonts w:ascii="Arial" w:cs="Arial" w:eastAsia="Arial" w:hAnsi="Arial"/>
-                <w:sz w:val="17"/>
-                <w:szCs w:val="17"/>
-              </w:rPr>
-              <w:t xml:space="preserve">Gives a simple quote or description from the text.</w:t>
-            </w:r>
-          </w:p>
-        </w:tc>
-        <w:tc>
-          <w:tcPr>
-            <w:tcW w:type="dxa" w:w="3099"/>
-            <w:shd w:fill="FFF9DC" w:color="auto" w:val="clear"/>
-            <w:tcMar>
-              <w:top w:type="dxa" w:w="70"/>
-              <w:left w:type="dxa" w:w="90"/>
-              <w:bottom w:type="dxa" w:w="70"/>
-              <w:right w:type="dxa" w:w="90"/>
-            </w:tcMar>
-          </w:tcPr>
-          <w:p>
-            <w:pPr>
-              <w:spacing w:after="0"/>
-            </w:pPr>
-            <w:r>
-              <w:rPr>
-                <w:rFonts w:ascii="Arial" w:cs="Arial" w:eastAsia="Arial" w:hAnsi="Arial"/>
-                <w:sz w:val="17"/>
-                <w:szCs w:val="17"/>
-              </w:rPr>
-              <w:t xml:space="preserve">Names a language feature and begins linking it to meaning.</w:t>
-            </w:r>
-          </w:p>
-        </w:tc>
-        <w:tc>
-          <w:tcPr>
-            <w:tcW w:type="dxa" w:w="3099"/>
-            <w:shd w:fill="FFF9DC" w:color="auto" w:val="clear"/>
-            <w:tcMar>
-              <w:top w:type="dxa" w:w="70"/>
-              <w:left w:type="dxa" w:w="90"/>
-              <w:bottom w:type="dxa" w:w="70"/>
-              <w:right w:type="dxa" w:w="90"/>
-            </w:tcMar>
-          </w:tcPr>
-          <w:p>
-            <w:pPr>
-              <w:spacing w:after="0"/>
-            </w:pPr>
-            <w:r>
-              <w:rPr>
-                <w:rFonts w:ascii="Arial" w:cs="Arial" w:eastAsia="Arial" w:hAnsi="Arial"/>
-                <w:sz w:val="17"/>
-                <w:szCs w:val="17"/>
-              </w:rPr>
-              <w:t xml:space="preserve">Uses terminology accurately with short, embedded evidence.</w:t>
-            </w:r>
-          </w:p>
-        </w:tc>
-        <w:tc>
-          <w:tcPr>
-            <w:tcW w:type="dxa" w:w="3099"/>
-            <w:shd w:fill="FFF9DC" w:color="auto" w:val="clear"/>
-            <w:tcMar>
-              <w:top w:type="dxa" w:w="70"/>
-              <w:left w:type="dxa" w:w="90"/>
-              <w:bottom w:type="dxa" w:w="70"/>
-              <w:right w:type="dxa" w:w="90"/>
-            </w:tcMar>
-          </w:tcPr>
-          <w:p>
-            <w:pPr>
-              <w:spacing w:after="0"/>
-            </w:pPr>
-            <w:r>
-              <w:rPr>
-                <w:rFonts w:ascii="Arial" w:cs="Arial" w:eastAsia="Arial" w:hAnsi="Arial"/>
-                <w:sz w:val="17"/>
-                <w:szCs w:val="17"/>
-              </w:rPr>
-              <w:t xml:space="preserve">Integrates evidence and metalanguage fluently to build interpretation.</w:t>
+              <w:t xml:space="preserve">Language &amp; Structure</w:t>
+            </w:r>
+          </w:p>
+        </w:tc>
+        <w:tc>
+          <w:tcPr>
+            <w:tcW w:type="dxa" w:w="2488"/>
+            <w:shd w:fill="FFFFFF" w:color="auto" w:val="clear"/>
+            <w:tcMar>
+              <w:top w:type="dxa" w:w="70"/>
+              <w:left w:type="dxa" w:w="90"/>
+              <w:bottom w:type="dxa" w:w="70"/>
+              <w:right w:type="dxa" w:w="90"/>
+            </w:tcMar>
+          </w:tcPr>
+          <w:p>
+            <w:pPr>
+              <w:spacing w:after="0"/>
+            </w:pPr>
+            <w:r>
+              <w:rPr>
+                <w:rFonts w:ascii="Arial" w:cs="Arial" w:eastAsia="Arial" w:hAnsi="Arial"/>
+                <w:sz w:val="17"/>
+                <w:szCs w:val="17"/>
+              </w:rPr>
+              <w:t xml:space="preserve">Writes short, simple sentences using mostly literal verbs (“shows”, “uses”).</w:t>
+            </w:r>
+          </w:p>
+        </w:tc>
+        <w:tc>
+          <w:tcPr>
+            <w:tcW w:type="dxa" w:w="2488"/>
+            <w:shd w:fill="FFFFFF" w:color="auto" w:val="clear"/>
+            <w:tcMar>
+              <w:top w:type="dxa" w:w="70"/>
+              <w:left w:type="dxa" w:w="90"/>
+              <w:bottom w:type="dxa" w:w="70"/>
+              <w:right w:type="dxa" w:w="90"/>
+            </w:tcMar>
+          </w:tcPr>
+          <w:p>
+            <w:pPr>
+              <w:spacing w:after="0"/>
+            </w:pPr>
+            <w:r>
+              <w:rPr>
+                <w:rFonts w:ascii="Arial" w:cs="Arial" w:eastAsia="Arial" w:hAnsi="Arial"/>
+                <w:sz w:val="17"/>
+                <w:szCs w:val="17"/>
+              </w:rPr>
+              <w:t xml:space="preserve">Expands sentences with connectives such as because, so, or to. Uses basic evaluative words.</w:t>
+            </w:r>
+          </w:p>
+        </w:tc>
+        <w:tc>
+          <w:tcPr>
+            <w:tcW w:type="dxa" w:w="2488"/>
+            <w:shd w:fill="FFFFFF" w:color="auto" w:val="clear"/>
+            <w:tcMar>
+              <w:top w:type="dxa" w:w="70"/>
+              <w:left w:type="dxa" w:w="90"/>
+              <w:bottom w:type="dxa" w:w="70"/>
+              <w:right w:type="dxa" w:w="90"/>
+            </w:tcMar>
+          </w:tcPr>
+          <w:p>
+            <w:pPr>
+              <w:spacing w:after="0"/>
+            </w:pPr>
+            <w:r>
+              <w:rPr>
+                <w:rFonts w:ascii="Arial" w:cs="Arial" w:eastAsia="Arial" w:hAnsi="Arial"/>
+                <w:sz w:val="17"/>
+                <w:szCs w:val="17"/>
+              </w:rPr>
+              <w:t xml:space="preserve">Uses more complex sentences and analytical verbs (“suggests”, “highlights”).</w:t>
             </w:r>
           </w:p>
         </w:tc>
@@ -2532,7 +2245,7 @@
         <w:tc>
           <w:tcPr>
             <w:tcW w:type="dxa" w:w="3000"/>
-            <w:shd w:fill="F1EDE3" w:color="auto" w:val="clear"/>
+            <w:shd w:fill="DFF0E2" w:color="auto" w:val="clear"/>
             <w:tcMar>
               <w:top w:type="dxa" w:w="70"/>
               <w:left w:type="dxa" w:w="90"/>
@@ -2552,142 +2265,13 @@
                 <w:sz w:val="18"/>
                 <w:szCs w:val="18"/>
               </w:rPr>
-              <w:t xml:space="preserve">Language &amp; Structure</w:t>
-            </w:r>
-          </w:p>
-        </w:tc>
-        <w:tc>
-          <w:tcPr>
-            <w:tcW w:type="dxa" w:w="3099"/>
-            <w:shd w:fill="FFFFFF" w:color="auto" w:val="clear"/>
-            <w:tcMar>
-              <w:top w:type="dxa" w:w="70"/>
-              <w:left w:type="dxa" w:w="90"/>
-              <w:bottom w:type="dxa" w:w="70"/>
-              <w:right w:type="dxa" w:w="90"/>
-            </w:tcMar>
-          </w:tcPr>
-          <w:p>
-            <w:pPr>
-              <w:spacing w:after="0"/>
-            </w:pPr>
-            <w:r>
-              <w:rPr>
-                <w:rFonts w:ascii="Arial" w:cs="Arial" w:eastAsia="Arial" w:hAnsi="Arial"/>
-                <w:sz w:val="17"/>
-                <w:szCs w:val="17"/>
-              </w:rPr>
-              <w:t xml:space="preserve">Writes short, simple sentences using mostly literal verbs (“shows”, “uses”).</w:t>
-            </w:r>
-          </w:p>
-        </w:tc>
-        <w:tc>
-          <w:tcPr>
-            <w:tcW w:type="dxa" w:w="3099"/>
-            <w:shd w:fill="FFFFFF" w:color="auto" w:val="clear"/>
-            <w:tcMar>
-              <w:top w:type="dxa" w:w="70"/>
-              <w:left w:type="dxa" w:w="90"/>
-              <w:bottom w:type="dxa" w:w="70"/>
-              <w:right w:type="dxa" w:w="90"/>
-            </w:tcMar>
-          </w:tcPr>
-          <w:p>
-            <w:pPr>
-              <w:spacing w:after="0"/>
-            </w:pPr>
-            <w:r>
-              <w:rPr>
-                <w:rFonts w:ascii="Arial" w:cs="Arial" w:eastAsia="Arial" w:hAnsi="Arial"/>
-                <w:sz w:val="17"/>
-                <w:szCs w:val="17"/>
-              </w:rPr>
-              <w:t xml:space="preserve">Expands sentences with connectives such as because, so, or to. Uses basic evaluative words.</w:t>
-            </w:r>
-          </w:p>
-        </w:tc>
-        <w:tc>
-          <w:tcPr>
-            <w:tcW w:type="dxa" w:w="3099"/>
-            <w:shd w:fill="FFFFFF" w:color="auto" w:val="clear"/>
-            <w:tcMar>
-              <w:top w:type="dxa" w:w="70"/>
-              <w:left w:type="dxa" w:w="90"/>
-              <w:bottom w:type="dxa" w:w="70"/>
-              <w:right w:type="dxa" w:w="90"/>
-            </w:tcMar>
-          </w:tcPr>
-          <w:p>
-            <w:pPr>
-              <w:spacing w:after="0"/>
-            </w:pPr>
-            <w:r>
-              <w:rPr>
-                <w:rFonts w:ascii="Arial" w:cs="Arial" w:eastAsia="Arial" w:hAnsi="Arial"/>
-                <w:sz w:val="17"/>
-                <w:szCs w:val="17"/>
-              </w:rPr>
-              <w:t xml:space="preserve">Uses more complex sentences and analytical verbs (“suggests”, “highlights”).</w:t>
-            </w:r>
-          </w:p>
-        </w:tc>
-        <w:tc>
-          <w:tcPr>
-            <w:tcW w:type="dxa" w:w="3099"/>
-            <w:shd w:fill="FFFFFF" w:color="auto" w:val="clear"/>
-            <w:tcMar>
-              <w:top w:type="dxa" w:w="70"/>
-              <w:left w:type="dxa" w:w="90"/>
-              <w:bottom w:type="dxa" w:w="70"/>
-              <w:right w:type="dxa" w:w="90"/>
-            </w:tcMar>
-          </w:tcPr>
-          <w:p>
-            <w:pPr>
-              <w:spacing w:after="0"/>
-            </w:pPr>
-            <w:r>
-              <w:rPr>
-                <w:rFonts w:ascii="Arial" w:cs="Arial" w:eastAsia="Arial" w:hAnsi="Arial"/>
-                <w:sz w:val="17"/>
-                <w:szCs w:val="17"/>
-              </w:rPr>
-              <w:t xml:space="preserve">Writes fluently in a cohesive formal style, varying sentence structures to show cause, effect, and interpretation.</w:t>
-            </w:r>
-          </w:p>
-        </w:tc>
-      </w:tr>
-      <w:tr>
-        <w:tc>
-          <w:tcPr>
-            <w:tcW w:type="dxa" w:w="3000"/>
-            <w:shd w:fill="DFF0E2" w:color="auto" w:val="clear"/>
-            <w:tcMar>
-              <w:top w:type="dxa" w:w="70"/>
-              <w:left w:type="dxa" w:w="90"/>
-              <w:bottom w:type="dxa" w:w="70"/>
-              <w:right w:type="dxa" w:w="90"/>
-            </w:tcMar>
-          </w:tcPr>
-          <w:p>
-            <w:pPr>
-              <w:spacing w:after="0"/>
-            </w:pPr>
-            <w:r>
-              <w:rPr>
-                <w:rFonts w:ascii="Arial" w:cs="Arial" w:eastAsia="Arial" w:hAnsi="Arial"/>
-                <w:b/>
-                <w:bCs/>
-                <w:sz w:val="18"/>
-                <w:szCs w:val="18"/>
-              </w:rPr>
               <w:t xml:space="preserve">Purpose &amp; Interpretation</w:t>
             </w:r>
           </w:p>
         </w:tc>
         <w:tc>
           <w:tcPr>
-            <w:tcW w:type="dxa" w:w="3099"/>
+            <w:tcW w:type="dxa" w:w="2488"/>
             <w:shd w:fill="EFF7F0" w:color="auto" w:val="clear"/>
             <w:tcMar>
               <w:top w:type="dxa" w:w="70"/>
@@ -2712,7 +2296,7 @@
         </w:tc>
         <w:tc>
           <w:tcPr>
-            <w:tcW w:type="dxa" w:w="3099"/>
+            <w:tcW w:type="dxa" w:w="2488"/>
             <w:shd w:fill="EFF7F0" w:color="auto" w:val="clear"/>
             <w:tcMar>
               <w:top w:type="dxa" w:w="70"/>
@@ -2737,7 +2321,7 @@
         </w:tc>
         <w:tc>
           <w:tcPr>
-            <w:tcW w:type="dxa" w:w="3099"/>
+            <w:tcW w:type="dxa" w:w="2488"/>
             <w:shd w:fill="EFF7F0" w:color="auto" w:val="clear"/>
             <w:tcMar>
               <w:top w:type="dxa" w:w="70"/>
@@ -2757,31 +2341,6 @@
                 <w:szCs w:val="17"/>
               </w:rPr>
               <w:t xml:space="preserve">Makes inferences about the creator’s intent or perspective.</w:t>
-            </w:r>
-          </w:p>
-        </w:tc>
-        <w:tc>
-          <w:tcPr>
-            <w:tcW w:type="dxa" w:w="3099"/>
-            <w:shd w:fill="EFF7F0" w:color="auto" w:val="clear"/>
-            <w:tcMar>
-              <w:top w:type="dxa" w:w="70"/>
-              <w:left w:type="dxa" w:w="90"/>
-              <w:bottom w:type="dxa" w:w="70"/>
-              <w:right w:type="dxa" w:w="90"/>
-            </w:tcMar>
-          </w:tcPr>
-          <w:p>
-            <w:pPr>
-              <w:spacing w:after="0"/>
-            </w:pPr>
-            <w:r>
-              <w:rPr>
-                <w:rFonts w:ascii="Arial" w:cs="Arial" w:eastAsia="Arial" w:hAnsi="Arial"/>
-                <w:sz w:val="17"/>
-                <w:szCs w:val="17"/>
-              </w:rPr>
-              <w:t xml:space="preserve">Discusses deeper social, moral, or ethical ideas, linking choices to broader context.</w:t>
             </w:r>
           </w:p>
         </w:tc>
@@ -2789,26 +2348,16 @@
     </w:tbl>
     <w:p>
       <w:pPr>
-        <w:spacing w:before="140"/>
-      </w:pPr>
-      <w:r>
-        <w:rPr>
-          <w:rFonts w:ascii="Arial" w:cs="Arial" w:eastAsia="Arial" w:hAnsi="Arial"/>
-          <w:sz w:val="18"/>
-          <w:szCs w:val="18"/>
-        </w:rPr>
-        <w:t xml:space="preserve">For students on the EAL pathway, in place of the continuum rubric. </w:t>
-      </w:r>
-      <w:r>
-        <w:rPr>
-          <w:rFonts w:ascii="Arial" w:cs="Arial" w:eastAsia="Arial" w:hAnsi="Arial"/>
-          <w:i/>
-          <w:iCs/>
+        <w:spacing w:before="120"/>
+      </w:pPr>
+      <w:r>
+        <w:rPr>
+          <w:rFonts w:ascii="Arial" w:cs="Arial" w:eastAsia="Arial" w:hAnsi="Arial"/>
           <w:color w:val="595959"/>
           <w:sz w:val="18"/>
           <w:szCs w:val="18"/>
         </w:rPr>
-        <w:t xml:space="preserve">The EAL analytical writing rubric, with its film wording taken out.</w:t>
+        <w:t xml:space="preserve">For students on the EAL pathway, in place of the continuum rubric.</w:t>
       </w:r>
     </w:p>
     <w:p>
@@ -2837,7 +2386,7 @@
           <w:sz w:val="20"/>
           <w:szCs w:val="20"/>
         </w:rPr>
-        <w:t xml:space="preserve">______________________________________________________________________________________________________________________________________________________</w:t>
+        <w:t xml:space="preserve">________________________________________________________________________________________________</w:t>
       </w:r>
     </w:p>
     <w:p>
@@ -2851,11 +2400,11 @@
           <w:sz w:val="20"/>
           <w:szCs w:val="20"/>
         </w:rPr>
-        <w:t xml:space="preserve">______________________________________________________________________________________________________________________________________________________</w:t>
+        <w:t xml:space="preserve">________________________________________________________________________________________________</w:t>
       </w:r>
     </w:p>
     <w:sectPr>
-      <w:pgSz w:w="16838" w:h="11906" w:orient="landscape"/>
+      <w:pgSz w:w="11906" w:h="16838" w:orient="portrait"/>
       <w:pgMar w:top="720" w:right="720" w:bottom="720" w:left="720" w:header="708" w:footer="708" w:gutter="0"/>
       <w:pgNumType/>
       <w:docGrid w:linePitch="360"/>

</xml_diff>

<commit_message>
Posters stripped back for the quote hunt; rubric in the department's style
The posters are the idea across the top with the ways of reading it as
a hint underneath, and the rest of the sheet open, so a class working a
chapter or two each can stick quotes on whichever posters they belong
to. A quote-hunt sheet per student records the words, the chapter, the
poster and what it shows.

The rubric now uses the department's own rows and wording — Ideas,
Analysing language, Collecting evidence, Word choice — with Needs
support before the levels, minus the ethical concepts row, plus a
paragraph row written in the same voice. One colour per row label,
matching the wall, and nothing coloured inside the cells.

Co-Authored-By: Claude Fable 5.1 <noreply@anthropic.com>
Claude-Session: https://claude.ai/code/session_01TX2KYiJGekMNoBBPASQh6e
</commit_message>
<xml_diff>
--- a/BoneSparrow-assessment-folio.docx
+++ b/BoneSparrow-assessment-folio.docx
@@ -777,12 +777,13 @@
         </w:tblBorders>
       </w:tblPr>
       <w:tblGrid>
-        <w:gridCol w:w="3000"/>
-        <w:gridCol w:w="2479"/>
-        <w:gridCol w:w="2479"/>
-        <w:gridCol w:w="2479"/>
-        <w:gridCol w:w="2479"/>
-        <w:gridCol w:w="2479"/>
+        <w:gridCol w:w="2400"/>
+        <w:gridCol w:w="2166"/>
+        <w:gridCol w:w="2166"/>
+        <w:gridCol w:w="2166"/>
+        <w:gridCol w:w="2166"/>
+        <w:gridCol w:w="2166"/>
+        <w:gridCol w:w="2166"/>
       </w:tblGrid>
       <w:tr>
         <w:trPr>
@@ -790,7 +791,7 @@
         </w:trPr>
         <w:tc>
           <w:tcPr>
-            <w:tcW w:type="dxa" w:w="3000"/>
+            <w:tcW w:type="dxa" w:w="2400"/>
             <w:shd w:fill="D9D9D9" w:color="auto" w:val="clear"/>
             <w:tcMar>
               <w:top w:type="dxa" w:w="70"/>
@@ -811,13 +812,13 @@
                 <w:sz w:val="18"/>
                 <w:szCs w:val="18"/>
               </w:rPr>
-              <w:t xml:space="preserve">Criteria</w:t>
-            </w:r>
-          </w:p>
-        </w:tc>
-        <w:tc>
-          <w:tcPr>
-            <w:tcW w:type="dxa" w:w="2479"/>
+              <w:t xml:space="preserve"/>
+            </w:r>
+          </w:p>
+        </w:tc>
+        <w:tc>
+          <w:tcPr>
+            <w:tcW w:type="dxa" w:w="2166"/>
             <w:shd w:fill="D9D9D9" w:color="auto" w:val="clear"/>
             <w:tcMar>
               <w:top w:type="dxa" w:w="70"/>
@@ -835,16 +836,18 @@
                 <w:rFonts w:ascii="Arial" w:cs="Arial" w:eastAsia="Arial" w:hAnsi="Arial"/>
                 <w:b/>
                 <w:bCs/>
+                <w:i/>
+                <w:iCs/>
                 <w:sz w:val="18"/>
                 <w:szCs w:val="18"/>
               </w:rPr>
-              <w:t xml:space="preserve">Level 5</w:t>
-            </w:r>
-          </w:p>
-        </w:tc>
-        <w:tc>
-          <w:tcPr>
-            <w:tcW w:type="dxa" w:w="2479"/>
+              <w:t xml:space="preserve">Needs support</w:t>
+            </w:r>
+          </w:p>
+        </w:tc>
+        <w:tc>
+          <w:tcPr>
+            <w:tcW w:type="dxa" w:w="2166"/>
             <w:shd w:fill="D9D9D9" w:color="auto" w:val="clear"/>
             <w:tcMar>
               <w:top w:type="dxa" w:w="70"/>
@@ -862,17 +865,19 @@
                 <w:rFonts w:ascii="Arial" w:cs="Arial" w:eastAsia="Arial" w:hAnsi="Arial"/>
                 <w:b/>
                 <w:bCs/>
+                <w:i w:val="false"/>
+                <w:iCs w:val="false"/>
                 <w:sz w:val="18"/>
                 <w:szCs w:val="18"/>
               </w:rPr>
-              <w:t xml:space="preserve">Level 6</w:t>
-            </w:r>
-          </w:p>
-        </w:tc>
-        <w:tc>
-          <w:tcPr>
-            <w:tcW w:type="dxa" w:w="2479"/>
-            <w:shd w:fill="E7E6E6" w:color="auto" w:val="clear"/>
+              <w:t xml:space="preserve">5</w:t>
+            </w:r>
+          </w:p>
+        </w:tc>
+        <w:tc>
+          <w:tcPr>
+            <w:tcW w:type="dxa" w:w="2166"/>
+            <w:shd w:fill="D9D9D9" w:color="auto" w:val="clear"/>
             <w:tcMar>
               <w:top w:type="dxa" w:w="70"/>
               <w:left w:type="dxa" w:w="90"/>
@@ -889,17 +894,19 @@
                 <w:rFonts w:ascii="Arial" w:cs="Arial" w:eastAsia="Arial" w:hAnsi="Arial"/>
                 <w:b/>
                 <w:bCs/>
+                <w:i w:val="false"/>
+                <w:iCs w:val="false"/>
                 <w:sz w:val="18"/>
                 <w:szCs w:val="18"/>
               </w:rPr>
-              <w:t xml:space="preserve">Level 7</w:t>
-            </w:r>
-          </w:p>
-        </w:tc>
-        <w:tc>
-          <w:tcPr>
-            <w:tcW w:type="dxa" w:w="2479"/>
-            <w:shd w:fill="D9D9D9" w:color="auto" w:val="clear"/>
+              <w:t xml:space="preserve">6</w:t>
+            </w:r>
+          </w:p>
+        </w:tc>
+        <w:tc>
+          <w:tcPr>
+            <w:tcW w:type="dxa" w:w="2166"/>
+            <w:shd w:fill="E7E6E6" w:color="auto" w:val="clear"/>
             <w:tcMar>
               <w:top w:type="dxa" w:w="70"/>
               <w:left w:type="dxa" w:w="90"/>
@@ -916,16 +923,18 @@
                 <w:rFonts w:ascii="Arial" w:cs="Arial" w:eastAsia="Arial" w:hAnsi="Arial"/>
                 <w:b/>
                 <w:bCs/>
+                <w:i w:val="false"/>
+                <w:iCs w:val="false"/>
                 <w:sz w:val="18"/>
                 <w:szCs w:val="18"/>
               </w:rPr>
-              <w:t xml:space="preserve">Level 8</w:t>
-            </w:r>
-          </w:p>
-        </w:tc>
-        <w:tc>
-          <w:tcPr>
-            <w:tcW w:type="dxa" w:w="2479"/>
+              <w:t xml:space="preserve">7</w:t>
+            </w:r>
+          </w:p>
+        </w:tc>
+        <w:tc>
+          <w:tcPr>
+            <w:tcW w:type="dxa" w:w="2166"/>
             <w:shd w:fill="D9D9D9" w:color="auto" w:val="clear"/>
             <w:tcMar>
               <w:top w:type="dxa" w:w="70"/>
@@ -943,10 +952,41 @@
                 <w:rFonts w:ascii="Arial" w:cs="Arial" w:eastAsia="Arial" w:hAnsi="Arial"/>
                 <w:b/>
                 <w:bCs/>
+                <w:i w:val="false"/>
+                <w:iCs w:val="false"/>
                 <w:sz w:val="18"/>
                 <w:szCs w:val="18"/>
               </w:rPr>
-              <w:t xml:space="preserve">Level 9</w:t>
+              <w:t xml:space="preserve">8</w:t>
+            </w:r>
+          </w:p>
+        </w:tc>
+        <w:tc>
+          <w:tcPr>
+            <w:tcW w:type="dxa" w:w="2166"/>
+            <w:shd w:fill="D9D9D9" w:color="auto" w:val="clear"/>
+            <w:tcMar>
+              <w:top w:type="dxa" w:w="70"/>
+              <w:left w:type="dxa" w:w="90"/>
+              <w:bottom w:type="dxa" w:w="70"/>
+              <w:right w:type="dxa" w:w="90"/>
+            </w:tcMar>
+          </w:tcPr>
+          <w:p>
+            <w:pPr>
+              <w:spacing w:after="0"/>
+            </w:pPr>
+            <w:r>
+              <w:rPr>
+                <w:rFonts w:ascii="Arial" w:cs="Arial" w:eastAsia="Arial" w:hAnsi="Arial"/>
+                <w:b/>
+                <w:bCs/>
+                <w:i w:val="false"/>
+                <w:iCs w:val="false"/>
+                <w:sz w:val="18"/>
+                <w:szCs w:val="18"/>
+              </w:rPr>
+              <w:t xml:space="preserve">9</w:t>
             </w:r>
           </w:p>
         </w:tc>
@@ -954,7 +994,7 @@
       <w:tr>
         <w:tc>
           <w:tcPr>
-            <w:tcW w:type="dxa" w:w="3000"/>
+            <w:tcW w:type="dxa" w:w="2400"/>
             <w:shd w:fill="D6EAFC" w:color="auto" w:val="clear"/>
             <w:tcMar>
               <w:top w:type="dxa" w:w="70"/>
@@ -972,44 +1012,97 @@
                 <w:rFonts w:ascii="Arial" w:cs="Arial" w:eastAsia="Arial" w:hAnsi="Arial"/>
                 <w:b/>
                 <w:bCs/>
-                <w:sz w:val="18"/>
-                <w:szCs w:val="18"/>
-              </w:rPr>
-              <w:t xml:space="preserve">Interpreting texts</w:t>
-            </w:r>
-          </w:p>
-          <w:p>
-            <w:pPr>
-              <w:spacing w:after="0"/>
-            </w:pPr>
-            <w:r>
-              <w:rPr>
-                <w:rFonts w:ascii="Arial" w:cs="Arial" w:eastAsia="Arial" w:hAnsi="Arial"/>
-                <w:color w:val="595959"/>
-                <w:sz w:val="16"/>
-                <w:szCs w:val="16"/>
-              </w:rPr>
-              <w:t xml:space="preserve">the idea about the novel</w:t>
-            </w:r>
-          </w:p>
-          <w:p>
-            <w:pPr>
-              <w:spacing w:after="0"/>
-            </w:pPr>
-            <w:r>
-              <w:rPr>
-                <w:rFonts w:ascii="Arial" w:cs="Arial" w:eastAsia="Arial" w:hAnsi="Arial"/>
-                <w:color w:val="808080"/>
-                <w:sz w:val="14"/>
-                <w:szCs w:val="14"/>
-              </w:rPr>
-              <w:t xml:space="preserve">Reading and Viewing</w:t>
-            </w:r>
-          </w:p>
-        </w:tc>
-        <w:tc>
-          <w:tcPr>
-            <w:tcW w:type="dxa" w:w="2479"/>
+                <w:sz w:val="19"/>
+                <w:szCs w:val="19"/>
+              </w:rPr>
+              <w:t xml:space="preserve">Ideas</w:t>
+            </w:r>
+          </w:p>
+        </w:tc>
+        <w:tc>
+          <w:tcPr>
+            <w:tcW w:type="dxa" w:w="2166"/>
+            <w:shd w:fill="FFFFFF" w:color="auto" w:val="clear"/>
+            <w:tcMar>
+              <w:top w:type="dxa" w:w="70"/>
+              <w:left w:type="dxa" w:w="90"/>
+              <w:bottom w:type="dxa" w:w="70"/>
+              <w:right w:type="dxa" w:w="90"/>
+            </w:tcMar>
+          </w:tcPr>
+          <w:p>
+            <w:pPr>
+              <w:spacing w:after="0"/>
+            </w:pPr>
+            <w:r>
+              <w:rPr>
+                <w:rFonts w:ascii="Arial" w:cs="Arial" w:eastAsia="Arial" w:hAnsi="Arial"/>
+                <w:i/>
+                <w:iCs/>
+                <w:sz w:val="17"/>
+                <w:szCs w:val="17"/>
+              </w:rPr>
+              <w:t xml:space="preserve">I need support to identify and explain ideas and issues within the text</w:t>
+            </w:r>
+          </w:p>
+        </w:tc>
+        <w:tc>
+          <w:tcPr>
+            <w:tcW w:type="dxa" w:w="2166"/>
+            <w:shd w:fill="FFFFFF" w:color="auto" w:val="clear"/>
+            <w:tcMar>
+              <w:top w:type="dxa" w:w="70"/>
+              <w:left w:type="dxa" w:w="90"/>
+              <w:bottom w:type="dxa" w:w="70"/>
+              <w:right w:type="dxa" w:w="90"/>
+            </w:tcMar>
+          </w:tcPr>
+          <w:p>
+            <w:pPr>
+              <w:spacing w:after="0"/>
+            </w:pPr>
+            <w:r>
+              <w:rPr>
+                <w:rFonts w:ascii="Arial" w:cs="Arial" w:eastAsia="Arial" w:hAnsi="Arial"/>
+                <w:i w:val="false"/>
+                <w:iCs w:val="false"/>
+                <w:sz w:val="17"/>
+                <w:szCs w:val="17"/>
+              </w:rPr>
+              <w:t xml:space="preserve">I can identify parts of the story that relate to key ideas (imprisonment, loneliness, stories, etc)</w:t>
+            </w:r>
+          </w:p>
+        </w:tc>
+        <w:tc>
+          <w:tcPr>
+            <w:tcW w:type="dxa" w:w="2166"/>
+            <w:shd w:fill="FFFFFF" w:color="auto" w:val="clear"/>
+            <w:tcMar>
+              <w:top w:type="dxa" w:w="70"/>
+              <w:left w:type="dxa" w:w="90"/>
+              <w:bottom w:type="dxa" w:w="70"/>
+              <w:right w:type="dxa" w:w="90"/>
+            </w:tcMar>
+          </w:tcPr>
+          <w:p>
+            <w:pPr>
+              <w:spacing w:after="0"/>
+            </w:pPr>
+            <w:r>
+              <w:rPr>
+                <w:rFonts w:ascii="Arial" w:cs="Arial" w:eastAsia="Arial" w:hAnsi="Arial"/>
+                <w:i w:val="false"/>
+                <w:iCs w:val="false"/>
+                <w:sz w:val="17"/>
+                <w:szCs w:val="17"/>
+              </w:rPr>
+              <w:t xml:space="preserve">I can describe characters and events that relate to key ideas</w:t>
+            </w:r>
+          </w:p>
+        </w:tc>
+        <w:tc>
+          <w:tcPr>
+            <w:tcW w:type="dxa" w:w="2166"/>
             <w:shd w:fill="EAF4FD" w:color="auto" w:val="clear"/>
             <w:tcMar>
               <w:top w:type="dxa" w:w="70"/>
@@ -1025,110 +1118,66 @@
             <w:r>
               <w:rPr>
                 <w:rFonts w:ascii="Arial" w:cs="Arial" w:eastAsia="Arial" w:hAnsi="Arial"/>
-                <w:sz w:val="17"/>
-                <w:szCs w:val="17"/>
-              </w:rPr>
-              <w:t xml:space="preserve">I can describe the purpose of different text types</w:t>
-            </w:r>
-          </w:p>
-        </w:tc>
-        <w:tc>
-          <w:tcPr>
-            <w:tcW w:type="dxa" w:w="2479"/>
-            <w:shd w:fill="EAF4FD" w:color="auto" w:val="clear"/>
-            <w:tcMar>
-              <w:top w:type="dxa" w:w="70"/>
-              <w:left w:type="dxa" w:w="90"/>
-              <w:bottom w:type="dxa" w:w="70"/>
-              <w:right w:type="dxa" w:w="90"/>
-            </w:tcMar>
-          </w:tcPr>
-          <w:p>
-            <w:pPr>
-              <w:spacing w:after="0"/>
-            </w:pPr>
-            <w:r>
-              <w:rPr>
-                <w:rFonts w:ascii="Arial" w:cs="Arial" w:eastAsia="Arial" w:hAnsi="Arial"/>
-                <w:sz w:val="17"/>
-                <w:szCs w:val="17"/>
-              </w:rPr>
-              <w:t xml:space="preserve">I can describe the way authors try to influence their audience</w:t>
-            </w:r>
-          </w:p>
-        </w:tc>
-        <w:tc>
-          <w:tcPr>
-            <w:tcW w:type="dxa" w:w="2479"/>
-            <w:shd w:fill="EAF4FD" w:color="auto" w:val="clear"/>
-            <w:tcMar>
-              <w:top w:type="dxa" w:w="70"/>
-              <w:left w:type="dxa" w:w="90"/>
-              <w:bottom w:type="dxa" w:w="70"/>
-              <w:right w:type="dxa" w:w="90"/>
-            </w:tcMar>
-          </w:tcPr>
-          <w:p>
-            <w:pPr>
-              <w:spacing w:after="0"/>
-            </w:pPr>
-            <w:r>
-              <w:rPr>
-                <w:rFonts w:ascii="Arial" w:cs="Arial" w:eastAsia="Arial" w:hAnsi="Arial"/>
-                <w:sz w:val="17"/>
-                <w:szCs w:val="17"/>
-              </w:rPr>
-              <w:t xml:space="preserve">I can explain how the structure and language used in a text helps influence the audience</w:t>
-            </w:r>
-          </w:p>
-        </w:tc>
-        <w:tc>
-          <w:tcPr>
-            <w:tcW w:type="dxa" w:w="2479"/>
-            <w:shd w:fill="EAF4FD" w:color="auto" w:val="clear"/>
-            <w:tcMar>
-              <w:top w:type="dxa" w:w="70"/>
-              <w:left w:type="dxa" w:w="90"/>
-              <w:bottom w:type="dxa" w:w="70"/>
-              <w:right w:type="dxa" w:w="90"/>
-            </w:tcMar>
-          </w:tcPr>
-          <w:p>
-            <w:pPr>
-              <w:spacing w:after="0"/>
-            </w:pPr>
-            <w:r>
-              <w:rPr>
-                <w:rFonts w:ascii="Arial" w:cs="Arial" w:eastAsia="Arial" w:hAnsi="Arial"/>
-                <w:sz w:val="17"/>
-                <w:szCs w:val="17"/>
-              </w:rPr>
-              <w:t xml:space="preserve">I can find the author’s point of view in a text and evaluate how credible the text is</w:t>
-            </w:r>
-          </w:p>
-        </w:tc>
-        <w:tc>
-          <w:tcPr>
-            <w:tcW w:type="dxa" w:w="2479"/>
-            <w:shd w:fill="EAF4FD" w:color="auto" w:val="clear"/>
-            <w:tcMar>
-              <w:top w:type="dxa" w:w="70"/>
-              <w:left w:type="dxa" w:w="90"/>
-              <w:bottom w:type="dxa" w:w="70"/>
-              <w:right w:type="dxa" w:w="90"/>
-            </w:tcMar>
-          </w:tcPr>
-          <w:p>
-            <w:pPr>
-              <w:spacing w:after="0"/>
-            </w:pPr>
-            <w:r>
-              <w:rPr>
-                <w:rFonts w:ascii="Arial" w:cs="Arial" w:eastAsia="Arial" w:hAnsi="Arial"/>
-                <w:sz w:val="17"/>
-                <w:szCs w:val="17"/>
-              </w:rPr>
-              <w:t xml:space="preserve">I can compare the way people and issues are represented in different texts</w:t>
+                <w:i w:val="false"/>
+                <w:iCs w:val="false"/>
+                <w:sz w:val="17"/>
+                <w:szCs w:val="17"/>
+              </w:rPr>
+              <w:t xml:space="preserve">I can describe the ideas and issues that are illustrated through characters and events</w:t>
+            </w:r>
+          </w:p>
+        </w:tc>
+        <w:tc>
+          <w:tcPr>
+            <w:tcW w:type="dxa" w:w="2166"/>
+            <w:shd w:fill="FFFFFF" w:color="auto" w:val="clear"/>
+            <w:tcMar>
+              <w:top w:type="dxa" w:w="70"/>
+              <w:left w:type="dxa" w:w="90"/>
+              <w:bottom w:type="dxa" w:w="70"/>
+              <w:right w:type="dxa" w:w="90"/>
+            </w:tcMar>
+          </w:tcPr>
+          <w:p>
+            <w:pPr>
+              <w:spacing w:after="0"/>
+            </w:pPr>
+            <w:r>
+              <w:rPr>
+                <w:rFonts w:ascii="Arial" w:cs="Arial" w:eastAsia="Arial" w:hAnsi="Arial"/>
+                <w:i w:val="false"/>
+                <w:iCs w:val="false"/>
+                <w:sz w:val="17"/>
+                <w:szCs w:val="17"/>
+              </w:rPr>
+              <w:t xml:space="preserve">I can explain the way that ideas and issues are represented by characters and events</w:t>
+            </w:r>
+          </w:p>
+        </w:tc>
+        <w:tc>
+          <w:tcPr>
+            <w:tcW w:type="dxa" w:w="2166"/>
+            <w:shd w:fill="FFFFFF" w:color="auto" w:val="clear"/>
+            <w:tcMar>
+              <w:top w:type="dxa" w:w="70"/>
+              <w:left w:type="dxa" w:w="90"/>
+              <w:bottom w:type="dxa" w:w="70"/>
+              <w:right w:type="dxa" w:w="90"/>
+            </w:tcMar>
+          </w:tcPr>
+          <w:p>
+            <w:pPr>
+              <w:spacing w:after="0"/>
+            </w:pPr>
+            <w:r>
+              <w:rPr>
+                <w:rFonts w:ascii="Arial" w:cs="Arial" w:eastAsia="Arial" w:hAnsi="Arial"/>
+                <w:i w:val="false"/>
+                <w:iCs w:val="false"/>
+                <w:sz w:val="17"/>
+                <w:szCs w:val="17"/>
+              </w:rPr>
+              <w:t xml:space="preserve">I can analyse the way different people and perspectives are represented in the story</w:t>
             </w:r>
           </w:p>
         </w:tc>
@@ -1136,8 +1185,8 @@
       <w:tr>
         <w:tc>
           <w:tcPr>
-            <w:tcW w:type="dxa" w:w="3000"/>
-            <w:shd w:fill="FFF3B0" w:color="auto" w:val="clear"/>
+            <w:tcW w:type="dxa" w:w="2400"/>
+            <w:shd w:fill="DFF0E2" w:color="auto" w:val="clear"/>
             <w:tcMar>
               <w:top w:type="dxa" w:w="70"/>
               <w:left w:type="dxa" w:w="90"/>
@@ -1154,163 +1203,172 @@
                 <w:rFonts w:ascii="Arial" w:cs="Arial" w:eastAsia="Arial" w:hAnsi="Arial"/>
                 <w:b/>
                 <w:bCs/>
-                <w:sz w:val="18"/>
-                <w:szCs w:val="18"/>
-              </w:rPr>
-              <w:t xml:space="preserve">Using evidence</w:t>
-            </w:r>
-          </w:p>
-          <w:p>
-            <w:pPr>
-              <w:spacing w:after="0"/>
-            </w:pPr>
-            <w:r>
-              <w:rPr>
-                <w:rFonts w:ascii="Arial" w:cs="Arial" w:eastAsia="Arial" w:hAnsi="Arial"/>
-                <w:color w:val="595959"/>
-                <w:sz w:val="16"/>
-                <w:szCs w:val="16"/>
-              </w:rPr>
-              <w:t xml:space="preserve">choosing the quote, and putting it in the sentence</w:t>
-            </w:r>
-          </w:p>
-          <w:p>
-            <w:pPr>
-              <w:spacing w:after="0"/>
-            </w:pPr>
-            <w:r>
-              <w:rPr>
-                <w:rFonts w:ascii="Arial" w:cs="Arial" w:eastAsia="Arial" w:hAnsi="Arial"/>
-                <w:color w:val="808080"/>
-                <w:sz w:val="14"/>
-                <w:szCs w:val="14"/>
-              </w:rPr>
-              <w:t xml:space="preserve">Reading and Viewing · Writing</w:t>
-            </w:r>
-          </w:p>
-        </w:tc>
-        <w:tc>
-          <w:tcPr>
-            <w:tcW w:type="dxa" w:w="2479"/>
-            <w:shd w:fill="FFF9DC" w:color="auto" w:val="clear"/>
-            <w:tcMar>
-              <w:top w:type="dxa" w:w="70"/>
-              <w:left w:type="dxa" w:w="90"/>
-              <w:bottom w:type="dxa" w:w="70"/>
-              <w:right w:type="dxa" w:w="90"/>
-            </w:tcMar>
-          </w:tcPr>
-          <w:p>
-            <w:pPr>
-              <w:spacing w:after="0"/>
-            </w:pPr>
-            <w:r>
-              <w:rPr>
-                <w:rFonts w:ascii="Arial" w:cs="Arial" w:eastAsia="Arial" w:hAnsi="Arial"/>
-                <w:sz w:val="17"/>
-                <w:szCs w:val="17"/>
-              </w:rPr>
-              <w:t xml:space="preserve">I can describe the depiction of events, characters and settings in texts and explain my responses to them</w:t>
-            </w:r>
-          </w:p>
-        </w:tc>
-        <w:tc>
-          <w:tcPr>
-            <w:tcW w:type="dxa" w:w="2479"/>
-            <w:shd w:fill="FFF9DC" w:color="auto" w:val="clear"/>
-            <w:tcMar>
-              <w:top w:type="dxa" w:w="70"/>
-              <w:left w:type="dxa" w:w="90"/>
-              <w:bottom w:type="dxa" w:w="70"/>
-              <w:right w:type="dxa" w:w="90"/>
-            </w:tcMar>
-          </w:tcPr>
-          <w:p>
-            <w:pPr>
-              <w:spacing w:after="0"/>
-            </w:pPr>
-            <w:r>
-              <w:rPr>
-                <w:rFonts w:ascii="Arial" w:cs="Arial" w:eastAsia="Arial" w:hAnsi="Arial"/>
-                <w:sz w:val="17"/>
-                <w:szCs w:val="17"/>
-              </w:rPr>
-              <w:t xml:space="preserve">I can select specific details from texts to develop and explain my own responses. I can include quotes in an explanation with teacher guidance</w:t>
-            </w:r>
-          </w:p>
-        </w:tc>
-        <w:tc>
-          <w:tcPr>
-            <w:tcW w:type="dxa" w:w="2479"/>
-            <w:shd w:fill="FFF9DC" w:color="auto" w:val="clear"/>
-            <w:tcMar>
-              <w:top w:type="dxa" w:w="70"/>
-              <w:left w:type="dxa" w:w="90"/>
-              <w:bottom w:type="dxa" w:w="70"/>
-              <w:right w:type="dxa" w:w="90"/>
-            </w:tcMar>
-          </w:tcPr>
-          <w:p>
-            <w:pPr>
-              <w:spacing w:after="0"/>
-            </w:pPr>
-            <w:r>
-              <w:rPr>
-                <w:rFonts w:ascii="Arial" w:cs="Arial" w:eastAsia="Arial" w:hAnsi="Arial"/>
-                <w:sz w:val="17"/>
-                <w:szCs w:val="17"/>
-              </w:rPr>
-              <w:t xml:space="preserve">I can select and use evidence from texts to explain my response to it. I can explain the relevance of a quote</w:t>
-            </w:r>
-          </w:p>
-        </w:tc>
-        <w:tc>
-          <w:tcPr>
-            <w:tcW w:type="dxa" w:w="2479"/>
-            <w:shd w:fill="FFF9DC" w:color="auto" w:val="clear"/>
-            <w:tcMar>
-              <w:top w:type="dxa" w:w="70"/>
-              <w:left w:type="dxa" w:w="90"/>
-              <w:bottom w:type="dxa" w:w="70"/>
-              <w:right w:type="dxa" w:w="90"/>
-            </w:tcMar>
-          </w:tcPr>
-          <w:p>
-            <w:pPr>
-              <w:spacing w:after="0"/>
-            </w:pPr>
-            <w:r>
-              <w:rPr>
-                <w:rFonts w:ascii="Arial" w:cs="Arial" w:eastAsia="Arial" w:hAnsi="Arial"/>
-                <w:sz w:val="17"/>
-                <w:szCs w:val="17"/>
-              </w:rPr>
-              <w:t xml:space="preserve">I can select evidence from texts to describe how authors depict events, situations, and people from different viewpoints. I can embed quotes into sentences</w:t>
-            </w:r>
-          </w:p>
-        </w:tc>
-        <w:tc>
-          <w:tcPr>
-            <w:tcW w:type="dxa" w:w="2479"/>
-            <w:shd w:fill="FFF9DC" w:color="auto" w:val="clear"/>
-            <w:tcMar>
-              <w:top w:type="dxa" w:w="70"/>
-              <w:left w:type="dxa" w:w="90"/>
-              <w:bottom w:type="dxa" w:w="70"/>
-              <w:right w:type="dxa" w:w="90"/>
-            </w:tcMar>
-          </w:tcPr>
-          <w:p>
-            <w:pPr>
-              <w:spacing w:after="0"/>
-            </w:pPr>
-            <w:r>
-              <w:rPr>
-                <w:rFonts w:ascii="Arial" w:cs="Arial" w:eastAsia="Arial" w:hAnsi="Arial"/>
-                <w:sz w:val="17"/>
-                <w:szCs w:val="17"/>
-              </w:rPr>
-              <w:t xml:space="preserve">I can select evidence from texts to explain how language choices influence an audience. I can correctly embed quotes within an explanation sentence</w:t>
+                <w:sz w:val="19"/>
+                <w:szCs w:val="19"/>
+              </w:rPr>
+              <w:t xml:space="preserve">Analysing language</w:t>
+            </w:r>
+          </w:p>
+        </w:tc>
+        <w:tc>
+          <w:tcPr>
+            <w:tcW w:type="dxa" w:w="2166"/>
+            <w:shd w:fill="FFFFFF" w:color="auto" w:val="clear"/>
+            <w:tcMar>
+              <w:top w:type="dxa" w:w="70"/>
+              <w:left w:type="dxa" w:w="90"/>
+              <w:bottom w:type="dxa" w:w="70"/>
+              <w:right w:type="dxa" w:w="90"/>
+            </w:tcMar>
+          </w:tcPr>
+          <w:p>
+            <w:pPr>
+              <w:spacing w:after="0"/>
+            </w:pPr>
+            <w:r>
+              <w:rPr>
+                <w:rFonts w:ascii="Arial" w:cs="Arial" w:eastAsia="Arial" w:hAnsi="Arial"/>
+                <w:i/>
+                <w:iCs/>
+                <w:sz w:val="17"/>
+                <w:szCs w:val="17"/>
+              </w:rPr>
+              <w:t xml:space="preserve">I need help understanding the language used by the author</w:t>
+            </w:r>
+          </w:p>
+        </w:tc>
+        <w:tc>
+          <w:tcPr>
+            <w:tcW w:type="dxa" w:w="2166"/>
+            <w:shd w:fill="FFFFFF" w:color="auto" w:val="clear"/>
+            <w:tcMar>
+              <w:top w:type="dxa" w:w="70"/>
+              <w:left w:type="dxa" w:w="90"/>
+              <w:bottom w:type="dxa" w:w="70"/>
+              <w:right w:type="dxa" w:w="90"/>
+            </w:tcMar>
+          </w:tcPr>
+          <w:p>
+            <w:pPr>
+              <w:spacing w:after="0"/>
+            </w:pPr>
+            <w:r>
+              <w:rPr>
+                <w:rFonts w:ascii="Arial" w:cs="Arial" w:eastAsia="Arial" w:hAnsi="Arial"/>
+                <w:i w:val="false"/>
+                <w:iCs w:val="false"/>
+                <w:sz w:val="17"/>
+                <w:szCs w:val="17"/>
+              </w:rPr>
+              <w:t xml:space="preserve">I can identify different perspectives in the story</w:t>
+            </w:r>
+          </w:p>
+        </w:tc>
+        <w:tc>
+          <w:tcPr>
+            <w:tcW w:type="dxa" w:w="2166"/>
+            <w:shd w:fill="FFFFFF" w:color="auto" w:val="clear"/>
+            <w:tcMar>
+              <w:top w:type="dxa" w:w="70"/>
+              <w:left w:type="dxa" w:w="90"/>
+              <w:bottom w:type="dxa" w:w="70"/>
+              <w:right w:type="dxa" w:w="90"/>
+            </w:tcMar>
+          </w:tcPr>
+          <w:p>
+            <w:pPr>
+              <w:spacing w:after="0"/>
+            </w:pPr>
+            <w:r>
+              <w:rPr>
+                <w:rFonts w:ascii="Arial" w:cs="Arial" w:eastAsia="Arial" w:hAnsi="Arial"/>
+                <w:i w:val="false"/>
+                <w:iCs w:val="false"/>
+                <w:sz w:val="17"/>
+                <w:szCs w:val="17"/>
+              </w:rPr>
+              <w:t xml:space="preserve">I can describe language features, perspectives and non-literal ideas from the story</w:t>
+            </w:r>
+          </w:p>
+        </w:tc>
+        <w:tc>
+          <w:tcPr>
+            <w:tcW w:type="dxa" w:w="2166"/>
+            <w:shd w:fill="EFF7F0" w:color="auto" w:val="clear"/>
+            <w:tcMar>
+              <w:top w:type="dxa" w:w="70"/>
+              <w:left w:type="dxa" w:w="90"/>
+              <w:bottom w:type="dxa" w:w="70"/>
+              <w:right w:type="dxa" w:w="90"/>
+            </w:tcMar>
+          </w:tcPr>
+          <w:p>
+            <w:pPr>
+              <w:spacing w:after="0"/>
+            </w:pPr>
+            <w:r>
+              <w:rPr>
+                <w:rFonts w:ascii="Arial" w:cs="Arial" w:eastAsia="Arial" w:hAnsi="Arial"/>
+                <w:i w:val="false"/>
+                <w:iCs w:val="false"/>
+                <w:sz w:val="17"/>
+                <w:szCs w:val="17"/>
+              </w:rPr>
+              <w:t xml:space="preserve">I can describe the meaning of language and literary features that create characterisation and tone</w:t>
+            </w:r>
+          </w:p>
+        </w:tc>
+        <w:tc>
+          <w:tcPr>
+            <w:tcW w:type="dxa" w:w="2166"/>
+            <w:shd w:fill="FFFFFF" w:color="auto" w:val="clear"/>
+            <w:tcMar>
+              <w:top w:type="dxa" w:w="70"/>
+              <w:left w:type="dxa" w:w="90"/>
+              <w:bottom w:type="dxa" w:w="70"/>
+              <w:right w:type="dxa" w:w="90"/>
+            </w:tcMar>
+          </w:tcPr>
+          <w:p>
+            <w:pPr>
+              <w:spacing w:after="0"/>
+            </w:pPr>
+            <w:r>
+              <w:rPr>
+                <w:rFonts w:ascii="Arial" w:cs="Arial" w:eastAsia="Arial" w:hAnsi="Arial"/>
+                <w:i w:val="false"/>
+                <w:iCs w:val="false"/>
+                <w:sz w:val="17"/>
+                <w:szCs w:val="17"/>
+              </w:rPr>
+              <w:t xml:space="preserve">I can explain how language and literary devices create setting, characterisation and tone</w:t>
+            </w:r>
+          </w:p>
+        </w:tc>
+        <w:tc>
+          <w:tcPr>
+            <w:tcW w:type="dxa" w:w="2166"/>
+            <w:shd w:fill="FFFFFF" w:color="auto" w:val="clear"/>
+            <w:tcMar>
+              <w:top w:type="dxa" w:w="70"/>
+              <w:left w:type="dxa" w:w="90"/>
+              <w:bottom w:type="dxa" w:w="70"/>
+              <w:right w:type="dxa" w:w="90"/>
+            </w:tcMar>
+          </w:tcPr>
+          <w:p>
+            <w:pPr>
+              <w:spacing w:after="0"/>
+            </w:pPr>
+            <w:r>
+              <w:rPr>
+                <w:rFonts w:ascii="Arial" w:cs="Arial" w:eastAsia="Arial" w:hAnsi="Arial"/>
+                <w:i w:val="false"/>
+                <w:iCs w:val="false"/>
+                <w:sz w:val="17"/>
+                <w:szCs w:val="17"/>
+              </w:rPr>
+              <w:t xml:space="preserve">I can analyse how language features and non-literal language work together to explore ideas</w:t>
             </w:r>
           </w:p>
         </w:tc>
@@ -1318,8 +1376,8 @@
       <w:tr>
         <w:tc>
           <w:tcPr>
-            <w:tcW w:type="dxa" w:w="3000"/>
-            <w:shd w:fill="DFF0E2" w:color="auto" w:val="clear"/>
+            <w:tcW w:type="dxa" w:w="2400"/>
+            <w:shd w:fill="FFF3B0" w:color="auto" w:val="clear"/>
             <w:tcMar>
               <w:top w:type="dxa" w:w="70"/>
               <w:left w:type="dxa" w:w="90"/>
@@ -1336,163 +1394,172 @@
                 <w:rFonts w:ascii="Arial" w:cs="Arial" w:eastAsia="Arial" w:hAnsi="Arial"/>
                 <w:b/>
                 <w:bCs/>
-                <w:sz w:val="18"/>
-                <w:szCs w:val="18"/>
-              </w:rPr>
-              <w:t xml:space="preserve">Evaluating texts</w:t>
-            </w:r>
-          </w:p>
-          <w:p>
-            <w:pPr>
-              <w:spacing w:after="0"/>
-            </w:pPr>
-            <w:r>
-              <w:rPr>
-                <w:rFonts w:ascii="Arial" w:cs="Arial" w:eastAsia="Arial" w:hAnsi="Arial"/>
-                <w:color w:val="595959"/>
-                <w:sz w:val="16"/>
-                <w:szCs w:val="16"/>
-              </w:rPr>
-              <w:t xml:space="preserve">the effect on the reader, and the verb that carries it</w:t>
-            </w:r>
-          </w:p>
-          <w:p>
-            <w:pPr>
-              <w:spacing w:after="0"/>
-            </w:pPr>
-            <w:r>
-              <w:rPr>
-                <w:rFonts w:ascii="Arial" w:cs="Arial" w:eastAsia="Arial" w:hAnsi="Arial"/>
-                <w:color w:val="808080"/>
-                <w:sz w:val="14"/>
-                <w:szCs w:val="14"/>
-              </w:rPr>
-              <w:t xml:space="preserve">Reading and Viewing</w:t>
-            </w:r>
-          </w:p>
-        </w:tc>
-        <w:tc>
-          <w:tcPr>
-            <w:tcW w:type="dxa" w:w="2479"/>
-            <w:shd w:fill="EFF7F0" w:color="auto" w:val="clear"/>
-            <w:tcMar>
-              <w:top w:type="dxa" w:w="70"/>
-              <w:left w:type="dxa" w:w="90"/>
-              <w:bottom w:type="dxa" w:w="70"/>
-              <w:right w:type="dxa" w:w="90"/>
-            </w:tcMar>
-          </w:tcPr>
-          <w:p>
-            <w:pPr>
-              <w:spacing w:after="0"/>
-            </w:pPr>
-            <w:r>
-              <w:rPr>
-                <w:rFonts w:ascii="Arial" w:cs="Arial" w:eastAsia="Arial" w:hAnsi="Arial"/>
-                <w:sz w:val="17"/>
-                <w:szCs w:val="17"/>
-              </w:rPr>
-              <w:t xml:space="preserve">I can use metalanguage to discuss the effect of texts on the reader</w:t>
-            </w:r>
-          </w:p>
-        </w:tc>
-        <w:tc>
-          <w:tcPr>
-            <w:tcW w:type="dxa" w:w="2479"/>
-            <w:shd w:fill="EFF7F0" w:color="auto" w:val="clear"/>
-            <w:tcMar>
-              <w:top w:type="dxa" w:w="70"/>
-              <w:left w:type="dxa" w:w="90"/>
-              <w:bottom w:type="dxa" w:w="70"/>
-              <w:right w:type="dxa" w:w="90"/>
-            </w:tcMar>
-          </w:tcPr>
-          <w:p>
-            <w:pPr>
-              <w:spacing w:after="0"/>
-            </w:pPr>
-            <w:r>
-              <w:rPr>
-                <w:rFonts w:ascii="Arial" w:cs="Arial" w:eastAsia="Arial" w:hAnsi="Arial"/>
-                <w:sz w:val="17"/>
-                <w:szCs w:val="17"/>
-              </w:rPr>
-              <w:t xml:space="preserve">I can describe how repetition, emphasis and metaphor can influence the way a reader feels</w:t>
-            </w:r>
-          </w:p>
-        </w:tc>
-        <w:tc>
-          <w:tcPr>
-            <w:tcW w:type="dxa" w:w="2479"/>
-            <w:shd w:fill="EFF7F0" w:color="auto" w:val="clear"/>
-            <w:tcMar>
-              <w:top w:type="dxa" w:w="70"/>
-              <w:left w:type="dxa" w:w="90"/>
-              <w:bottom w:type="dxa" w:w="70"/>
-              <w:right w:type="dxa" w:w="90"/>
-            </w:tcMar>
-          </w:tcPr>
-          <w:p>
-            <w:pPr>
-              <w:spacing w:after="0"/>
-            </w:pPr>
-            <w:r>
-              <w:rPr>
-                <w:rFonts w:ascii="Arial" w:cs="Arial" w:eastAsia="Arial" w:hAnsi="Arial"/>
-                <w:sz w:val="17"/>
-                <w:szCs w:val="17"/>
-              </w:rPr>
-              <w:t xml:space="preserve">I can use examples from the text to discuss how language helps to create character</w:t>
-            </w:r>
-          </w:p>
-        </w:tc>
-        <w:tc>
-          <w:tcPr>
-            <w:tcW w:type="dxa" w:w="2479"/>
-            <w:shd w:fill="EFF7F0" w:color="auto" w:val="clear"/>
-            <w:tcMar>
-              <w:top w:type="dxa" w:w="70"/>
-              <w:left w:type="dxa" w:w="90"/>
-              <w:bottom w:type="dxa" w:w="70"/>
-              <w:right w:type="dxa" w:w="90"/>
-            </w:tcMar>
-          </w:tcPr>
-          <w:p>
-            <w:pPr>
-              <w:spacing w:after="0"/>
-            </w:pPr>
-            <w:r>
-              <w:rPr>
-                <w:rFonts w:ascii="Arial" w:cs="Arial" w:eastAsia="Arial" w:hAnsi="Arial"/>
-                <w:sz w:val="17"/>
-                <w:szCs w:val="17"/>
-              </w:rPr>
-              <w:t xml:space="preserve">I can explain how different types of evidence can add authority to a text</w:t>
-            </w:r>
-          </w:p>
-        </w:tc>
-        <w:tc>
-          <w:tcPr>
-            <w:tcW w:type="dxa" w:w="2479"/>
-            <w:shd w:fill="EFF7F0" w:color="auto" w:val="clear"/>
-            <w:tcMar>
-              <w:top w:type="dxa" w:w="70"/>
-              <w:left w:type="dxa" w:w="90"/>
-              <w:bottom w:type="dxa" w:w="70"/>
-              <w:right w:type="dxa" w:w="90"/>
-            </w:tcMar>
-          </w:tcPr>
-          <w:p>
-            <w:pPr>
-              <w:spacing w:after="0"/>
-            </w:pPr>
-            <w:r>
-              <w:rPr>
-                <w:rFonts w:ascii="Arial" w:cs="Arial" w:eastAsia="Arial" w:hAnsi="Arial"/>
-                <w:sz w:val="17"/>
-                <w:szCs w:val="17"/>
-              </w:rPr>
-              <w:t xml:space="preserve">I can explain how a text explores issues that relate to our own lives</w:t>
+                <w:sz w:val="19"/>
+                <w:szCs w:val="19"/>
+              </w:rPr>
+              <w:t xml:space="preserve">Collecting evidence</w:t>
+            </w:r>
+          </w:p>
+        </w:tc>
+        <w:tc>
+          <w:tcPr>
+            <w:tcW w:type="dxa" w:w="2166"/>
+            <w:shd w:fill="FFFFFF" w:color="auto" w:val="clear"/>
+            <w:tcMar>
+              <w:top w:type="dxa" w:w="70"/>
+              <w:left w:type="dxa" w:w="90"/>
+              <w:bottom w:type="dxa" w:w="70"/>
+              <w:right w:type="dxa" w:w="90"/>
+            </w:tcMar>
+          </w:tcPr>
+          <w:p>
+            <w:pPr>
+              <w:spacing w:after="0"/>
+            </w:pPr>
+            <w:r>
+              <w:rPr>
+                <w:rFonts w:ascii="Arial" w:cs="Arial" w:eastAsia="Arial" w:hAnsi="Arial"/>
+                <w:i/>
+                <w:iCs/>
+                <w:sz w:val="17"/>
+                <w:szCs w:val="17"/>
+              </w:rPr>
+              <w:t xml:space="preserve">I need help using evidence from the text</w:t>
+            </w:r>
+          </w:p>
+        </w:tc>
+        <w:tc>
+          <w:tcPr>
+            <w:tcW w:type="dxa" w:w="2166"/>
+            <w:shd w:fill="FFFFFF" w:color="auto" w:val="clear"/>
+            <w:tcMar>
+              <w:top w:type="dxa" w:w="70"/>
+              <w:left w:type="dxa" w:w="90"/>
+              <w:bottom w:type="dxa" w:w="70"/>
+              <w:right w:type="dxa" w:w="90"/>
+            </w:tcMar>
+          </w:tcPr>
+          <w:p>
+            <w:pPr>
+              <w:spacing w:after="0"/>
+            </w:pPr>
+            <w:r>
+              <w:rPr>
+                <w:rFonts w:ascii="Arial" w:cs="Arial" w:eastAsia="Arial" w:hAnsi="Arial"/>
+                <w:i w:val="false"/>
+                <w:iCs w:val="false"/>
+                <w:sz w:val="17"/>
+                <w:szCs w:val="17"/>
+              </w:rPr>
+              <w:t xml:space="preserve">I can refer to parts of the text in my response</w:t>
+            </w:r>
+          </w:p>
+        </w:tc>
+        <w:tc>
+          <w:tcPr>
+            <w:tcW w:type="dxa" w:w="2166"/>
+            <w:shd w:fill="FFFFFF" w:color="auto" w:val="clear"/>
+            <w:tcMar>
+              <w:top w:type="dxa" w:w="70"/>
+              <w:left w:type="dxa" w:w="90"/>
+              <w:bottom w:type="dxa" w:w="70"/>
+              <w:right w:type="dxa" w:w="90"/>
+            </w:tcMar>
+          </w:tcPr>
+          <w:p>
+            <w:pPr>
+              <w:spacing w:after="0"/>
+            </w:pPr>
+            <w:r>
+              <w:rPr>
+                <w:rFonts w:ascii="Arial" w:cs="Arial" w:eastAsia="Arial" w:hAnsi="Arial"/>
+                <w:i w:val="false"/>
+                <w:iCs w:val="false"/>
+                <w:sz w:val="17"/>
+                <w:szCs w:val="17"/>
+              </w:rPr>
+              <w:t xml:space="preserve">I can include details from the text in my response</w:t>
+            </w:r>
+          </w:p>
+        </w:tc>
+        <w:tc>
+          <w:tcPr>
+            <w:tcW w:type="dxa" w:w="2166"/>
+            <w:shd w:fill="FFF9DC" w:color="auto" w:val="clear"/>
+            <w:tcMar>
+              <w:top w:type="dxa" w:w="70"/>
+              <w:left w:type="dxa" w:w="90"/>
+              <w:bottom w:type="dxa" w:w="70"/>
+              <w:right w:type="dxa" w:w="90"/>
+            </w:tcMar>
+          </w:tcPr>
+          <w:p>
+            <w:pPr>
+              <w:spacing w:after="0"/>
+            </w:pPr>
+            <w:r>
+              <w:rPr>
+                <w:rFonts w:ascii="Arial" w:cs="Arial" w:eastAsia="Arial" w:hAnsi="Arial"/>
+                <w:i w:val="false"/>
+                <w:iCs w:val="false"/>
+                <w:sz w:val="17"/>
+                <w:szCs w:val="17"/>
+              </w:rPr>
+              <w:t xml:space="preserve">I can use details from the text to demonstrate my ideas</w:t>
+            </w:r>
+          </w:p>
+        </w:tc>
+        <w:tc>
+          <w:tcPr>
+            <w:tcW w:type="dxa" w:w="2166"/>
+            <w:shd w:fill="FFFFFF" w:color="auto" w:val="clear"/>
+            <w:tcMar>
+              <w:top w:type="dxa" w:w="70"/>
+              <w:left w:type="dxa" w:w="90"/>
+              <w:bottom w:type="dxa" w:w="70"/>
+              <w:right w:type="dxa" w:w="90"/>
+            </w:tcMar>
+          </w:tcPr>
+          <w:p>
+            <w:pPr>
+              <w:spacing w:after="0"/>
+            </w:pPr>
+            <w:r>
+              <w:rPr>
+                <w:rFonts w:ascii="Arial" w:cs="Arial" w:eastAsia="Arial" w:hAnsi="Arial"/>
+                <w:i w:val="false"/>
+                <w:iCs w:val="false"/>
+                <w:sz w:val="17"/>
+                <w:szCs w:val="17"/>
+              </w:rPr>
+              <w:t xml:space="preserve">I can embed details from the text to support my interpretation</w:t>
+            </w:r>
+          </w:p>
+        </w:tc>
+        <w:tc>
+          <w:tcPr>
+            <w:tcW w:type="dxa" w:w="2166"/>
+            <w:shd w:fill="FFFFFF" w:color="auto" w:val="clear"/>
+            <w:tcMar>
+              <w:top w:type="dxa" w:w="70"/>
+              <w:left w:type="dxa" w:w="90"/>
+              <w:bottom w:type="dxa" w:w="70"/>
+              <w:right w:type="dxa" w:w="90"/>
+            </w:tcMar>
+          </w:tcPr>
+          <w:p>
+            <w:pPr>
+              <w:spacing w:after="0"/>
+            </w:pPr>
+            <w:r>
+              <w:rPr>
+                <w:rFonts w:ascii="Arial" w:cs="Arial" w:eastAsia="Arial" w:hAnsi="Arial"/>
+                <w:i w:val="false"/>
+                <w:iCs w:val="false"/>
+                <w:sz w:val="17"/>
+                <w:szCs w:val="17"/>
+              </w:rPr>
+              <w:t xml:space="preserve">I can use a range of complex sentence structures to embed different types of evidence</w:t>
             </w:r>
           </w:p>
         </w:tc>
@@ -1500,8 +1567,8 @@
       <w:tr>
         <w:tc>
           <w:tcPr>
-            <w:tcW w:type="dxa" w:w="3000"/>
-            <w:shd w:fill="F1EDE3" w:color="auto" w:val="clear"/>
+            <w:tcW w:type="dxa" w:w="2400"/>
+            <w:shd w:fill="FAE3CF" w:color="auto" w:val="clear"/>
             <w:tcMar>
               <w:top w:type="dxa" w:w="70"/>
               <w:left w:type="dxa" w:w="90"/>
@@ -1518,44 +1585,16 @@
                 <w:rFonts w:ascii="Arial" w:cs="Arial" w:eastAsia="Arial" w:hAnsi="Arial"/>
                 <w:b/>
                 <w:bCs/>
-                <w:sz w:val="18"/>
-                <w:szCs w:val="18"/>
-              </w:rPr>
-              <w:t xml:space="preserve">Text structure and organisation</w:t>
-            </w:r>
-          </w:p>
-          <w:p>
-            <w:pPr>
-              <w:spacing w:after="0"/>
-            </w:pPr>
-            <w:r>
-              <w:rPr>
-                <w:rFonts w:ascii="Arial" w:cs="Arial" w:eastAsia="Arial" w:hAnsi="Arial"/>
-                <w:color w:val="595959"/>
-                <w:sz w:val="16"/>
-                <w:szCs w:val="16"/>
-              </w:rPr>
-              <w:t xml:space="preserve">the shape of the paragraph</w:t>
-            </w:r>
-          </w:p>
-          <w:p>
-            <w:pPr>
-              <w:spacing w:after="0"/>
-            </w:pPr>
-            <w:r>
-              <w:rPr>
-                <w:rFonts w:ascii="Arial" w:cs="Arial" w:eastAsia="Arial" w:hAnsi="Arial"/>
-                <w:color w:val="808080"/>
-                <w:sz w:val="14"/>
-                <w:szCs w:val="14"/>
-              </w:rPr>
-              <w:t xml:space="preserve">Writing</w:t>
-            </w:r>
-          </w:p>
-        </w:tc>
-        <w:tc>
-          <w:tcPr>
-            <w:tcW w:type="dxa" w:w="2479"/>
+                <w:sz w:val="19"/>
+                <w:szCs w:val="19"/>
+              </w:rPr>
+              <w:t xml:space="preserve">Word choice</w:t>
+            </w:r>
+          </w:p>
+        </w:tc>
+        <w:tc>
+          <w:tcPr>
+            <w:tcW w:type="dxa" w:w="2166"/>
             <w:shd w:fill="FFFFFF" w:color="auto" w:val="clear"/>
             <w:tcMar>
               <w:top w:type="dxa" w:w="70"/>
@@ -1571,16 +1610,18 @@
             <w:r>
               <w:rPr>
                 <w:rFonts w:ascii="Arial" w:cs="Arial" w:eastAsia="Arial" w:hAnsi="Arial"/>
-                <w:sz w:val="17"/>
-                <w:szCs w:val="17"/>
-              </w:rPr>
-              <w:t xml:space="preserve">I can change the focus of a sentence by modifying the subject</w:t>
-            </w:r>
-          </w:p>
-        </w:tc>
-        <w:tc>
-          <w:tcPr>
-            <w:tcW w:type="dxa" w:w="2479"/>
+                <w:i/>
+                <w:iCs/>
+                <w:sz w:val="17"/>
+                <w:szCs w:val="17"/>
+              </w:rPr>
+              <w:t xml:space="preserve">I need help using tier-2 words in my response</w:t>
+            </w:r>
+          </w:p>
+        </w:tc>
+        <w:tc>
+          <w:tcPr>
+            <w:tcW w:type="dxa" w:w="2166"/>
             <w:shd w:fill="FFFFFF" w:color="auto" w:val="clear"/>
             <w:tcMar>
               <w:top w:type="dxa" w:w="70"/>
@@ -1596,16 +1637,18 @@
             <w:r>
               <w:rPr>
                 <w:rFonts w:ascii="Arial" w:cs="Arial" w:eastAsia="Arial" w:hAnsi="Arial"/>
-                <w:sz w:val="17"/>
-                <w:szCs w:val="17"/>
-              </w:rPr>
-              <w:t xml:space="preserve">I can avoid repetition by changing the participants in a follow-on idea</w:t>
-            </w:r>
-          </w:p>
-        </w:tc>
-        <w:tc>
-          <w:tcPr>
-            <w:tcW w:type="dxa" w:w="2479"/>
+                <w:i w:val="false"/>
+                <w:iCs w:val="false"/>
+                <w:sz w:val="17"/>
+                <w:szCs w:val="17"/>
+              </w:rPr>
+              <w:t xml:space="preserve">I can use tier-2 words in my response</w:t>
+            </w:r>
+          </w:p>
+        </w:tc>
+        <w:tc>
+          <w:tcPr>
+            <w:tcW w:type="dxa" w:w="2166"/>
             <w:shd w:fill="FFFFFF" w:color="auto" w:val="clear"/>
             <w:tcMar>
               <w:top w:type="dxa" w:w="70"/>
@@ -1621,16 +1664,45 @@
             <w:r>
               <w:rPr>
                 <w:rFonts w:ascii="Arial" w:cs="Arial" w:eastAsia="Arial" w:hAnsi="Arial"/>
-                <w:sz w:val="17"/>
-                <w:szCs w:val="17"/>
-              </w:rPr>
-              <w:t xml:space="preserve">I can write a paragraph for informative and narrative texts</w:t>
-            </w:r>
-          </w:p>
-        </w:tc>
-        <w:tc>
-          <w:tcPr>
-            <w:tcW w:type="dxa" w:w="2479"/>
+                <w:i w:val="false"/>
+                <w:iCs w:val="false"/>
+                <w:sz w:val="17"/>
+                <w:szCs w:val="17"/>
+              </w:rPr>
+              <w:t xml:space="preserve">I can use formal and objective words in my response</w:t>
+            </w:r>
+          </w:p>
+        </w:tc>
+        <w:tc>
+          <w:tcPr>
+            <w:tcW w:type="dxa" w:w="2166"/>
+            <w:shd w:fill="FDF1E7" w:color="auto" w:val="clear"/>
+            <w:tcMar>
+              <w:top w:type="dxa" w:w="70"/>
+              <w:left w:type="dxa" w:w="90"/>
+              <w:bottom w:type="dxa" w:w="70"/>
+              <w:right w:type="dxa" w:w="90"/>
+            </w:tcMar>
+          </w:tcPr>
+          <w:p>
+            <w:pPr>
+              <w:spacing w:after="0"/>
+            </w:pPr>
+            <w:r>
+              <w:rPr>
+                <w:rFonts w:ascii="Arial" w:cs="Arial" w:eastAsia="Arial" w:hAnsi="Arial"/>
+                <w:i w:val="false"/>
+                <w:iCs w:val="false"/>
+                <w:sz w:val="17"/>
+                <w:szCs w:val="17"/>
+              </w:rPr>
+              <w:t xml:space="preserve">I can use appropriate tier-3 words to describe literary features</w:t>
+            </w:r>
+          </w:p>
+        </w:tc>
+        <w:tc>
+          <w:tcPr>
+            <w:tcW w:type="dxa" w:w="2166"/>
             <w:shd w:fill="FFFFFF" w:color="auto" w:val="clear"/>
             <w:tcMar>
               <w:top w:type="dxa" w:w="70"/>
@@ -1646,16 +1718,18 @@
             <w:r>
               <w:rPr>
                 <w:rFonts w:ascii="Arial" w:cs="Arial" w:eastAsia="Arial" w:hAnsi="Arial"/>
-                <w:sz w:val="17"/>
-                <w:szCs w:val="17"/>
-              </w:rPr>
-              <w:t xml:space="preserve">I can sequence ideas relating to a topic within a given structure</w:t>
-            </w:r>
-          </w:p>
-        </w:tc>
-        <w:tc>
-          <w:tcPr>
-            <w:tcW w:type="dxa" w:w="2479"/>
+                <w:i w:val="false"/>
+                <w:iCs w:val="false"/>
+                <w:sz w:val="17"/>
+                <w:szCs w:val="17"/>
+              </w:rPr>
+              <w:t xml:space="preserve">I can select a formal vocabulary appropriate to essay writing</w:t>
+            </w:r>
+          </w:p>
+        </w:tc>
+        <w:tc>
+          <w:tcPr>
+            <w:tcW w:type="dxa" w:w="2166"/>
             <w:shd w:fill="FFFFFF" w:color="auto" w:val="clear"/>
             <w:tcMar>
               <w:top w:type="dxa" w:w="70"/>
@@ -1671,10 +1745,203 @@
             <w:r>
               <w:rPr>
                 <w:rFonts w:ascii="Arial" w:cs="Arial" w:eastAsia="Arial" w:hAnsi="Arial"/>
-                <w:sz w:val="17"/>
-                <w:szCs w:val="17"/>
-              </w:rPr>
-              <w:t xml:space="preserve">I can sequence ideas to present a clear argument</w:t>
+                <w:i w:val="false"/>
+                <w:iCs w:val="false"/>
+                <w:sz w:val="17"/>
+                <w:szCs w:val="17"/>
+              </w:rPr>
+              <w:t xml:space="preserve">I can use tier-2 and tier-3 words with the correct nuance</w:t>
+            </w:r>
+          </w:p>
+        </w:tc>
+      </w:tr>
+      <w:tr>
+        <w:tc>
+          <w:tcPr>
+            <w:tcW w:type="dxa" w:w="2400"/>
+            <w:shd w:fill="F1EDE3" w:color="auto" w:val="clear"/>
+            <w:tcMar>
+              <w:top w:type="dxa" w:w="70"/>
+              <w:left w:type="dxa" w:w="90"/>
+              <w:bottom w:type="dxa" w:w="70"/>
+              <w:right w:type="dxa" w:w="90"/>
+            </w:tcMar>
+          </w:tcPr>
+          <w:p>
+            <w:pPr>
+              <w:spacing w:after="0"/>
+            </w:pPr>
+            <w:r>
+              <w:rPr>
+                <w:rFonts w:ascii="Arial" w:cs="Arial" w:eastAsia="Arial" w:hAnsi="Arial"/>
+                <w:b/>
+                <w:bCs/>
+                <w:sz w:val="19"/>
+                <w:szCs w:val="19"/>
+              </w:rPr>
+              <w:t xml:space="preserve">Building a paragraph</w:t>
+            </w:r>
+          </w:p>
+        </w:tc>
+        <w:tc>
+          <w:tcPr>
+            <w:tcW w:type="dxa" w:w="2166"/>
+            <w:shd w:fill="FFFFFF" w:color="auto" w:val="clear"/>
+            <w:tcMar>
+              <w:top w:type="dxa" w:w="70"/>
+              <w:left w:type="dxa" w:w="90"/>
+              <w:bottom w:type="dxa" w:w="70"/>
+              <w:right w:type="dxa" w:w="90"/>
+            </w:tcMar>
+          </w:tcPr>
+          <w:p>
+            <w:pPr>
+              <w:spacing w:after="0"/>
+            </w:pPr>
+            <w:r>
+              <w:rPr>
+                <w:rFonts w:ascii="Arial" w:cs="Arial" w:eastAsia="Arial" w:hAnsi="Arial"/>
+                <w:i/>
+                <w:iCs/>
+                <w:sz w:val="17"/>
+                <w:szCs w:val="17"/>
+              </w:rPr>
+              <w:t xml:space="preserve">I need help putting my ideas into a paragraph</w:t>
+            </w:r>
+          </w:p>
+        </w:tc>
+        <w:tc>
+          <w:tcPr>
+            <w:tcW w:type="dxa" w:w="2166"/>
+            <w:shd w:fill="FFFFFF" w:color="auto" w:val="clear"/>
+            <w:tcMar>
+              <w:top w:type="dxa" w:w="70"/>
+              <w:left w:type="dxa" w:w="90"/>
+              <w:bottom w:type="dxa" w:w="70"/>
+              <w:right w:type="dxa" w:w="90"/>
+            </w:tcMar>
+          </w:tcPr>
+          <w:p>
+            <w:pPr>
+              <w:spacing w:after="0"/>
+            </w:pPr>
+            <w:r>
+              <w:rPr>
+                <w:rFonts w:ascii="Arial" w:cs="Arial" w:eastAsia="Arial" w:hAnsi="Arial"/>
+                <w:i w:val="false"/>
+                <w:iCs w:val="false"/>
+                <w:sz w:val="17"/>
+                <w:szCs w:val="17"/>
+              </w:rPr>
+              <w:t xml:space="preserve">I can write a few sentences about one idea</w:t>
+            </w:r>
+          </w:p>
+        </w:tc>
+        <w:tc>
+          <w:tcPr>
+            <w:tcW w:type="dxa" w:w="2166"/>
+            <w:shd w:fill="FFFFFF" w:color="auto" w:val="clear"/>
+            <w:tcMar>
+              <w:top w:type="dxa" w:w="70"/>
+              <w:left w:type="dxa" w:w="90"/>
+              <w:bottom w:type="dxa" w:w="70"/>
+              <w:right w:type="dxa" w:w="90"/>
+            </w:tcMar>
+          </w:tcPr>
+          <w:p>
+            <w:pPr>
+              <w:spacing w:after="0"/>
+            </w:pPr>
+            <w:r>
+              <w:rPr>
+                <w:rFonts w:ascii="Arial" w:cs="Arial" w:eastAsia="Arial" w:hAnsi="Arial"/>
+                <w:i w:val="false"/>
+                <w:iCs w:val="false"/>
+                <w:sz w:val="17"/>
+                <w:szCs w:val="17"/>
+              </w:rPr>
+              <w:t xml:space="preserve">I can write a paragraph that starts with my idea</w:t>
+            </w:r>
+          </w:p>
+        </w:tc>
+        <w:tc>
+          <w:tcPr>
+            <w:tcW w:type="dxa" w:w="2166"/>
+            <w:shd w:fill="FFFFFF" w:color="auto" w:val="clear"/>
+            <w:tcMar>
+              <w:top w:type="dxa" w:w="70"/>
+              <w:left w:type="dxa" w:w="90"/>
+              <w:bottom w:type="dxa" w:w="70"/>
+              <w:right w:type="dxa" w:w="90"/>
+            </w:tcMar>
+          </w:tcPr>
+          <w:p>
+            <w:pPr>
+              <w:spacing w:after="0"/>
+            </w:pPr>
+            <w:r>
+              <w:rPr>
+                <w:rFonts w:ascii="Arial" w:cs="Arial" w:eastAsia="Arial" w:hAnsi="Arial"/>
+                <w:i w:val="false"/>
+                <w:iCs w:val="false"/>
+                <w:sz w:val="17"/>
+                <w:szCs w:val="17"/>
+              </w:rPr>
+              <w:t xml:space="preserve">I can write a paragraph that stays on one idea and links back to it at the end</w:t>
+            </w:r>
+          </w:p>
+        </w:tc>
+        <w:tc>
+          <w:tcPr>
+            <w:tcW w:type="dxa" w:w="2166"/>
+            <w:shd w:fill="FFFFFF" w:color="auto" w:val="clear"/>
+            <w:tcMar>
+              <w:top w:type="dxa" w:w="70"/>
+              <w:left w:type="dxa" w:w="90"/>
+              <w:bottom w:type="dxa" w:w="70"/>
+              <w:right w:type="dxa" w:w="90"/>
+            </w:tcMar>
+          </w:tcPr>
+          <w:p>
+            <w:pPr>
+              <w:spacing w:after="0"/>
+            </w:pPr>
+            <w:r>
+              <w:rPr>
+                <w:rFonts w:ascii="Arial" w:cs="Arial" w:eastAsia="Arial" w:hAnsi="Arial"/>
+                <w:i w:val="false"/>
+                <w:iCs w:val="false"/>
+                <w:sz w:val="17"/>
+                <w:szCs w:val="17"/>
+              </w:rPr>
+              <w:t xml:space="preserve">I can sequence the parts of my paragraph so each one builds on the last</w:t>
+            </w:r>
+          </w:p>
+        </w:tc>
+        <w:tc>
+          <w:tcPr>
+            <w:tcW w:type="dxa" w:w="2166"/>
+            <w:shd w:fill="FFFFFF" w:color="auto" w:val="clear"/>
+            <w:tcMar>
+              <w:top w:type="dxa" w:w="70"/>
+              <w:left w:type="dxa" w:w="90"/>
+              <w:bottom w:type="dxa" w:w="70"/>
+              <w:right w:type="dxa" w:w="90"/>
+            </w:tcMar>
+          </w:tcPr>
+          <w:p>
+            <w:pPr>
+              <w:spacing w:after="0"/>
+            </w:pPr>
+            <w:r>
+              <w:rPr>
+                <w:rFonts w:ascii="Arial" w:cs="Arial" w:eastAsia="Arial" w:hAnsi="Arial"/>
+                <w:i w:val="false"/>
+                <w:iCs w:val="false"/>
+                <w:sz w:val="17"/>
+                <w:szCs w:val="17"/>
+              </w:rPr>
+              <w:t xml:space="preserve">I can sequence my paragraphs so that my ideas build into one argument</w:t>
             </w:r>
           </w:p>
         </w:tc>
@@ -1690,18 +1957,7 @@
           <w:sz w:val="18"/>
           <w:szCs w:val="18"/>
         </w:rPr>
-        <w:t xml:space="preserve">Mark each row at the level the writing shows. The grade is the average across the rows, which is where the half levels come from. </w:t>
-      </w:r>
-      <w:r>
-        <w:rPr>
-          <w:rFonts w:ascii="Arial" w:cs="Arial" w:eastAsia="Arial" w:hAnsi="Arial"/>
-          <w:i/>
-          <w:iCs/>
-          <w:color w:val="595959"/>
-          <w:sz w:val="18"/>
-          <w:szCs w:val="18"/>
-        </w:rPr>
-        <w:t xml:space="preserve">Wording quoted from the Learning Continuum master sheet, English tab.</w:t>
+        <w:t xml:space="preserve">Mark each row at the level the writing shows. The grade is the average across the rows, which is where the half levels come from.</w:t>
       </w:r>
     </w:p>
     <w:p>
@@ -1811,10 +2067,10 @@
         </w:tblBorders>
       </w:tblPr>
       <w:tblGrid>
-        <w:gridCol w:w="3000"/>
-        <w:gridCol w:w="2488"/>
-        <w:gridCol w:w="2488"/>
-        <w:gridCol w:w="2488"/>
+        <w:gridCol w:w="2400"/>
+        <w:gridCol w:w="2688"/>
+        <w:gridCol w:w="2688"/>
+        <w:gridCol w:w="2688"/>
       </w:tblGrid>
       <w:tr>
         <w:trPr>
@@ -1822,7 +2078,7 @@
         </w:trPr>
         <w:tc>
           <w:tcPr>
-            <w:tcW w:type="dxa" w:w="3000"/>
+            <w:tcW w:type="dxa" w:w="2400"/>
             <w:shd w:fill="D9D9D9" w:color="auto" w:val="clear"/>
             <w:tcMar>
               <w:top w:type="dxa" w:w="70"/>
@@ -1849,7 +2105,7 @@
         </w:tc>
         <w:tc>
           <w:tcPr>
-            <w:tcW w:type="dxa" w:w="2488"/>
+            <w:tcW w:type="dxa" w:w="2688"/>
             <w:shd w:fill="D9D9D9" w:color="auto" w:val="clear"/>
             <w:tcMar>
               <w:top w:type="dxa" w:w="70"/>
@@ -1876,7 +2132,7 @@
         </w:tc>
         <w:tc>
           <w:tcPr>
-            <w:tcW w:type="dxa" w:w="2488"/>
+            <w:tcW w:type="dxa" w:w="2688"/>
             <w:shd w:fill="D9D9D9" w:color="auto" w:val="clear"/>
             <w:tcMar>
               <w:top w:type="dxa" w:w="70"/>
@@ -1903,7 +2159,7 @@
         </w:tc>
         <w:tc>
           <w:tcPr>
-            <w:tcW w:type="dxa" w:w="2488"/>
+            <w:tcW w:type="dxa" w:w="2688"/>
             <w:shd w:fill="D9D9D9" w:color="auto" w:val="clear"/>
             <w:tcMar>
               <w:top w:type="dxa" w:w="70"/>
@@ -1932,7 +2188,7 @@
       <w:tr>
         <w:tc>
           <w:tcPr>
-            <w:tcW w:type="dxa" w:w="3000"/>
+            <w:tcW w:type="dxa" w:w="2400"/>
             <w:shd w:fill="D6EAFC" w:color="auto" w:val="clear"/>
             <w:tcMar>
               <w:top w:type="dxa" w:w="70"/>
@@ -1959,7 +2215,7 @@
         </w:tc>
         <w:tc>
           <w:tcPr>
-            <w:tcW w:type="dxa" w:w="2488"/>
+            <w:tcW w:type="dxa" w:w="2688"/>
             <w:shd w:fill="EAF4FD" w:color="auto" w:val="clear"/>
             <w:tcMar>
               <w:top w:type="dxa" w:w="70"/>
@@ -1984,7 +2240,7 @@
         </w:tc>
         <w:tc>
           <w:tcPr>
-            <w:tcW w:type="dxa" w:w="2488"/>
+            <w:tcW w:type="dxa" w:w="2688"/>
             <w:shd w:fill="EAF4FD" w:color="auto" w:val="clear"/>
             <w:tcMar>
               <w:top w:type="dxa" w:w="70"/>
@@ -2009,7 +2265,7 @@
         </w:tc>
         <w:tc>
           <w:tcPr>
-            <w:tcW w:type="dxa" w:w="2488"/>
+            <w:tcW w:type="dxa" w:w="2688"/>
             <w:shd w:fill="EAF4FD" w:color="auto" w:val="clear"/>
             <w:tcMar>
               <w:top w:type="dxa" w:w="70"/>
@@ -2036,7 +2292,7 @@
       <w:tr>
         <w:tc>
           <w:tcPr>
-            <w:tcW w:type="dxa" w:w="3000"/>
+            <w:tcW w:type="dxa" w:w="2400"/>
             <w:shd w:fill="FFF3B0" w:color="auto" w:val="clear"/>
             <w:tcMar>
               <w:top w:type="dxa" w:w="70"/>
@@ -2063,7 +2319,7 @@
         </w:tc>
         <w:tc>
           <w:tcPr>
-            <w:tcW w:type="dxa" w:w="2488"/>
+            <w:tcW w:type="dxa" w:w="2688"/>
             <w:shd w:fill="FFF9DC" w:color="auto" w:val="clear"/>
             <w:tcMar>
               <w:top w:type="dxa" w:w="70"/>
@@ -2088,7 +2344,7 @@
         </w:tc>
         <w:tc>
           <w:tcPr>
-            <w:tcW w:type="dxa" w:w="2488"/>
+            <w:tcW w:type="dxa" w:w="2688"/>
             <w:shd w:fill="FFF9DC" w:color="auto" w:val="clear"/>
             <w:tcMar>
               <w:top w:type="dxa" w:w="70"/>
@@ -2113,7 +2369,7 @@
         </w:tc>
         <w:tc>
           <w:tcPr>
-            <w:tcW w:type="dxa" w:w="2488"/>
+            <w:tcW w:type="dxa" w:w="2688"/>
             <w:shd w:fill="FFF9DC" w:color="auto" w:val="clear"/>
             <w:tcMar>
               <w:top w:type="dxa" w:w="70"/>
@@ -2140,7 +2396,7 @@
       <w:tr>
         <w:tc>
           <w:tcPr>
-            <w:tcW w:type="dxa" w:w="3000"/>
+            <w:tcW w:type="dxa" w:w="2400"/>
             <w:shd w:fill="F1EDE3" w:color="auto" w:val="clear"/>
             <w:tcMar>
               <w:top w:type="dxa" w:w="70"/>
@@ -2167,7 +2423,7 @@
         </w:tc>
         <w:tc>
           <w:tcPr>
-            <w:tcW w:type="dxa" w:w="2488"/>
+            <w:tcW w:type="dxa" w:w="2688"/>
             <w:shd w:fill="FFFFFF" w:color="auto" w:val="clear"/>
             <w:tcMar>
               <w:top w:type="dxa" w:w="70"/>
@@ -2192,7 +2448,7 @@
         </w:tc>
         <w:tc>
           <w:tcPr>
-            <w:tcW w:type="dxa" w:w="2488"/>
+            <w:tcW w:type="dxa" w:w="2688"/>
             <w:shd w:fill="FFFFFF" w:color="auto" w:val="clear"/>
             <w:tcMar>
               <w:top w:type="dxa" w:w="70"/>
@@ -2217,7 +2473,7 @@
         </w:tc>
         <w:tc>
           <w:tcPr>
-            <w:tcW w:type="dxa" w:w="2488"/>
+            <w:tcW w:type="dxa" w:w="2688"/>
             <w:shd w:fill="FFFFFF" w:color="auto" w:val="clear"/>
             <w:tcMar>
               <w:top w:type="dxa" w:w="70"/>
@@ -2244,7 +2500,7 @@
       <w:tr>
         <w:tc>
           <w:tcPr>
-            <w:tcW w:type="dxa" w:w="3000"/>
+            <w:tcW w:type="dxa" w:w="2400"/>
             <w:shd w:fill="DFF0E2" w:color="auto" w:val="clear"/>
             <w:tcMar>
               <w:top w:type="dxa" w:w="70"/>
@@ -2271,7 +2527,7 @@
         </w:tc>
         <w:tc>
           <w:tcPr>
-            <w:tcW w:type="dxa" w:w="2488"/>
+            <w:tcW w:type="dxa" w:w="2688"/>
             <w:shd w:fill="EFF7F0" w:color="auto" w:val="clear"/>
             <w:tcMar>
               <w:top w:type="dxa" w:w="70"/>
@@ -2296,7 +2552,7 @@
         </w:tc>
         <w:tc>
           <w:tcPr>
-            <w:tcW w:type="dxa" w:w="2488"/>
+            <w:tcW w:type="dxa" w:w="2688"/>
             <w:shd w:fill="EFF7F0" w:color="auto" w:val="clear"/>
             <w:tcMar>
               <w:top w:type="dxa" w:w="70"/>
@@ -2321,7 +2577,7 @@
         </w:tc>
         <w:tc>
           <w:tcPr>
-            <w:tcW w:type="dxa" w:w="2488"/>
+            <w:tcW w:type="dxa" w:w="2688"/>
             <w:shd w:fill="EFF7F0" w:color="auto" w:val="clear"/>
             <w:tcMar>
               <w:top w:type="dxa" w:w="70"/>

</xml_diff>